<commit_message>
POV kit: fix catalog pictures, clip list per scene, clip-number swaps, download links
</commit_message>
<xml_diff>
--- a/pov-meme-kit/CLIP_CATALOG.docx
+++ b/pov-meme-kit/CLIP_CATALOG.docx
@@ -35,7 +35,7 @@
       <w:r>
         <w:drawing>
           <wp:inline xmlns:a="http://schemas.openxmlformats.org/drawingml/2006/main" xmlns:pic="http://schemas.openxmlformats.org/drawingml/2006/picture">
-            <wp:extent cx="2926080" cy="1645920"/>
+            <wp:extent cx="2926080" cy="4298197"/>
             <wp:docPr id="1" name="Picture 1"/>
             <wp:cNvGraphicFramePr>
               <a:graphicFrameLocks noChangeAspect="1"/>
@@ -44,7 +44,7 @@
               <a:graphicData uri="http://schemas.openxmlformats.org/drawingml/2006/picture">
                 <pic:pic>
                   <pic:nvPicPr>
-                    <pic:cNvPr id="0" name="C1.png"/>
+                    <pic:cNvPr id="0" name="C1.jpg"/>
                     <pic:cNvPicPr/>
                   </pic:nvPicPr>
                   <pic:blipFill>
@@ -56,7 +56,7 @@
                   <pic:spPr>
                     <a:xfrm>
                       <a:off x="0" y="0"/>
-                      <a:ext cx="2926080" cy="1645920"/>
+                      <a:ext cx="2926080" cy="4298197"/>
                     </a:xfrm>
                     <a:prstGeom prst="rect"/>
                   </pic:spPr>
@@ -88,7 +88,7 @@
       <w:r>
         <w:drawing>
           <wp:inline xmlns:a="http://schemas.openxmlformats.org/drawingml/2006/main" xmlns:pic="http://schemas.openxmlformats.org/drawingml/2006/picture">
-            <wp:extent cx="2926080" cy="1645920"/>
+            <wp:extent cx="2926080" cy="4830036"/>
             <wp:docPr id="2" name="Picture 2"/>
             <wp:cNvGraphicFramePr>
               <a:graphicFrameLocks noChangeAspect="1"/>
@@ -97,11 +97,11 @@
               <a:graphicData uri="http://schemas.openxmlformats.org/drawingml/2006/picture">
                 <pic:pic>
                   <pic:nvPicPr>
-                    <pic:cNvPr id="0" name="C1.png"/>
+                    <pic:cNvPr id="0" name="C2.jpg"/>
                     <pic:cNvPicPr/>
                   </pic:nvPicPr>
                   <pic:blipFill>
-                    <a:blip r:embed="rId9"/>
+                    <a:blip r:embed="rId10"/>
                     <a:stretch>
                       <a:fillRect/>
                     </a:stretch>
@@ -109,7 +109,7 @@
                   <pic:spPr>
                     <a:xfrm>
                       <a:off x="0" y="0"/>
-                      <a:ext cx="2926080" cy="1645920"/>
+                      <a:ext cx="2926080" cy="4830036"/>
                     </a:xfrm>
                     <a:prstGeom prst="rect"/>
                   </pic:spPr>
@@ -141,7 +141,7 @@
       <w:r>
         <w:drawing>
           <wp:inline xmlns:a="http://schemas.openxmlformats.org/drawingml/2006/main" xmlns:pic="http://schemas.openxmlformats.org/drawingml/2006/picture">
-            <wp:extent cx="2926080" cy="1645920"/>
+            <wp:extent cx="2926080" cy="4737463"/>
             <wp:docPr id="3" name="Picture 3"/>
             <wp:cNvGraphicFramePr>
               <a:graphicFrameLocks noChangeAspect="1"/>
@@ -150,11 +150,11 @@
               <a:graphicData uri="http://schemas.openxmlformats.org/drawingml/2006/picture">
                 <pic:pic>
                   <pic:nvPicPr>
-                    <pic:cNvPr id="0" name="C1.png"/>
+                    <pic:cNvPr id="0" name="C3.jpg"/>
                     <pic:cNvPicPr/>
                   </pic:nvPicPr>
                   <pic:blipFill>
-                    <a:blip r:embed="rId9"/>
+                    <a:blip r:embed="rId11"/>
                     <a:stretch>
                       <a:fillRect/>
                     </a:stretch>
@@ -162,7 +162,7 @@
                   <pic:spPr>
                     <a:xfrm>
                       <a:off x="0" y="0"/>
-                      <a:ext cx="2926080" cy="1645920"/>
+                      <a:ext cx="2926080" cy="4737463"/>
                     </a:xfrm>
                     <a:prstGeom prst="rect"/>
                   </pic:spPr>
@@ -194,7 +194,7 @@
       <w:r>
         <w:drawing>
           <wp:inline xmlns:a="http://schemas.openxmlformats.org/drawingml/2006/main" xmlns:pic="http://schemas.openxmlformats.org/drawingml/2006/picture">
-            <wp:extent cx="2926080" cy="1645920"/>
+            <wp:extent cx="2926080" cy="5741043"/>
             <wp:docPr id="4" name="Picture 4"/>
             <wp:cNvGraphicFramePr>
               <a:graphicFrameLocks noChangeAspect="1"/>
@@ -203,11 +203,11 @@
               <a:graphicData uri="http://schemas.openxmlformats.org/drawingml/2006/picture">
                 <pic:pic>
                   <pic:nvPicPr>
-                    <pic:cNvPr id="0" name="C1.png"/>
+                    <pic:cNvPr id="0" name="C4.jpg"/>
                     <pic:cNvPicPr/>
                   </pic:nvPicPr>
                   <pic:blipFill>
-                    <a:blip r:embed="rId9"/>
+                    <a:blip r:embed="rId12"/>
                     <a:stretch>
                       <a:fillRect/>
                     </a:stretch>
@@ -215,7 +215,7 @@
                   <pic:spPr>
                     <a:xfrm>
                       <a:off x="0" y="0"/>
-                      <a:ext cx="2926080" cy="1645920"/>
+                      <a:ext cx="2926080" cy="5741043"/>
                     </a:xfrm>
                     <a:prstGeom prst="rect"/>
                   </pic:spPr>
@@ -247,7 +247,7 @@
       <w:r>
         <w:drawing>
           <wp:inline xmlns:a="http://schemas.openxmlformats.org/drawingml/2006/main" xmlns:pic="http://schemas.openxmlformats.org/drawingml/2006/picture">
-            <wp:extent cx="2926080" cy="1645920"/>
+            <wp:extent cx="2926080" cy="4012496"/>
             <wp:docPr id="5" name="Picture 5"/>
             <wp:cNvGraphicFramePr>
               <a:graphicFrameLocks noChangeAspect="1"/>
@@ -256,11 +256,11 @@
               <a:graphicData uri="http://schemas.openxmlformats.org/drawingml/2006/picture">
                 <pic:pic>
                   <pic:nvPicPr>
-                    <pic:cNvPr id="0" name="C5.png"/>
+                    <pic:cNvPr id="0" name="C5.jpg"/>
                     <pic:cNvPicPr/>
                   </pic:nvPicPr>
                   <pic:blipFill>
-                    <a:blip r:embed="rId10"/>
+                    <a:blip r:embed="rId13"/>
                     <a:stretch>
                       <a:fillRect/>
                     </a:stretch>
@@ -268,7 +268,7 @@
                   <pic:spPr>
                     <a:xfrm>
                       <a:off x="0" y="0"/>
-                      <a:ext cx="2926080" cy="1645920"/>
+                      <a:ext cx="2926080" cy="4012496"/>
                     </a:xfrm>
                     <a:prstGeom prst="rect"/>
                   </pic:spPr>
@@ -300,7 +300,7 @@
       <w:r>
         <w:drawing>
           <wp:inline xmlns:a="http://schemas.openxmlformats.org/drawingml/2006/main" xmlns:pic="http://schemas.openxmlformats.org/drawingml/2006/picture">
-            <wp:extent cx="2926080" cy="1645920"/>
+            <wp:extent cx="2926080" cy="4990592"/>
             <wp:docPr id="6" name="Picture 6"/>
             <wp:cNvGraphicFramePr>
               <a:graphicFrameLocks noChangeAspect="1"/>
@@ -309,11 +309,11 @@
               <a:graphicData uri="http://schemas.openxmlformats.org/drawingml/2006/picture">
                 <pic:pic>
                   <pic:nvPicPr>
-                    <pic:cNvPr id="0" name="C1.png"/>
+                    <pic:cNvPr id="0" name="C6.jpg"/>
                     <pic:cNvPicPr/>
                   </pic:nvPicPr>
                   <pic:blipFill>
-                    <a:blip r:embed="rId9"/>
+                    <a:blip r:embed="rId14"/>
                     <a:stretch>
                       <a:fillRect/>
                     </a:stretch>
@@ -321,7 +321,7 @@
                   <pic:spPr>
                     <a:xfrm>
                       <a:off x="0" y="0"/>
-                      <a:ext cx="2926080" cy="1645920"/>
+                      <a:ext cx="2926080" cy="4990592"/>
                     </a:xfrm>
                     <a:prstGeom prst="rect"/>
                   </pic:spPr>
@@ -353,7 +353,7 @@
       <w:r>
         <w:drawing>
           <wp:inline xmlns:a="http://schemas.openxmlformats.org/drawingml/2006/main" xmlns:pic="http://schemas.openxmlformats.org/drawingml/2006/picture">
-            <wp:extent cx="2926080" cy="1645920"/>
+            <wp:extent cx="2926080" cy="4713439"/>
             <wp:docPr id="7" name="Picture 7"/>
             <wp:cNvGraphicFramePr>
               <a:graphicFrameLocks noChangeAspect="1"/>
@@ -362,11 +362,11 @@
               <a:graphicData uri="http://schemas.openxmlformats.org/drawingml/2006/picture">
                 <pic:pic>
                   <pic:nvPicPr>
-                    <pic:cNvPr id="0" name="C1.png"/>
+                    <pic:cNvPr id="0" name="C7.jpg"/>
                     <pic:cNvPicPr/>
                   </pic:nvPicPr>
                   <pic:blipFill>
-                    <a:blip r:embed="rId9"/>
+                    <a:blip r:embed="rId15"/>
                     <a:stretch>
                       <a:fillRect/>
                     </a:stretch>
@@ -374,7 +374,7 @@
                   <pic:spPr>
                     <a:xfrm>
                       <a:off x="0" y="0"/>
-                      <a:ext cx="2926080" cy="1645920"/>
+                      <a:ext cx="2926080" cy="4713439"/>
                     </a:xfrm>
                     <a:prstGeom prst="rect"/>
                   </pic:spPr>
@@ -406,7 +406,7 @@
       <w:r>
         <w:drawing>
           <wp:inline xmlns:a="http://schemas.openxmlformats.org/drawingml/2006/main" xmlns:pic="http://schemas.openxmlformats.org/drawingml/2006/picture">
-            <wp:extent cx="2926080" cy="1645920"/>
+            <wp:extent cx="2926080" cy="6040939"/>
             <wp:docPr id="8" name="Picture 8"/>
             <wp:cNvGraphicFramePr>
               <a:graphicFrameLocks noChangeAspect="1"/>
@@ -415,11 +415,11 @@
               <a:graphicData uri="http://schemas.openxmlformats.org/drawingml/2006/picture">
                 <pic:pic>
                   <pic:nvPicPr>
-                    <pic:cNvPr id="0" name="C1.png"/>
+                    <pic:cNvPr id="0" name="C8.jpg"/>
                     <pic:cNvPicPr/>
                   </pic:nvPicPr>
                   <pic:blipFill>
-                    <a:blip r:embed="rId9"/>
+                    <a:blip r:embed="rId16"/>
                     <a:stretch>
                       <a:fillRect/>
                     </a:stretch>
@@ -427,7 +427,7 @@
                   <pic:spPr>
                     <a:xfrm>
                       <a:off x="0" y="0"/>
-                      <a:ext cx="2926080" cy="1645920"/>
+                      <a:ext cx="2926080" cy="6040939"/>
                     </a:xfrm>
                     <a:prstGeom prst="rect"/>
                   </pic:spPr>
@@ -459,7 +459,7 @@
       <w:r>
         <w:drawing>
           <wp:inline xmlns:a="http://schemas.openxmlformats.org/drawingml/2006/main" xmlns:pic="http://schemas.openxmlformats.org/drawingml/2006/picture">
-            <wp:extent cx="2926080" cy="1645920"/>
+            <wp:extent cx="2926080" cy="4476033"/>
             <wp:docPr id="9" name="Picture 9"/>
             <wp:cNvGraphicFramePr>
               <a:graphicFrameLocks noChangeAspect="1"/>
@@ -468,11 +468,11 @@
               <a:graphicData uri="http://schemas.openxmlformats.org/drawingml/2006/picture">
                 <pic:pic>
                   <pic:nvPicPr>
-                    <pic:cNvPr id="0" name="C1.png"/>
+                    <pic:cNvPr id="0" name="C9.jpg"/>
                     <pic:cNvPicPr/>
                   </pic:nvPicPr>
                   <pic:blipFill>
-                    <a:blip r:embed="rId9"/>
+                    <a:blip r:embed="rId17"/>
                     <a:stretch>
                       <a:fillRect/>
                     </a:stretch>
@@ -480,7 +480,7 @@
                   <pic:spPr>
                     <a:xfrm>
                       <a:off x="0" y="0"/>
-                      <a:ext cx="2926080" cy="1645920"/>
+                      <a:ext cx="2926080" cy="4476033"/>
                     </a:xfrm>
                     <a:prstGeom prst="rect"/>
                   </pic:spPr>
@@ -512,7 +512,7 @@
       <w:r>
         <w:drawing>
           <wp:inline xmlns:a="http://schemas.openxmlformats.org/drawingml/2006/main" xmlns:pic="http://schemas.openxmlformats.org/drawingml/2006/picture">
-            <wp:extent cx="2926080" cy="1645920"/>
+            <wp:extent cx="2926080" cy="2319454"/>
             <wp:docPr id="10" name="Picture 10"/>
             <wp:cNvGraphicFramePr>
               <a:graphicFrameLocks noChangeAspect="1"/>
@@ -521,11 +521,11 @@
               <a:graphicData uri="http://schemas.openxmlformats.org/drawingml/2006/picture">
                 <pic:pic>
                   <pic:nvPicPr>
-                    <pic:cNvPr id="0" name="C10.png"/>
+                    <pic:cNvPr id="0" name="C10.jpg"/>
                     <pic:cNvPicPr/>
                   </pic:nvPicPr>
                   <pic:blipFill>
-                    <a:blip r:embed="rId11"/>
+                    <a:blip r:embed="rId18"/>
                     <a:stretch>
                       <a:fillRect/>
                     </a:stretch>
@@ -533,7 +533,7 @@
                   <pic:spPr>
                     <a:xfrm>
                       <a:off x="0" y="0"/>
-                      <a:ext cx="2926080" cy="1645920"/>
+                      <a:ext cx="2926080" cy="2319454"/>
                     </a:xfrm>
                     <a:prstGeom prst="rect"/>
                   </pic:spPr>
@@ -565,7 +565,7 @@
       <w:r>
         <w:drawing>
           <wp:inline xmlns:a="http://schemas.openxmlformats.org/drawingml/2006/main" xmlns:pic="http://schemas.openxmlformats.org/drawingml/2006/picture">
-            <wp:extent cx="2926080" cy="1645920"/>
+            <wp:extent cx="2926080" cy="3121152"/>
             <wp:docPr id="11" name="Picture 11"/>
             <wp:cNvGraphicFramePr>
               <a:graphicFrameLocks noChangeAspect="1"/>
@@ -574,11 +574,11 @@
               <a:graphicData uri="http://schemas.openxmlformats.org/drawingml/2006/picture">
                 <pic:pic>
                   <pic:nvPicPr>
-                    <pic:cNvPr id="0" name="C1.png"/>
+                    <pic:cNvPr id="0" name="C11.jpg"/>
                     <pic:cNvPicPr/>
                   </pic:nvPicPr>
                   <pic:blipFill>
-                    <a:blip r:embed="rId9"/>
+                    <a:blip r:embed="rId19"/>
                     <a:stretch>
                       <a:fillRect/>
                     </a:stretch>
@@ -586,7 +586,7 @@
                   <pic:spPr>
                     <a:xfrm>
                       <a:off x="0" y="0"/>
-                      <a:ext cx="2926080" cy="1645920"/>
+                      <a:ext cx="2926080" cy="3121152"/>
                     </a:xfrm>
                     <a:prstGeom prst="rect"/>
                   </pic:spPr>
@@ -618,7 +618,7 @@
       <w:r>
         <w:drawing>
           <wp:inline xmlns:a="http://schemas.openxmlformats.org/drawingml/2006/main" xmlns:pic="http://schemas.openxmlformats.org/drawingml/2006/picture">
-            <wp:extent cx="2926080" cy="1645920"/>
+            <wp:extent cx="2926080" cy="3086413"/>
             <wp:docPr id="12" name="Picture 12"/>
             <wp:cNvGraphicFramePr>
               <a:graphicFrameLocks noChangeAspect="1"/>
@@ -627,11 +627,11 @@
               <a:graphicData uri="http://schemas.openxmlformats.org/drawingml/2006/picture">
                 <pic:pic>
                   <pic:nvPicPr>
-                    <pic:cNvPr id="0" name="C1.png"/>
+                    <pic:cNvPr id="0" name="C12.jpg"/>
                     <pic:cNvPicPr/>
                   </pic:nvPicPr>
                   <pic:blipFill>
-                    <a:blip r:embed="rId9"/>
+                    <a:blip r:embed="rId20"/>
                     <a:stretch>
                       <a:fillRect/>
                     </a:stretch>
@@ -639,7 +639,7 @@
                   <pic:spPr>
                     <a:xfrm>
                       <a:off x="0" y="0"/>
-                      <a:ext cx="2926080" cy="1645920"/>
+                      <a:ext cx="2926080" cy="3086413"/>
                     </a:xfrm>
                     <a:prstGeom prst="rect"/>
                   </pic:spPr>
@@ -671,7 +671,7 @@
       <w:r>
         <w:drawing>
           <wp:inline xmlns:a="http://schemas.openxmlformats.org/drawingml/2006/main" xmlns:pic="http://schemas.openxmlformats.org/drawingml/2006/picture">
-            <wp:extent cx="2926080" cy="1645920"/>
+            <wp:extent cx="2926080" cy="6930189"/>
             <wp:docPr id="13" name="Picture 13"/>
             <wp:cNvGraphicFramePr>
               <a:graphicFrameLocks noChangeAspect="1"/>
@@ -680,11 +680,11 @@
               <a:graphicData uri="http://schemas.openxmlformats.org/drawingml/2006/picture">
                 <pic:pic>
                   <pic:nvPicPr>
-                    <pic:cNvPr id="0" name="C13.png"/>
+                    <pic:cNvPr id="0" name="C13.jpg"/>
                     <pic:cNvPicPr/>
                   </pic:nvPicPr>
                   <pic:blipFill>
-                    <a:blip r:embed="rId12"/>
+                    <a:blip r:embed="rId21"/>
                     <a:stretch>
                       <a:fillRect/>
                     </a:stretch>
@@ -692,7 +692,7 @@
                   <pic:spPr>
                     <a:xfrm>
                       <a:off x="0" y="0"/>
-                      <a:ext cx="2926080" cy="1645920"/>
+                      <a:ext cx="2926080" cy="6930189"/>
                     </a:xfrm>
                     <a:prstGeom prst="rect"/>
                   </pic:spPr>
@@ -724,7 +724,7 @@
       <w:r>
         <w:drawing>
           <wp:inline xmlns:a="http://schemas.openxmlformats.org/drawingml/2006/main" xmlns:pic="http://schemas.openxmlformats.org/drawingml/2006/picture">
-            <wp:extent cx="2926080" cy="1645920"/>
+            <wp:extent cx="2926080" cy="5013477"/>
             <wp:docPr id="14" name="Picture 14"/>
             <wp:cNvGraphicFramePr>
               <a:graphicFrameLocks noChangeAspect="1"/>
@@ -733,11 +733,11 @@
               <a:graphicData uri="http://schemas.openxmlformats.org/drawingml/2006/picture">
                 <pic:pic>
                   <pic:nvPicPr>
-                    <pic:cNvPr id="0" name="C1.png"/>
+                    <pic:cNvPr id="0" name="C14.jpg"/>
                     <pic:cNvPicPr/>
                   </pic:nvPicPr>
                   <pic:blipFill>
-                    <a:blip r:embed="rId9"/>
+                    <a:blip r:embed="rId22"/>
                     <a:stretch>
                       <a:fillRect/>
                     </a:stretch>
@@ -745,7 +745,7 @@
                   <pic:spPr>
                     <a:xfrm>
                       <a:off x="0" y="0"/>
-                      <a:ext cx="2926080" cy="1645920"/>
+                      <a:ext cx="2926080" cy="5013477"/>
                     </a:xfrm>
                     <a:prstGeom prst="rect"/>
                   </pic:spPr>
@@ -777,7 +777,7 @@
       <w:r>
         <w:drawing>
           <wp:inline xmlns:a="http://schemas.openxmlformats.org/drawingml/2006/main" xmlns:pic="http://schemas.openxmlformats.org/drawingml/2006/picture">
-            <wp:extent cx="2926080" cy="1645920"/>
+            <wp:extent cx="2926080" cy="4226560"/>
             <wp:docPr id="15" name="Picture 15"/>
             <wp:cNvGraphicFramePr>
               <a:graphicFrameLocks noChangeAspect="1"/>
@@ -786,11 +786,11 @@
               <a:graphicData uri="http://schemas.openxmlformats.org/drawingml/2006/picture">
                 <pic:pic>
                   <pic:nvPicPr>
-                    <pic:cNvPr id="0" name="C15.png"/>
+                    <pic:cNvPr id="0" name="C15.jpg"/>
                     <pic:cNvPicPr/>
                   </pic:nvPicPr>
                   <pic:blipFill>
-                    <a:blip r:embed="rId13"/>
+                    <a:blip r:embed="rId23"/>
                     <a:stretch>
                       <a:fillRect/>
                     </a:stretch>
@@ -798,7 +798,7 @@
                   <pic:spPr>
                     <a:xfrm>
                       <a:off x="0" y="0"/>
-                      <a:ext cx="2926080" cy="1645920"/>
+                      <a:ext cx="2926080" cy="4226560"/>
                     </a:xfrm>
                     <a:prstGeom prst="rect"/>
                   </pic:spPr>
@@ -830,7 +830,7 @@
       <w:r>
         <w:drawing>
           <wp:inline xmlns:a="http://schemas.openxmlformats.org/drawingml/2006/main" xmlns:pic="http://schemas.openxmlformats.org/drawingml/2006/picture">
-            <wp:extent cx="2926080" cy="1645920"/>
+            <wp:extent cx="2926080" cy="5575372"/>
             <wp:docPr id="16" name="Picture 16"/>
             <wp:cNvGraphicFramePr>
               <a:graphicFrameLocks noChangeAspect="1"/>
@@ -839,11 +839,11 @@
               <a:graphicData uri="http://schemas.openxmlformats.org/drawingml/2006/picture">
                 <pic:pic>
                   <pic:nvPicPr>
-                    <pic:cNvPr id="0" name="C16.png"/>
+                    <pic:cNvPr id="0" name="C16.jpg"/>
                     <pic:cNvPicPr/>
                   </pic:nvPicPr>
                   <pic:blipFill>
-                    <a:blip r:embed="rId14"/>
+                    <a:blip r:embed="rId24"/>
                     <a:stretch>
                       <a:fillRect/>
                     </a:stretch>
@@ -851,7 +851,7 @@
                   <pic:spPr>
                     <a:xfrm>
                       <a:off x="0" y="0"/>
-                      <a:ext cx="2926080" cy="1645920"/>
+                      <a:ext cx="2926080" cy="5575372"/>
                     </a:xfrm>
                     <a:prstGeom prst="rect"/>
                   </pic:spPr>
@@ -883,7 +883,7 @@
       <w:r>
         <w:drawing>
           <wp:inline xmlns:a="http://schemas.openxmlformats.org/drawingml/2006/main" xmlns:pic="http://schemas.openxmlformats.org/drawingml/2006/picture">
-            <wp:extent cx="2926080" cy="1645920"/>
+            <wp:extent cx="2926080" cy="4019941"/>
             <wp:docPr id="17" name="Picture 17"/>
             <wp:cNvGraphicFramePr>
               <a:graphicFrameLocks noChangeAspect="1"/>
@@ -892,11 +892,11 @@
               <a:graphicData uri="http://schemas.openxmlformats.org/drawingml/2006/picture">
                 <pic:pic>
                   <pic:nvPicPr>
-                    <pic:cNvPr id="0" name="C1.png"/>
+                    <pic:cNvPr id="0" name="C17.jpg"/>
                     <pic:cNvPicPr/>
                   </pic:nvPicPr>
                   <pic:blipFill>
-                    <a:blip r:embed="rId9"/>
+                    <a:blip r:embed="rId25"/>
                     <a:stretch>
                       <a:fillRect/>
                     </a:stretch>
@@ -904,7 +904,7 @@
                   <pic:spPr>
                     <a:xfrm>
                       <a:off x="0" y="0"/>
-                      <a:ext cx="2926080" cy="1645920"/>
+                      <a:ext cx="2926080" cy="4019941"/>
                     </a:xfrm>
                     <a:prstGeom prst="rect"/>
                   </pic:spPr>
@@ -936,7 +936,7 @@
       <w:r>
         <w:drawing>
           <wp:inline xmlns:a="http://schemas.openxmlformats.org/drawingml/2006/main" xmlns:pic="http://schemas.openxmlformats.org/drawingml/2006/picture">
-            <wp:extent cx="2926080" cy="1645920"/>
+            <wp:extent cx="2926080" cy="3485852"/>
             <wp:docPr id="18" name="Picture 18"/>
             <wp:cNvGraphicFramePr>
               <a:graphicFrameLocks noChangeAspect="1"/>
@@ -945,11 +945,11 @@
               <a:graphicData uri="http://schemas.openxmlformats.org/drawingml/2006/picture">
                 <pic:pic>
                   <pic:nvPicPr>
-                    <pic:cNvPr id="0" name="C1.png"/>
+                    <pic:cNvPr id="0" name="C18.jpg"/>
                     <pic:cNvPicPr/>
                   </pic:nvPicPr>
                   <pic:blipFill>
-                    <a:blip r:embed="rId9"/>
+                    <a:blip r:embed="rId26"/>
                     <a:stretch>
                       <a:fillRect/>
                     </a:stretch>
@@ -957,7 +957,7 @@
                   <pic:spPr>
                     <a:xfrm>
                       <a:off x="0" y="0"/>
-                      <a:ext cx="2926080" cy="1645920"/>
+                      <a:ext cx="2926080" cy="3485852"/>
                     </a:xfrm>
                     <a:prstGeom prst="rect"/>
                   </pic:spPr>
@@ -989,7 +989,7 @@
       <w:r>
         <w:drawing>
           <wp:inline xmlns:a="http://schemas.openxmlformats.org/drawingml/2006/main" xmlns:pic="http://schemas.openxmlformats.org/drawingml/2006/picture">
-            <wp:extent cx="2926080" cy="1645920"/>
+            <wp:extent cx="2926080" cy="5255394"/>
             <wp:docPr id="19" name="Picture 19"/>
             <wp:cNvGraphicFramePr>
               <a:graphicFrameLocks noChangeAspect="1"/>
@@ -998,11 +998,11 @@
               <a:graphicData uri="http://schemas.openxmlformats.org/drawingml/2006/picture">
                 <pic:pic>
                   <pic:nvPicPr>
-                    <pic:cNvPr id="0" name="C1.png"/>
+                    <pic:cNvPr id="0" name="C19.jpg"/>
                     <pic:cNvPicPr/>
                   </pic:nvPicPr>
                   <pic:blipFill>
-                    <a:blip r:embed="rId9"/>
+                    <a:blip r:embed="rId27"/>
                     <a:stretch>
                       <a:fillRect/>
                     </a:stretch>
@@ -1010,7 +1010,7 @@
                   <pic:spPr>
                     <a:xfrm>
                       <a:off x="0" y="0"/>
-                      <a:ext cx="2926080" cy="1645920"/>
+                      <a:ext cx="2926080" cy="5255394"/>
                     </a:xfrm>
                     <a:prstGeom prst="rect"/>
                   </pic:spPr>
@@ -1042,7 +1042,7 @@
       <w:r>
         <w:drawing>
           <wp:inline xmlns:a="http://schemas.openxmlformats.org/drawingml/2006/main" xmlns:pic="http://schemas.openxmlformats.org/drawingml/2006/picture">
-            <wp:extent cx="2926080" cy="1645920"/>
+            <wp:extent cx="2926080" cy="4116350"/>
             <wp:docPr id="20" name="Picture 20"/>
             <wp:cNvGraphicFramePr>
               <a:graphicFrameLocks noChangeAspect="1"/>
@@ -1051,11 +1051,11 @@
               <a:graphicData uri="http://schemas.openxmlformats.org/drawingml/2006/picture">
                 <pic:pic>
                   <pic:nvPicPr>
-                    <pic:cNvPr id="0" name="C1.png"/>
+                    <pic:cNvPr id="0" name="C20.jpg"/>
                     <pic:cNvPicPr/>
                   </pic:nvPicPr>
                   <pic:blipFill>
-                    <a:blip r:embed="rId9"/>
+                    <a:blip r:embed="rId28"/>
                     <a:stretch>
                       <a:fillRect/>
                     </a:stretch>
@@ -1063,7 +1063,7 @@
                   <pic:spPr>
                     <a:xfrm>
                       <a:off x="0" y="0"/>
-                      <a:ext cx="2926080" cy="1645920"/>
+                      <a:ext cx="2926080" cy="4116350"/>
                     </a:xfrm>
                     <a:prstGeom prst="rect"/>
                   </pic:spPr>
@@ -1095,7 +1095,7 @@
       <w:r>
         <w:drawing>
           <wp:inline xmlns:a="http://schemas.openxmlformats.org/drawingml/2006/main" xmlns:pic="http://schemas.openxmlformats.org/drawingml/2006/picture">
-            <wp:extent cx="2926080" cy="1645920"/>
+            <wp:extent cx="2926080" cy="3117605"/>
             <wp:docPr id="21" name="Picture 21"/>
             <wp:cNvGraphicFramePr>
               <a:graphicFrameLocks noChangeAspect="1"/>
@@ -1104,11 +1104,11 @@
               <a:graphicData uri="http://schemas.openxmlformats.org/drawingml/2006/picture">
                 <pic:pic>
                   <pic:nvPicPr>
-                    <pic:cNvPr id="0" name="C21.png"/>
+                    <pic:cNvPr id="0" name="C21.jpg"/>
                     <pic:cNvPicPr/>
                   </pic:nvPicPr>
                   <pic:blipFill>
-                    <a:blip r:embed="rId15"/>
+                    <a:blip r:embed="rId29"/>
                     <a:stretch>
                       <a:fillRect/>
                     </a:stretch>
@@ -1116,7 +1116,7 @@
                   <pic:spPr>
                     <a:xfrm>
                       <a:off x="0" y="0"/>
-                      <a:ext cx="2926080" cy="1645920"/>
+                      <a:ext cx="2926080" cy="3117605"/>
                     </a:xfrm>
                     <a:prstGeom prst="rect"/>
                   </pic:spPr>
@@ -1148,7 +1148,7 @@
       <w:r>
         <w:drawing>
           <wp:inline xmlns:a="http://schemas.openxmlformats.org/drawingml/2006/main" xmlns:pic="http://schemas.openxmlformats.org/drawingml/2006/picture">
-            <wp:extent cx="2926080" cy="1645920"/>
+            <wp:extent cx="2926080" cy="2937926"/>
             <wp:docPr id="22" name="Picture 22"/>
             <wp:cNvGraphicFramePr>
               <a:graphicFrameLocks noChangeAspect="1"/>
@@ -1157,11 +1157,11 @@
               <a:graphicData uri="http://schemas.openxmlformats.org/drawingml/2006/picture">
                 <pic:pic>
                   <pic:nvPicPr>
-                    <pic:cNvPr id="0" name="C1.png"/>
+                    <pic:cNvPr id="0" name="C22.jpg"/>
                     <pic:cNvPicPr/>
                   </pic:nvPicPr>
                   <pic:blipFill>
-                    <a:blip r:embed="rId9"/>
+                    <a:blip r:embed="rId30"/>
                     <a:stretch>
                       <a:fillRect/>
                     </a:stretch>
@@ -1169,7 +1169,7 @@
                   <pic:spPr>
                     <a:xfrm>
                       <a:off x="0" y="0"/>
-                      <a:ext cx="2926080" cy="1645920"/>
+                      <a:ext cx="2926080" cy="2937926"/>
                     </a:xfrm>
                     <a:prstGeom prst="rect"/>
                   </pic:spPr>
@@ -1201,7 +1201,7 @@
       <w:r>
         <w:drawing>
           <wp:inline xmlns:a="http://schemas.openxmlformats.org/drawingml/2006/main" xmlns:pic="http://schemas.openxmlformats.org/drawingml/2006/picture">
-            <wp:extent cx="2926080" cy="1645920"/>
+            <wp:extent cx="2926080" cy="3082660"/>
             <wp:docPr id="23" name="Picture 23"/>
             <wp:cNvGraphicFramePr>
               <a:graphicFrameLocks noChangeAspect="1"/>
@@ -1210,11 +1210,11 @@
               <a:graphicData uri="http://schemas.openxmlformats.org/drawingml/2006/picture">
                 <pic:pic>
                   <pic:nvPicPr>
-                    <pic:cNvPr id="0" name="C1.png"/>
+                    <pic:cNvPr id="0" name="C23.jpg"/>
                     <pic:cNvPicPr/>
                   </pic:nvPicPr>
                   <pic:blipFill>
-                    <a:blip r:embed="rId9"/>
+                    <a:blip r:embed="rId31"/>
                     <a:stretch>
                       <a:fillRect/>
                     </a:stretch>
@@ -1222,7 +1222,7 @@
                   <pic:spPr>
                     <a:xfrm>
                       <a:off x="0" y="0"/>
-                      <a:ext cx="2926080" cy="1645920"/>
+                      <a:ext cx="2926080" cy="3082660"/>
                     </a:xfrm>
                     <a:prstGeom prst="rect"/>
                   </pic:spPr>
@@ -1254,7 +1254,7 @@
       <w:r>
         <w:drawing>
           <wp:inline xmlns:a="http://schemas.openxmlformats.org/drawingml/2006/main" xmlns:pic="http://schemas.openxmlformats.org/drawingml/2006/picture">
-            <wp:extent cx="2926080" cy="1645920"/>
+            <wp:extent cx="2926080" cy="6182934"/>
             <wp:docPr id="24" name="Picture 24"/>
             <wp:cNvGraphicFramePr>
               <a:graphicFrameLocks noChangeAspect="1"/>
@@ -1263,11 +1263,11 @@
               <a:graphicData uri="http://schemas.openxmlformats.org/drawingml/2006/picture">
                 <pic:pic>
                   <pic:nvPicPr>
-                    <pic:cNvPr id="0" name="C24.png"/>
+                    <pic:cNvPr id="0" name="C24.jpg"/>
                     <pic:cNvPicPr/>
                   </pic:nvPicPr>
                   <pic:blipFill>
-                    <a:blip r:embed="rId16"/>
+                    <a:blip r:embed="rId32"/>
                     <a:stretch>
                       <a:fillRect/>
                     </a:stretch>
@@ -1275,7 +1275,7 @@
                   <pic:spPr>
                     <a:xfrm>
                       <a:off x="0" y="0"/>
-                      <a:ext cx="2926080" cy="1645920"/>
+                      <a:ext cx="2926080" cy="6182934"/>
                     </a:xfrm>
                     <a:prstGeom prst="rect"/>
                   </pic:spPr>
@@ -1307,7 +1307,7 @@
       <w:r>
         <w:drawing>
           <wp:inline xmlns:a="http://schemas.openxmlformats.org/drawingml/2006/main" xmlns:pic="http://schemas.openxmlformats.org/drawingml/2006/picture">
-            <wp:extent cx="2926080" cy="1645920"/>
+            <wp:extent cx="2926080" cy="4610277"/>
             <wp:docPr id="25" name="Picture 25"/>
             <wp:cNvGraphicFramePr>
               <a:graphicFrameLocks noChangeAspect="1"/>
@@ -1316,11 +1316,11 @@
               <a:graphicData uri="http://schemas.openxmlformats.org/drawingml/2006/picture">
                 <pic:pic>
                   <pic:nvPicPr>
-                    <pic:cNvPr id="0" name="C1.png"/>
+                    <pic:cNvPr id="0" name="C25.jpg"/>
                     <pic:cNvPicPr/>
                   </pic:nvPicPr>
                   <pic:blipFill>
-                    <a:blip r:embed="rId9"/>
+                    <a:blip r:embed="rId33"/>
                     <a:stretch>
                       <a:fillRect/>
                     </a:stretch>
@@ -1328,7 +1328,7 @@
                   <pic:spPr>
                     <a:xfrm>
                       <a:off x="0" y="0"/>
-                      <a:ext cx="2926080" cy="1645920"/>
+                      <a:ext cx="2926080" cy="4610277"/>
                     </a:xfrm>
                     <a:prstGeom prst="rect"/>
                   </pic:spPr>
@@ -1360,7 +1360,7 @@
       <w:r>
         <w:drawing>
           <wp:inline xmlns:a="http://schemas.openxmlformats.org/drawingml/2006/main" xmlns:pic="http://schemas.openxmlformats.org/drawingml/2006/picture">
-            <wp:extent cx="2926080" cy="1645920"/>
+            <wp:extent cx="2926080" cy="4649859"/>
             <wp:docPr id="26" name="Picture 26"/>
             <wp:cNvGraphicFramePr>
               <a:graphicFrameLocks noChangeAspect="1"/>
@@ -1369,11 +1369,11 @@
               <a:graphicData uri="http://schemas.openxmlformats.org/drawingml/2006/picture">
                 <pic:pic>
                   <pic:nvPicPr>
-                    <pic:cNvPr id="0" name="C1.png"/>
+                    <pic:cNvPr id="0" name="C26.jpg"/>
                     <pic:cNvPicPr/>
                   </pic:nvPicPr>
                   <pic:blipFill>
-                    <a:blip r:embed="rId9"/>
+                    <a:blip r:embed="rId34"/>
                     <a:stretch>
                       <a:fillRect/>
                     </a:stretch>
@@ -1381,7 +1381,7 @@
                   <pic:spPr>
                     <a:xfrm>
                       <a:off x="0" y="0"/>
-                      <a:ext cx="2926080" cy="1645920"/>
+                      <a:ext cx="2926080" cy="4649859"/>
                     </a:xfrm>
                     <a:prstGeom prst="rect"/>
                   </pic:spPr>
@@ -1413,7 +1413,7 @@
       <w:r>
         <w:drawing>
           <wp:inline xmlns:a="http://schemas.openxmlformats.org/drawingml/2006/main" xmlns:pic="http://schemas.openxmlformats.org/drawingml/2006/picture">
-            <wp:extent cx="2926080" cy="1645920"/>
+            <wp:extent cx="2926080" cy="4684611"/>
             <wp:docPr id="27" name="Picture 27"/>
             <wp:cNvGraphicFramePr>
               <a:graphicFrameLocks noChangeAspect="1"/>
@@ -1422,11 +1422,11 @@
               <a:graphicData uri="http://schemas.openxmlformats.org/drawingml/2006/picture">
                 <pic:pic>
                   <pic:nvPicPr>
-                    <pic:cNvPr id="0" name="C1.png"/>
+                    <pic:cNvPr id="0" name="C27.jpg"/>
                     <pic:cNvPicPr/>
                   </pic:nvPicPr>
                   <pic:blipFill>
-                    <a:blip r:embed="rId9"/>
+                    <a:blip r:embed="rId35"/>
                     <a:stretch>
                       <a:fillRect/>
                     </a:stretch>
@@ -1434,7 +1434,7 @@
                   <pic:spPr>
                     <a:xfrm>
                       <a:off x="0" y="0"/>
-                      <a:ext cx="2926080" cy="1645920"/>
+                      <a:ext cx="2926080" cy="4684611"/>
                     </a:xfrm>
                     <a:prstGeom prst="rect"/>
                   </pic:spPr>
@@ -1466,7 +1466,7 @@
       <w:r>
         <w:drawing>
           <wp:inline xmlns:a="http://schemas.openxmlformats.org/drawingml/2006/main" xmlns:pic="http://schemas.openxmlformats.org/drawingml/2006/picture">
-            <wp:extent cx="2926080" cy="1645920"/>
+            <wp:extent cx="2926080" cy="3493008"/>
             <wp:docPr id="28" name="Picture 28"/>
             <wp:cNvGraphicFramePr>
               <a:graphicFrameLocks noChangeAspect="1"/>
@@ -1475,11 +1475,11 @@
               <a:graphicData uri="http://schemas.openxmlformats.org/drawingml/2006/picture">
                 <pic:pic>
                   <pic:nvPicPr>
-                    <pic:cNvPr id="0" name="C1.png"/>
+                    <pic:cNvPr id="0" name="C28.jpg"/>
                     <pic:cNvPicPr/>
                   </pic:nvPicPr>
                   <pic:blipFill>
-                    <a:blip r:embed="rId9"/>
+                    <a:blip r:embed="rId36"/>
                     <a:stretch>
                       <a:fillRect/>
                     </a:stretch>
@@ -1487,7 +1487,7 @@
                   <pic:spPr>
                     <a:xfrm>
                       <a:off x="0" y="0"/>
-                      <a:ext cx="2926080" cy="1645920"/>
+                      <a:ext cx="2926080" cy="3493008"/>
                     </a:xfrm>
                     <a:prstGeom prst="rect"/>
                   </pic:spPr>
@@ -1519,7 +1519,7 @@
       <w:r>
         <w:drawing>
           <wp:inline xmlns:a="http://schemas.openxmlformats.org/drawingml/2006/main" xmlns:pic="http://schemas.openxmlformats.org/drawingml/2006/picture">
-            <wp:extent cx="2926080" cy="1645920"/>
+            <wp:extent cx="2926080" cy="5806080"/>
             <wp:docPr id="29" name="Picture 29"/>
             <wp:cNvGraphicFramePr>
               <a:graphicFrameLocks noChangeAspect="1"/>
@@ -1528,11 +1528,11 @@
               <a:graphicData uri="http://schemas.openxmlformats.org/drawingml/2006/picture">
                 <pic:pic>
                   <pic:nvPicPr>
-                    <pic:cNvPr id="0" name="C1.png"/>
+                    <pic:cNvPr id="0" name="C29.jpg"/>
                     <pic:cNvPicPr/>
                   </pic:nvPicPr>
                   <pic:blipFill>
-                    <a:blip r:embed="rId9"/>
+                    <a:blip r:embed="rId37"/>
                     <a:stretch>
                       <a:fillRect/>
                     </a:stretch>
@@ -1540,7 +1540,7 @@
                   <pic:spPr>
                     <a:xfrm>
                       <a:off x="0" y="0"/>
-                      <a:ext cx="2926080" cy="1645920"/>
+                      <a:ext cx="2926080" cy="5806080"/>
                     </a:xfrm>
                     <a:prstGeom prst="rect"/>
                   </pic:spPr>
@@ -1580,7 +1580,7 @@
       <w:r>
         <w:drawing>
           <wp:inline xmlns:a="http://schemas.openxmlformats.org/drawingml/2006/main" xmlns:pic="http://schemas.openxmlformats.org/drawingml/2006/picture">
-            <wp:extent cx="2926080" cy="1645920"/>
+            <wp:extent cx="2926080" cy="5762402"/>
             <wp:docPr id="30" name="Picture 30"/>
             <wp:cNvGraphicFramePr>
               <a:graphicFrameLocks noChangeAspect="1"/>
@@ -1589,11 +1589,11 @@
               <a:graphicData uri="http://schemas.openxmlformats.org/drawingml/2006/picture">
                 <pic:pic>
                   <pic:nvPicPr>
-                    <pic:cNvPr id="0" name="C1.png"/>
+                    <pic:cNvPr id="0" name="D1.jpg"/>
                     <pic:cNvPicPr/>
                   </pic:nvPicPr>
                   <pic:blipFill>
-                    <a:blip r:embed="rId9"/>
+                    <a:blip r:embed="rId38"/>
                     <a:stretch>
                       <a:fillRect/>
                     </a:stretch>
@@ -1601,7 +1601,7 @@
                   <pic:spPr>
                     <a:xfrm>
                       <a:off x="0" y="0"/>
-                      <a:ext cx="2926080" cy="1645920"/>
+                      <a:ext cx="2926080" cy="5762402"/>
                     </a:xfrm>
                     <a:prstGeom prst="rect"/>
                   </pic:spPr>
@@ -1633,7 +1633,7 @@
       <w:r>
         <w:drawing>
           <wp:inline xmlns:a="http://schemas.openxmlformats.org/drawingml/2006/main" xmlns:pic="http://schemas.openxmlformats.org/drawingml/2006/picture">
-            <wp:extent cx="2926080" cy="1645920"/>
+            <wp:extent cx="2926080" cy="4334256"/>
             <wp:docPr id="31" name="Picture 31"/>
             <wp:cNvGraphicFramePr>
               <a:graphicFrameLocks noChangeAspect="1"/>
@@ -1642,11 +1642,11 @@
               <a:graphicData uri="http://schemas.openxmlformats.org/drawingml/2006/picture">
                 <pic:pic>
                   <pic:nvPicPr>
-                    <pic:cNvPr id="0" name="C1.png"/>
+                    <pic:cNvPr id="0" name="D2.jpg"/>
                     <pic:cNvPicPr/>
                   </pic:nvPicPr>
                   <pic:blipFill>
-                    <a:blip r:embed="rId9"/>
+                    <a:blip r:embed="rId39"/>
                     <a:stretch>
                       <a:fillRect/>
                     </a:stretch>
@@ -1654,7 +1654,7 @@
                   <pic:spPr>
                     <a:xfrm>
                       <a:off x="0" y="0"/>
-                      <a:ext cx="2926080" cy="1645920"/>
+                      <a:ext cx="2926080" cy="4334256"/>
                     </a:xfrm>
                     <a:prstGeom prst="rect"/>
                   </pic:spPr>
@@ -1686,7 +1686,7 @@
       <w:r>
         <w:drawing>
           <wp:inline xmlns:a="http://schemas.openxmlformats.org/drawingml/2006/main" xmlns:pic="http://schemas.openxmlformats.org/drawingml/2006/picture">
-            <wp:extent cx="2926080" cy="1645920"/>
+            <wp:extent cx="2926080" cy="3916446"/>
             <wp:docPr id="32" name="Picture 32"/>
             <wp:cNvGraphicFramePr>
               <a:graphicFrameLocks noChangeAspect="1"/>
@@ -1695,11 +1695,11 @@
               <a:graphicData uri="http://schemas.openxmlformats.org/drawingml/2006/picture">
                 <pic:pic>
                   <pic:nvPicPr>
-                    <pic:cNvPr id="0" name="C1.png"/>
+                    <pic:cNvPr id="0" name="D3.jpg"/>
                     <pic:cNvPicPr/>
                   </pic:nvPicPr>
                   <pic:blipFill>
-                    <a:blip r:embed="rId9"/>
+                    <a:blip r:embed="rId40"/>
                     <a:stretch>
                       <a:fillRect/>
                     </a:stretch>
@@ -1707,7 +1707,7 @@
                   <pic:spPr>
                     <a:xfrm>
                       <a:off x="0" y="0"/>
-                      <a:ext cx="2926080" cy="1645920"/>
+                      <a:ext cx="2926080" cy="3916446"/>
                     </a:xfrm>
                     <a:prstGeom prst="rect"/>
                   </pic:spPr>
@@ -1739,7 +1739,7 @@
       <w:r>
         <w:drawing>
           <wp:inline xmlns:a="http://schemas.openxmlformats.org/drawingml/2006/main" xmlns:pic="http://schemas.openxmlformats.org/drawingml/2006/picture">
-            <wp:extent cx="2926080" cy="1645920"/>
+            <wp:extent cx="2926080" cy="1627842"/>
             <wp:docPr id="33" name="Picture 33"/>
             <wp:cNvGraphicFramePr>
               <a:graphicFrameLocks noChangeAspect="1"/>
@@ -1748,11 +1748,11 @@
               <a:graphicData uri="http://schemas.openxmlformats.org/drawingml/2006/picture">
                 <pic:pic>
                   <pic:nvPicPr>
-                    <pic:cNvPr id="0" name="C1.png"/>
+                    <pic:cNvPr id="0" name="D4.jpg"/>
                     <pic:cNvPicPr/>
                   </pic:nvPicPr>
                   <pic:blipFill>
-                    <a:blip r:embed="rId9"/>
+                    <a:blip r:embed="rId41"/>
                     <a:stretch>
                       <a:fillRect/>
                     </a:stretch>
@@ -1760,7 +1760,7 @@
                   <pic:spPr>
                     <a:xfrm>
                       <a:off x="0" y="0"/>
-                      <a:ext cx="2926080" cy="1645920"/>
+                      <a:ext cx="2926080" cy="1627842"/>
                     </a:xfrm>
                     <a:prstGeom prst="rect"/>
                   </pic:spPr>
@@ -1792,7 +1792,7 @@
       <w:r>
         <w:drawing>
           <wp:inline xmlns:a="http://schemas.openxmlformats.org/drawingml/2006/main" xmlns:pic="http://schemas.openxmlformats.org/drawingml/2006/picture">
-            <wp:extent cx="2926080" cy="1645920"/>
+            <wp:extent cx="2926080" cy="2223360"/>
             <wp:docPr id="34" name="Picture 34"/>
             <wp:cNvGraphicFramePr>
               <a:graphicFrameLocks noChangeAspect="1"/>
@@ -1801,11 +1801,11 @@
               <a:graphicData uri="http://schemas.openxmlformats.org/drawingml/2006/picture">
                 <pic:pic>
                   <pic:nvPicPr>
-                    <pic:cNvPr id="0" name="C1.png"/>
+                    <pic:cNvPr id="0" name="D5.jpg"/>
                     <pic:cNvPicPr/>
                   </pic:nvPicPr>
                   <pic:blipFill>
-                    <a:blip r:embed="rId9"/>
+                    <a:blip r:embed="rId42"/>
                     <a:stretch>
                       <a:fillRect/>
                     </a:stretch>
@@ -1813,7 +1813,7 @@
                   <pic:spPr>
                     <a:xfrm>
                       <a:off x="0" y="0"/>
-                      <a:ext cx="2926080" cy="1645920"/>
+                      <a:ext cx="2926080" cy="2223360"/>
                     </a:xfrm>
                     <a:prstGeom prst="rect"/>
                   </pic:spPr>
@@ -1845,7 +1845,7 @@
       <w:r>
         <w:drawing>
           <wp:inline xmlns:a="http://schemas.openxmlformats.org/drawingml/2006/main" xmlns:pic="http://schemas.openxmlformats.org/drawingml/2006/picture">
-            <wp:extent cx="2926080" cy="1645920"/>
+            <wp:extent cx="2926080" cy="4323365"/>
             <wp:docPr id="35" name="Picture 35"/>
             <wp:cNvGraphicFramePr>
               <a:graphicFrameLocks noChangeAspect="1"/>
@@ -1854,11 +1854,11 @@
               <a:graphicData uri="http://schemas.openxmlformats.org/drawingml/2006/picture">
                 <pic:pic>
                   <pic:nvPicPr>
-                    <pic:cNvPr id="0" name="C1.png"/>
+                    <pic:cNvPr id="0" name="D6.jpg"/>
                     <pic:cNvPicPr/>
                   </pic:nvPicPr>
                   <pic:blipFill>
-                    <a:blip r:embed="rId9"/>
+                    <a:blip r:embed="rId43"/>
                     <a:stretch>
                       <a:fillRect/>
                     </a:stretch>
@@ -1866,7 +1866,7 @@
                   <pic:spPr>
                     <a:xfrm>
                       <a:off x="0" y="0"/>
-                      <a:ext cx="2926080" cy="1645920"/>
+                      <a:ext cx="2926080" cy="4323365"/>
                     </a:xfrm>
                     <a:prstGeom prst="rect"/>
                   </pic:spPr>
@@ -1898,7 +1898,7 @@
       <w:r>
         <w:drawing>
           <wp:inline xmlns:a="http://schemas.openxmlformats.org/drawingml/2006/main" xmlns:pic="http://schemas.openxmlformats.org/drawingml/2006/picture">
-            <wp:extent cx="2926080" cy="1645920"/>
+            <wp:extent cx="2926080" cy="4214115"/>
             <wp:docPr id="36" name="Picture 36"/>
             <wp:cNvGraphicFramePr>
               <a:graphicFrameLocks noChangeAspect="1"/>
@@ -1907,11 +1907,11 @@
               <a:graphicData uri="http://schemas.openxmlformats.org/drawingml/2006/picture">
                 <pic:pic>
                   <pic:nvPicPr>
-                    <pic:cNvPr id="0" name="C1.png"/>
+                    <pic:cNvPr id="0" name="D7.jpg"/>
                     <pic:cNvPicPr/>
                   </pic:nvPicPr>
                   <pic:blipFill>
-                    <a:blip r:embed="rId9"/>
+                    <a:blip r:embed="rId44"/>
                     <a:stretch>
                       <a:fillRect/>
                     </a:stretch>
@@ -1919,7 +1919,7 @@
                   <pic:spPr>
                     <a:xfrm>
                       <a:off x="0" y="0"/>
-                      <a:ext cx="2926080" cy="1645920"/>
+                      <a:ext cx="2926080" cy="4214115"/>
                     </a:xfrm>
                     <a:prstGeom prst="rect"/>
                   </pic:spPr>
@@ -1951,7 +1951,7 @@
       <w:r>
         <w:drawing>
           <wp:inline xmlns:a="http://schemas.openxmlformats.org/drawingml/2006/main" xmlns:pic="http://schemas.openxmlformats.org/drawingml/2006/picture">
-            <wp:extent cx="2926080" cy="1645920"/>
+            <wp:extent cx="2926080" cy="3672329"/>
             <wp:docPr id="37" name="Picture 37"/>
             <wp:cNvGraphicFramePr>
               <a:graphicFrameLocks noChangeAspect="1"/>
@@ -1960,11 +1960,11 @@
               <a:graphicData uri="http://schemas.openxmlformats.org/drawingml/2006/picture">
                 <pic:pic>
                   <pic:nvPicPr>
-                    <pic:cNvPr id="0" name="C1.png"/>
+                    <pic:cNvPr id="0" name="D8.jpg"/>
                     <pic:cNvPicPr/>
                   </pic:nvPicPr>
                   <pic:blipFill>
-                    <a:blip r:embed="rId9"/>
+                    <a:blip r:embed="rId45"/>
                     <a:stretch>
                       <a:fillRect/>
                     </a:stretch>
@@ -1972,7 +1972,7 @@
                   <pic:spPr>
                     <a:xfrm>
                       <a:off x="0" y="0"/>
-                      <a:ext cx="2926080" cy="1645920"/>
+                      <a:ext cx="2926080" cy="3672329"/>
                     </a:xfrm>
                     <a:prstGeom prst="rect"/>
                   </pic:spPr>
@@ -2004,7 +2004,7 @@
       <w:r>
         <w:drawing>
           <wp:inline xmlns:a="http://schemas.openxmlformats.org/drawingml/2006/main" xmlns:pic="http://schemas.openxmlformats.org/drawingml/2006/picture">
-            <wp:extent cx="2926080" cy="1645920"/>
+            <wp:extent cx="2926080" cy="5831259"/>
             <wp:docPr id="38" name="Picture 38"/>
             <wp:cNvGraphicFramePr>
               <a:graphicFrameLocks noChangeAspect="1"/>
@@ -2013,11 +2013,11 @@
               <a:graphicData uri="http://schemas.openxmlformats.org/drawingml/2006/picture">
                 <pic:pic>
                   <pic:nvPicPr>
-                    <pic:cNvPr id="0" name="C1.png"/>
+                    <pic:cNvPr id="0" name="D9.jpg"/>
                     <pic:cNvPicPr/>
                   </pic:nvPicPr>
                   <pic:blipFill>
-                    <a:blip r:embed="rId9"/>
+                    <a:blip r:embed="rId46"/>
                     <a:stretch>
                       <a:fillRect/>
                     </a:stretch>
@@ -2025,7 +2025,7 @@
                   <pic:spPr>
                     <a:xfrm>
                       <a:off x="0" y="0"/>
-                      <a:ext cx="2926080" cy="1645920"/>
+                      <a:ext cx="2926080" cy="5831259"/>
                     </a:xfrm>
                     <a:prstGeom prst="rect"/>
                   </pic:spPr>
@@ -2057,7 +2057,7 @@
       <w:r>
         <w:drawing>
           <wp:inline xmlns:a="http://schemas.openxmlformats.org/drawingml/2006/main" xmlns:pic="http://schemas.openxmlformats.org/drawingml/2006/picture">
-            <wp:extent cx="2926080" cy="1645920"/>
+            <wp:extent cx="2926080" cy="4976088"/>
             <wp:docPr id="39" name="Picture 39"/>
             <wp:cNvGraphicFramePr>
               <a:graphicFrameLocks noChangeAspect="1"/>
@@ -2066,11 +2066,11 @@
               <a:graphicData uri="http://schemas.openxmlformats.org/drawingml/2006/picture">
                 <pic:pic>
                   <pic:nvPicPr>
-                    <pic:cNvPr id="0" name="D10.png"/>
+                    <pic:cNvPr id="0" name="D10.jpg"/>
                     <pic:cNvPicPr/>
                   </pic:nvPicPr>
                   <pic:blipFill>
-                    <a:blip r:embed="rId17"/>
+                    <a:blip r:embed="rId47"/>
                     <a:stretch>
                       <a:fillRect/>
                     </a:stretch>
@@ -2078,7 +2078,7 @@
                   <pic:spPr>
                     <a:xfrm>
                       <a:off x="0" y="0"/>
-                      <a:ext cx="2926080" cy="1645920"/>
+                      <a:ext cx="2926080" cy="4976088"/>
                     </a:xfrm>
                     <a:prstGeom prst="rect"/>
                   </pic:spPr>
@@ -2110,7 +2110,7 @@
       <w:r>
         <w:drawing>
           <wp:inline xmlns:a="http://schemas.openxmlformats.org/drawingml/2006/main" xmlns:pic="http://schemas.openxmlformats.org/drawingml/2006/picture">
-            <wp:extent cx="2926080" cy="1645920"/>
+            <wp:extent cx="2926080" cy="4053560"/>
             <wp:docPr id="40" name="Picture 40"/>
             <wp:cNvGraphicFramePr>
               <a:graphicFrameLocks noChangeAspect="1"/>
@@ -2119,11 +2119,11 @@
               <a:graphicData uri="http://schemas.openxmlformats.org/drawingml/2006/picture">
                 <pic:pic>
                   <pic:nvPicPr>
-                    <pic:cNvPr id="0" name="C1.png"/>
+                    <pic:cNvPr id="0" name="D11.jpg"/>
                     <pic:cNvPicPr/>
                   </pic:nvPicPr>
                   <pic:blipFill>
-                    <a:blip r:embed="rId9"/>
+                    <a:blip r:embed="rId48"/>
                     <a:stretch>
                       <a:fillRect/>
                     </a:stretch>
@@ -2131,7 +2131,7 @@
                   <pic:spPr>
                     <a:xfrm>
                       <a:off x="0" y="0"/>
-                      <a:ext cx="2926080" cy="1645920"/>
+                      <a:ext cx="2926080" cy="4053560"/>
                     </a:xfrm>
                     <a:prstGeom prst="rect"/>
                   </pic:spPr>
@@ -2163,7 +2163,7 @@
       <w:r>
         <w:drawing>
           <wp:inline xmlns:a="http://schemas.openxmlformats.org/drawingml/2006/main" xmlns:pic="http://schemas.openxmlformats.org/drawingml/2006/picture">
-            <wp:extent cx="2926080" cy="1645920"/>
+            <wp:extent cx="2926080" cy="4885509"/>
             <wp:docPr id="41" name="Picture 41"/>
             <wp:cNvGraphicFramePr>
               <a:graphicFrameLocks noChangeAspect="1"/>
@@ -2172,11 +2172,11 @@
               <a:graphicData uri="http://schemas.openxmlformats.org/drawingml/2006/picture">
                 <pic:pic>
                   <pic:nvPicPr>
-                    <pic:cNvPr id="0" name="C1.png"/>
+                    <pic:cNvPr id="0" name="D12.jpg"/>
                     <pic:cNvPicPr/>
                   </pic:nvPicPr>
                   <pic:blipFill>
-                    <a:blip r:embed="rId9"/>
+                    <a:blip r:embed="rId49"/>
                     <a:stretch>
                       <a:fillRect/>
                     </a:stretch>
@@ -2184,7 +2184,7 @@
                   <pic:spPr>
                     <a:xfrm>
                       <a:off x="0" y="0"/>
-                      <a:ext cx="2926080" cy="1645920"/>
+                      <a:ext cx="2926080" cy="4885509"/>
                     </a:xfrm>
                     <a:prstGeom prst="rect"/>
                   </pic:spPr>
@@ -2216,7 +2216,7 @@
       <w:r>
         <w:drawing>
           <wp:inline xmlns:a="http://schemas.openxmlformats.org/drawingml/2006/main" xmlns:pic="http://schemas.openxmlformats.org/drawingml/2006/picture">
-            <wp:extent cx="2926080" cy="1645920"/>
+            <wp:extent cx="2926080" cy="4750364"/>
             <wp:docPr id="42" name="Picture 42"/>
             <wp:cNvGraphicFramePr>
               <a:graphicFrameLocks noChangeAspect="1"/>
@@ -2225,11 +2225,11 @@
               <a:graphicData uri="http://schemas.openxmlformats.org/drawingml/2006/picture">
                 <pic:pic>
                   <pic:nvPicPr>
-                    <pic:cNvPr id="0" name="C1.png"/>
+                    <pic:cNvPr id="0" name="D13.jpg"/>
                     <pic:cNvPicPr/>
                   </pic:nvPicPr>
                   <pic:blipFill>
-                    <a:blip r:embed="rId9"/>
+                    <a:blip r:embed="rId50"/>
                     <a:stretch>
                       <a:fillRect/>
                     </a:stretch>
@@ -2237,7 +2237,7 @@
                   <pic:spPr>
                     <a:xfrm>
                       <a:off x="0" y="0"/>
-                      <a:ext cx="2926080" cy="1645920"/>
+                      <a:ext cx="2926080" cy="4750364"/>
                     </a:xfrm>
                     <a:prstGeom prst="rect"/>
                   </pic:spPr>
@@ -2269,7 +2269,7 @@
       <w:r>
         <w:drawing>
           <wp:inline xmlns:a="http://schemas.openxmlformats.org/drawingml/2006/main" xmlns:pic="http://schemas.openxmlformats.org/drawingml/2006/picture">
-            <wp:extent cx="2926080" cy="1645920"/>
+            <wp:extent cx="2926080" cy="6000584"/>
             <wp:docPr id="43" name="Picture 43"/>
             <wp:cNvGraphicFramePr>
               <a:graphicFrameLocks noChangeAspect="1"/>
@@ -2278,11 +2278,11 @@
               <a:graphicData uri="http://schemas.openxmlformats.org/drawingml/2006/picture">
                 <pic:pic>
                   <pic:nvPicPr>
-                    <pic:cNvPr id="0" name="C1.png"/>
+                    <pic:cNvPr id="0" name="D14.jpg"/>
                     <pic:cNvPicPr/>
                   </pic:nvPicPr>
                   <pic:blipFill>
-                    <a:blip r:embed="rId9"/>
+                    <a:blip r:embed="rId51"/>
                     <a:stretch>
                       <a:fillRect/>
                     </a:stretch>
@@ -2290,7 +2290,7 @@
                   <pic:spPr>
                     <a:xfrm>
                       <a:off x="0" y="0"/>
-                      <a:ext cx="2926080" cy="1645920"/>
+                      <a:ext cx="2926080" cy="6000584"/>
                     </a:xfrm>
                     <a:prstGeom prst="rect"/>
                   </pic:spPr>
@@ -2322,7 +2322,7 @@
       <w:r>
         <w:drawing>
           <wp:inline xmlns:a="http://schemas.openxmlformats.org/drawingml/2006/main" xmlns:pic="http://schemas.openxmlformats.org/drawingml/2006/picture">
-            <wp:extent cx="2926080" cy="1645920"/>
+            <wp:extent cx="2926080" cy="3981882"/>
             <wp:docPr id="44" name="Picture 44"/>
             <wp:cNvGraphicFramePr>
               <a:graphicFrameLocks noChangeAspect="1"/>
@@ -2331,11 +2331,11 @@
               <a:graphicData uri="http://schemas.openxmlformats.org/drawingml/2006/picture">
                 <pic:pic>
                   <pic:nvPicPr>
-                    <pic:cNvPr id="0" name="D15.png"/>
+                    <pic:cNvPr id="0" name="D15.jpg"/>
                     <pic:cNvPicPr/>
                   </pic:nvPicPr>
                   <pic:blipFill>
-                    <a:blip r:embed="rId18"/>
+                    <a:blip r:embed="rId52"/>
                     <a:stretch>
                       <a:fillRect/>
                     </a:stretch>
@@ -2343,7 +2343,7 @@
                   <pic:spPr>
                     <a:xfrm>
                       <a:off x="0" y="0"/>
-                      <a:ext cx="2926080" cy="1645920"/>
+                      <a:ext cx="2926080" cy="3981882"/>
                     </a:xfrm>
                     <a:prstGeom prst="rect"/>
                   </pic:spPr>
@@ -2375,7 +2375,7 @@
       <w:r>
         <w:drawing>
           <wp:inline xmlns:a="http://schemas.openxmlformats.org/drawingml/2006/main" xmlns:pic="http://schemas.openxmlformats.org/drawingml/2006/picture">
-            <wp:extent cx="2926080" cy="1645920"/>
+            <wp:extent cx="2926080" cy="3345628"/>
             <wp:docPr id="45" name="Picture 45"/>
             <wp:cNvGraphicFramePr>
               <a:graphicFrameLocks noChangeAspect="1"/>
@@ -2384,11 +2384,11 @@
               <a:graphicData uri="http://schemas.openxmlformats.org/drawingml/2006/picture">
                 <pic:pic>
                   <pic:nvPicPr>
-                    <pic:cNvPr id="0" name="D16.png"/>
+                    <pic:cNvPr id="0" name="D16.jpg"/>
                     <pic:cNvPicPr/>
                   </pic:nvPicPr>
                   <pic:blipFill>
-                    <a:blip r:embed="rId19"/>
+                    <a:blip r:embed="rId53"/>
                     <a:stretch>
                       <a:fillRect/>
                     </a:stretch>
@@ -2396,7 +2396,7 @@
                   <pic:spPr>
                     <a:xfrm>
                       <a:off x="0" y="0"/>
-                      <a:ext cx="2926080" cy="1645920"/>
+                      <a:ext cx="2926080" cy="3345628"/>
                     </a:xfrm>
                     <a:prstGeom prst="rect"/>
                   </pic:spPr>
@@ -2428,7 +2428,7 @@
       <w:r>
         <w:drawing>
           <wp:inline xmlns:a="http://schemas.openxmlformats.org/drawingml/2006/main" xmlns:pic="http://schemas.openxmlformats.org/drawingml/2006/picture">
-            <wp:extent cx="2926080" cy="1645920"/>
+            <wp:extent cx="2926080" cy="3090041"/>
             <wp:docPr id="46" name="Picture 46"/>
             <wp:cNvGraphicFramePr>
               <a:graphicFrameLocks noChangeAspect="1"/>
@@ -2437,11 +2437,11 @@
               <a:graphicData uri="http://schemas.openxmlformats.org/drawingml/2006/picture">
                 <pic:pic>
                   <pic:nvPicPr>
-                    <pic:cNvPr id="0" name="C1.png"/>
+                    <pic:cNvPr id="0" name="D17.jpg"/>
                     <pic:cNvPicPr/>
                   </pic:nvPicPr>
                   <pic:blipFill>
-                    <a:blip r:embed="rId9"/>
+                    <a:blip r:embed="rId54"/>
                     <a:stretch>
                       <a:fillRect/>
                     </a:stretch>
@@ -2449,7 +2449,7 @@
                   <pic:spPr>
                     <a:xfrm>
                       <a:off x="0" y="0"/>
-                      <a:ext cx="2926080" cy="1645920"/>
+                      <a:ext cx="2926080" cy="3090041"/>
                     </a:xfrm>
                     <a:prstGeom prst="rect"/>
                   </pic:spPr>
@@ -2481,7 +2481,7 @@
       <w:r>
         <w:drawing>
           <wp:inline xmlns:a="http://schemas.openxmlformats.org/drawingml/2006/main" xmlns:pic="http://schemas.openxmlformats.org/drawingml/2006/picture">
-            <wp:extent cx="2926080" cy="1645920"/>
+            <wp:extent cx="2926080" cy="3045783"/>
             <wp:docPr id="47" name="Picture 47"/>
             <wp:cNvGraphicFramePr>
               <a:graphicFrameLocks noChangeAspect="1"/>
@@ -2490,11 +2490,11 @@
               <a:graphicData uri="http://schemas.openxmlformats.org/drawingml/2006/picture">
                 <pic:pic>
                   <pic:nvPicPr>
-                    <pic:cNvPr id="0" name="C1.png"/>
+                    <pic:cNvPr id="0" name="D18.jpg"/>
                     <pic:cNvPicPr/>
                   </pic:nvPicPr>
                   <pic:blipFill>
-                    <a:blip r:embed="rId9"/>
+                    <a:blip r:embed="rId55"/>
                     <a:stretch>
                       <a:fillRect/>
                     </a:stretch>
@@ -2502,7 +2502,7 @@
                   <pic:spPr>
                     <a:xfrm>
                       <a:off x="0" y="0"/>
-                      <a:ext cx="2926080" cy="1645920"/>
+                      <a:ext cx="2926080" cy="3045783"/>
                     </a:xfrm>
                     <a:prstGeom prst="rect"/>
                   </pic:spPr>
@@ -2534,7 +2534,7 @@
       <w:r>
         <w:drawing>
           <wp:inline xmlns:a="http://schemas.openxmlformats.org/drawingml/2006/main" xmlns:pic="http://schemas.openxmlformats.org/drawingml/2006/picture">
-            <wp:extent cx="2926080" cy="1645920"/>
+            <wp:extent cx="2926080" cy="6251171"/>
             <wp:docPr id="48" name="Picture 48"/>
             <wp:cNvGraphicFramePr>
               <a:graphicFrameLocks noChangeAspect="1"/>
@@ -2543,11 +2543,11 @@
               <a:graphicData uri="http://schemas.openxmlformats.org/drawingml/2006/picture">
                 <pic:pic>
                   <pic:nvPicPr>
-                    <pic:cNvPr id="0" name="C1.png"/>
+                    <pic:cNvPr id="0" name="D19.jpg"/>
                     <pic:cNvPicPr/>
                   </pic:nvPicPr>
                   <pic:blipFill>
-                    <a:blip r:embed="rId9"/>
+                    <a:blip r:embed="rId56"/>
                     <a:stretch>
                       <a:fillRect/>
                     </a:stretch>
@@ -2555,7 +2555,7 @@
                   <pic:spPr>
                     <a:xfrm>
                       <a:off x="0" y="0"/>
-                      <a:ext cx="2926080" cy="1645920"/>
+                      <a:ext cx="2926080" cy="6251171"/>
                     </a:xfrm>
                     <a:prstGeom prst="rect"/>
                   </pic:spPr>
@@ -2587,7 +2587,7 @@
       <w:r>
         <w:drawing>
           <wp:inline xmlns:a="http://schemas.openxmlformats.org/drawingml/2006/main" xmlns:pic="http://schemas.openxmlformats.org/drawingml/2006/picture">
-            <wp:extent cx="2926080" cy="1645920"/>
+            <wp:extent cx="2926080" cy="5917184"/>
             <wp:docPr id="49" name="Picture 49"/>
             <wp:cNvGraphicFramePr>
               <a:graphicFrameLocks noChangeAspect="1"/>
@@ -2596,11 +2596,11 @@
               <a:graphicData uri="http://schemas.openxmlformats.org/drawingml/2006/picture">
                 <pic:pic>
                   <pic:nvPicPr>
-                    <pic:cNvPr id="0" name="C1.png"/>
+                    <pic:cNvPr id="0" name="D20.jpg"/>
                     <pic:cNvPicPr/>
                   </pic:nvPicPr>
                   <pic:blipFill>
-                    <a:blip r:embed="rId9"/>
+                    <a:blip r:embed="rId57"/>
                     <a:stretch>
                       <a:fillRect/>
                     </a:stretch>
@@ -2608,7 +2608,7 @@
                   <pic:spPr>
                     <a:xfrm>
                       <a:off x="0" y="0"/>
-                      <a:ext cx="2926080" cy="1645920"/>
+                      <a:ext cx="2926080" cy="5917184"/>
                     </a:xfrm>
                     <a:prstGeom prst="rect"/>
                   </pic:spPr>
@@ -2640,7 +2640,7 @@
       <w:r>
         <w:drawing>
           <wp:inline xmlns:a="http://schemas.openxmlformats.org/drawingml/2006/main" xmlns:pic="http://schemas.openxmlformats.org/drawingml/2006/picture">
-            <wp:extent cx="2926080" cy="1645920"/>
+            <wp:extent cx="2926080" cy="4616009"/>
             <wp:docPr id="50" name="Picture 50"/>
             <wp:cNvGraphicFramePr>
               <a:graphicFrameLocks noChangeAspect="1"/>
@@ -2649,11 +2649,11 @@
               <a:graphicData uri="http://schemas.openxmlformats.org/drawingml/2006/picture">
                 <pic:pic>
                   <pic:nvPicPr>
-                    <pic:cNvPr id="0" name="D21.png"/>
+                    <pic:cNvPr id="0" name="D21.jpg"/>
                     <pic:cNvPicPr/>
                   </pic:nvPicPr>
                   <pic:blipFill>
-                    <a:blip r:embed="rId20"/>
+                    <a:blip r:embed="rId58"/>
                     <a:stretch>
                       <a:fillRect/>
                     </a:stretch>
@@ -2661,7 +2661,7 @@
                   <pic:spPr>
                     <a:xfrm>
                       <a:off x="0" y="0"/>
-                      <a:ext cx="2926080" cy="1645920"/>
+                      <a:ext cx="2926080" cy="4616009"/>
                     </a:xfrm>
                     <a:prstGeom prst="rect"/>
                   </pic:spPr>
@@ -2693,7 +2693,7 @@
       <w:r>
         <w:drawing>
           <wp:inline xmlns:a="http://schemas.openxmlformats.org/drawingml/2006/main" xmlns:pic="http://schemas.openxmlformats.org/drawingml/2006/picture">
-            <wp:extent cx="2926080" cy="1645920"/>
+            <wp:extent cx="2926080" cy="4541020"/>
             <wp:docPr id="51" name="Picture 51"/>
             <wp:cNvGraphicFramePr>
               <a:graphicFrameLocks noChangeAspect="1"/>
@@ -2702,11 +2702,11 @@
               <a:graphicData uri="http://schemas.openxmlformats.org/drawingml/2006/picture">
                 <pic:pic>
                   <pic:nvPicPr>
-                    <pic:cNvPr id="0" name="C1.png"/>
+                    <pic:cNvPr id="0" name="D22.jpg"/>
                     <pic:cNvPicPr/>
                   </pic:nvPicPr>
                   <pic:blipFill>
-                    <a:blip r:embed="rId9"/>
+                    <a:blip r:embed="rId59"/>
                     <a:stretch>
                       <a:fillRect/>
                     </a:stretch>
@@ -2714,7 +2714,7 @@
                   <pic:spPr>
                     <a:xfrm>
                       <a:off x="0" y="0"/>
-                      <a:ext cx="2926080" cy="1645920"/>
+                      <a:ext cx="2926080" cy="4541020"/>
                     </a:xfrm>
                     <a:prstGeom prst="rect"/>
                   </pic:spPr>
@@ -2746,7 +2746,7 @@
       <w:r>
         <w:drawing>
           <wp:inline xmlns:a="http://schemas.openxmlformats.org/drawingml/2006/main" xmlns:pic="http://schemas.openxmlformats.org/drawingml/2006/picture">
-            <wp:extent cx="2926080" cy="1645920"/>
+            <wp:extent cx="2926080" cy="5078321"/>
             <wp:docPr id="52" name="Picture 52"/>
             <wp:cNvGraphicFramePr>
               <a:graphicFrameLocks noChangeAspect="1"/>
@@ -2755,11 +2755,11 @@
               <a:graphicData uri="http://schemas.openxmlformats.org/drawingml/2006/picture">
                 <pic:pic>
                   <pic:nvPicPr>
-                    <pic:cNvPr id="0" name="C1.png"/>
+                    <pic:cNvPr id="0" name="D23.jpg"/>
                     <pic:cNvPicPr/>
                   </pic:nvPicPr>
                   <pic:blipFill>
-                    <a:blip r:embed="rId9"/>
+                    <a:blip r:embed="rId60"/>
                     <a:stretch>
                       <a:fillRect/>
                     </a:stretch>
@@ -2767,7 +2767,7 @@
                   <pic:spPr>
                     <a:xfrm>
                       <a:off x="0" y="0"/>
-                      <a:ext cx="2926080" cy="1645920"/>
+                      <a:ext cx="2926080" cy="5078321"/>
                     </a:xfrm>
                     <a:prstGeom prst="rect"/>
                   </pic:spPr>
@@ -2799,7 +2799,7 @@
       <w:r>
         <w:drawing>
           <wp:inline xmlns:a="http://schemas.openxmlformats.org/drawingml/2006/main" xmlns:pic="http://schemas.openxmlformats.org/drawingml/2006/picture">
-            <wp:extent cx="2926080" cy="1645920"/>
+            <wp:extent cx="2926080" cy="4816778"/>
             <wp:docPr id="53" name="Picture 53"/>
             <wp:cNvGraphicFramePr>
               <a:graphicFrameLocks noChangeAspect="1"/>
@@ -2808,11 +2808,11 @@
               <a:graphicData uri="http://schemas.openxmlformats.org/drawingml/2006/picture">
                 <pic:pic>
                   <pic:nvPicPr>
-                    <pic:cNvPr id="0" name="C1.png"/>
+                    <pic:cNvPr id="0" name="D24.jpg"/>
                     <pic:cNvPicPr/>
                   </pic:nvPicPr>
                   <pic:blipFill>
-                    <a:blip r:embed="rId9"/>
+                    <a:blip r:embed="rId61"/>
                     <a:stretch>
                       <a:fillRect/>
                     </a:stretch>
@@ -2820,7 +2820,7 @@
                   <pic:spPr>
                     <a:xfrm>
                       <a:off x="0" y="0"/>
-                      <a:ext cx="2926080" cy="1645920"/>
+                      <a:ext cx="2926080" cy="4816778"/>
                     </a:xfrm>
                     <a:prstGeom prst="rect"/>
                   </pic:spPr>
@@ -2852,7 +2852,7 @@
       <w:r>
         <w:drawing>
           <wp:inline xmlns:a="http://schemas.openxmlformats.org/drawingml/2006/main" xmlns:pic="http://schemas.openxmlformats.org/drawingml/2006/picture">
-            <wp:extent cx="2926080" cy="1645920"/>
+            <wp:extent cx="2926080" cy="4028987"/>
             <wp:docPr id="54" name="Picture 54"/>
             <wp:cNvGraphicFramePr>
               <a:graphicFrameLocks noChangeAspect="1"/>
@@ -2861,11 +2861,11 @@
               <a:graphicData uri="http://schemas.openxmlformats.org/drawingml/2006/picture">
                 <pic:pic>
                   <pic:nvPicPr>
-                    <pic:cNvPr id="0" name="C1.png"/>
+                    <pic:cNvPr id="0" name="D25.jpg"/>
                     <pic:cNvPicPr/>
                   </pic:nvPicPr>
                   <pic:blipFill>
-                    <a:blip r:embed="rId9"/>
+                    <a:blip r:embed="rId62"/>
                     <a:stretch>
                       <a:fillRect/>
                     </a:stretch>
@@ -2873,7 +2873,7 @@
                   <pic:spPr>
                     <a:xfrm>
                       <a:off x="0" y="0"/>
-                      <a:ext cx="2926080" cy="1645920"/>
+                      <a:ext cx="2926080" cy="4028987"/>
                     </a:xfrm>
                     <a:prstGeom prst="rect"/>
                   </pic:spPr>
@@ -2905,7 +2905,7 @@
       <w:r>
         <w:drawing>
           <wp:inline xmlns:a="http://schemas.openxmlformats.org/drawingml/2006/main" xmlns:pic="http://schemas.openxmlformats.org/drawingml/2006/picture">
-            <wp:extent cx="2926080" cy="1645920"/>
+            <wp:extent cx="2926080" cy="3767829"/>
             <wp:docPr id="55" name="Picture 55"/>
             <wp:cNvGraphicFramePr>
               <a:graphicFrameLocks noChangeAspect="1"/>
@@ -2914,11 +2914,11 @@
               <a:graphicData uri="http://schemas.openxmlformats.org/drawingml/2006/picture">
                 <pic:pic>
                   <pic:nvPicPr>
-                    <pic:cNvPr id="0" name="C1.png"/>
+                    <pic:cNvPr id="0" name="D26.jpg"/>
                     <pic:cNvPicPr/>
                   </pic:nvPicPr>
                   <pic:blipFill>
-                    <a:blip r:embed="rId9"/>
+                    <a:blip r:embed="rId63"/>
                     <a:stretch>
                       <a:fillRect/>
                     </a:stretch>
@@ -2926,7 +2926,7 @@
                   <pic:spPr>
                     <a:xfrm>
                       <a:off x="0" y="0"/>
-                      <a:ext cx="2926080" cy="1645920"/>
+                      <a:ext cx="2926080" cy="3767829"/>
                     </a:xfrm>
                     <a:prstGeom prst="rect"/>
                   </pic:spPr>
@@ -2958,7 +2958,7 @@
       <w:r>
         <w:drawing>
           <wp:inline xmlns:a="http://schemas.openxmlformats.org/drawingml/2006/main" xmlns:pic="http://schemas.openxmlformats.org/drawingml/2006/picture">
-            <wp:extent cx="2926080" cy="1645920"/>
+            <wp:extent cx="2926080" cy="3530040"/>
             <wp:docPr id="56" name="Picture 56"/>
             <wp:cNvGraphicFramePr>
               <a:graphicFrameLocks noChangeAspect="1"/>
@@ -2967,11 +2967,11 @@
               <a:graphicData uri="http://schemas.openxmlformats.org/drawingml/2006/picture">
                 <pic:pic>
                   <pic:nvPicPr>
-                    <pic:cNvPr id="0" name="C1.png"/>
+                    <pic:cNvPr id="0" name="D27.jpg"/>
                     <pic:cNvPicPr/>
                   </pic:nvPicPr>
                   <pic:blipFill>
-                    <a:blip r:embed="rId9"/>
+                    <a:blip r:embed="rId64"/>
                     <a:stretch>
                       <a:fillRect/>
                     </a:stretch>
@@ -2979,7 +2979,7 @@
                   <pic:spPr>
                     <a:xfrm>
                       <a:off x="0" y="0"/>
-                      <a:ext cx="2926080" cy="1645920"/>
+                      <a:ext cx="2926080" cy="3530040"/>
                     </a:xfrm>
                     <a:prstGeom prst="rect"/>
                   </pic:spPr>
@@ -3011,7 +3011,7 @@
       <w:r>
         <w:drawing>
           <wp:inline xmlns:a="http://schemas.openxmlformats.org/drawingml/2006/main" xmlns:pic="http://schemas.openxmlformats.org/drawingml/2006/picture">
-            <wp:extent cx="2926080" cy="1645920"/>
+            <wp:extent cx="2926080" cy="2476592"/>
             <wp:docPr id="57" name="Picture 57"/>
             <wp:cNvGraphicFramePr>
               <a:graphicFrameLocks noChangeAspect="1"/>
@@ -3020,11 +3020,11 @@
               <a:graphicData uri="http://schemas.openxmlformats.org/drawingml/2006/picture">
                 <pic:pic>
                   <pic:nvPicPr>
-                    <pic:cNvPr id="0" name="C1.png"/>
+                    <pic:cNvPr id="0" name="D28.jpg"/>
                     <pic:cNvPicPr/>
                   </pic:nvPicPr>
                   <pic:blipFill>
-                    <a:blip r:embed="rId9"/>
+                    <a:blip r:embed="rId65"/>
                     <a:stretch>
                       <a:fillRect/>
                     </a:stretch>
@@ -3032,7 +3032,7 @@
                   <pic:spPr>
                     <a:xfrm>
                       <a:off x="0" y="0"/>
-                      <a:ext cx="2926080" cy="1645920"/>
+                      <a:ext cx="2926080" cy="2476592"/>
                     </a:xfrm>
                     <a:prstGeom prst="rect"/>
                   </pic:spPr>
@@ -3064,7 +3064,7 @@
       <w:r>
         <w:drawing>
           <wp:inline xmlns:a="http://schemas.openxmlformats.org/drawingml/2006/main" xmlns:pic="http://schemas.openxmlformats.org/drawingml/2006/picture">
-            <wp:extent cx="2926080" cy="1645920"/>
+            <wp:extent cx="2926080" cy="4241834"/>
             <wp:docPr id="58" name="Picture 58"/>
             <wp:cNvGraphicFramePr>
               <a:graphicFrameLocks noChangeAspect="1"/>
@@ -3073,11 +3073,11 @@
               <a:graphicData uri="http://schemas.openxmlformats.org/drawingml/2006/picture">
                 <pic:pic>
                   <pic:nvPicPr>
-                    <pic:cNvPr id="0" name="C1.png"/>
+                    <pic:cNvPr id="0" name="D29.jpg"/>
                     <pic:cNvPicPr/>
                   </pic:nvPicPr>
                   <pic:blipFill>
-                    <a:blip r:embed="rId9"/>
+                    <a:blip r:embed="rId66"/>
                     <a:stretch>
                       <a:fillRect/>
                     </a:stretch>
@@ -3085,7 +3085,7 @@
                   <pic:spPr>
                     <a:xfrm>
                       <a:off x="0" y="0"/>
-                      <a:ext cx="2926080" cy="1645920"/>
+                      <a:ext cx="2926080" cy="4241834"/>
                     </a:xfrm>
                     <a:prstGeom prst="rect"/>
                   </pic:spPr>

</xml_diff>

<commit_message>
POV kit: clip catalog as PDF
</commit_message>
<xml_diff>
--- a/pov-meme-kit/CLIP_CATALOG.docx
+++ b/pov-meme-kit/CLIP_CATALOG.docx
@@ -35,7 +35,7 @@
       <w:r>
         <w:drawing>
           <wp:inline xmlns:a="http://schemas.openxmlformats.org/drawingml/2006/main" xmlns:pic="http://schemas.openxmlformats.org/drawingml/2006/picture">
-            <wp:extent cx="2926080" cy="4298197"/>
+            <wp:extent cx="1244990" cy="1828800"/>
             <wp:docPr id="1" name="Picture 1"/>
             <wp:cNvGraphicFramePr>
               <a:graphicFrameLocks noChangeAspect="1"/>
@@ -56,7 +56,7 @@
                   <pic:spPr>
                     <a:xfrm>
                       <a:off x="0" y="0"/>
-                      <a:ext cx="2926080" cy="4298197"/>
+                      <a:ext cx="1244990" cy="1828800"/>
                     </a:xfrm>
                     <a:prstGeom prst="rect"/>
                   </pic:spPr>
@@ -88,7 +88,7 @@
       <w:r>
         <w:drawing>
           <wp:inline xmlns:a="http://schemas.openxmlformats.org/drawingml/2006/main" xmlns:pic="http://schemas.openxmlformats.org/drawingml/2006/picture">
-            <wp:extent cx="2926080" cy="4830036"/>
+            <wp:extent cx="1107903" cy="1828800"/>
             <wp:docPr id="2" name="Picture 2"/>
             <wp:cNvGraphicFramePr>
               <a:graphicFrameLocks noChangeAspect="1"/>
@@ -109,7 +109,7 @@
                   <pic:spPr>
                     <a:xfrm>
                       <a:off x="0" y="0"/>
-                      <a:ext cx="2926080" cy="4830036"/>
+                      <a:ext cx="1107903" cy="1828800"/>
                     </a:xfrm>
                     <a:prstGeom prst="rect"/>
                   </pic:spPr>
@@ -141,7 +141,7 @@
       <w:r>
         <w:drawing>
           <wp:inline xmlns:a="http://schemas.openxmlformats.org/drawingml/2006/main" xmlns:pic="http://schemas.openxmlformats.org/drawingml/2006/picture">
-            <wp:extent cx="2926080" cy="4737463"/>
+            <wp:extent cx="1129552" cy="1828800"/>
             <wp:docPr id="3" name="Picture 3"/>
             <wp:cNvGraphicFramePr>
               <a:graphicFrameLocks noChangeAspect="1"/>
@@ -162,7 +162,7 @@
                   <pic:spPr>
                     <a:xfrm>
                       <a:off x="0" y="0"/>
-                      <a:ext cx="2926080" cy="4737463"/>
+                      <a:ext cx="1129552" cy="1828800"/>
                     </a:xfrm>
                     <a:prstGeom prst="rect"/>
                   </pic:spPr>
@@ -194,7 +194,7 @@
       <w:r>
         <w:drawing>
           <wp:inline xmlns:a="http://schemas.openxmlformats.org/drawingml/2006/main" xmlns:pic="http://schemas.openxmlformats.org/drawingml/2006/picture">
-            <wp:extent cx="2926080" cy="5741043"/>
+            <wp:extent cx="932098" cy="1828800"/>
             <wp:docPr id="4" name="Picture 4"/>
             <wp:cNvGraphicFramePr>
               <a:graphicFrameLocks noChangeAspect="1"/>
@@ -215,7 +215,7 @@
                   <pic:spPr>
                     <a:xfrm>
                       <a:off x="0" y="0"/>
-                      <a:ext cx="2926080" cy="5741043"/>
+                      <a:ext cx="932098" cy="1828800"/>
                     </a:xfrm>
                     <a:prstGeom prst="rect"/>
                   </pic:spPr>
@@ -247,7 +247,7 @@
       <w:r>
         <w:drawing>
           <wp:inline xmlns:a="http://schemas.openxmlformats.org/drawingml/2006/main" xmlns:pic="http://schemas.openxmlformats.org/drawingml/2006/picture">
-            <wp:extent cx="2926080" cy="4012496"/>
+            <wp:extent cx="1333637" cy="1828800"/>
             <wp:docPr id="5" name="Picture 5"/>
             <wp:cNvGraphicFramePr>
               <a:graphicFrameLocks noChangeAspect="1"/>
@@ -268,7 +268,7 @@
                   <pic:spPr>
                     <a:xfrm>
                       <a:off x="0" y="0"/>
-                      <a:ext cx="2926080" cy="4012496"/>
+                      <a:ext cx="1333637" cy="1828800"/>
                     </a:xfrm>
                     <a:prstGeom prst="rect"/>
                   </pic:spPr>
@@ -300,7 +300,7 @@
       <w:r>
         <w:drawing>
           <wp:inline xmlns:a="http://schemas.openxmlformats.org/drawingml/2006/main" xmlns:pic="http://schemas.openxmlformats.org/drawingml/2006/picture">
-            <wp:extent cx="2926080" cy="4990592"/>
+            <wp:extent cx="1072260" cy="1828800"/>
             <wp:docPr id="6" name="Picture 6"/>
             <wp:cNvGraphicFramePr>
               <a:graphicFrameLocks noChangeAspect="1"/>
@@ -321,7 +321,7 @@
                   <pic:spPr>
                     <a:xfrm>
                       <a:off x="0" y="0"/>
-                      <a:ext cx="2926080" cy="4990592"/>
+                      <a:ext cx="1072260" cy="1828800"/>
                     </a:xfrm>
                     <a:prstGeom prst="rect"/>
                   </pic:spPr>
@@ -353,7 +353,7 @@
       <w:r>
         <w:drawing>
           <wp:inline xmlns:a="http://schemas.openxmlformats.org/drawingml/2006/main" xmlns:pic="http://schemas.openxmlformats.org/drawingml/2006/picture">
-            <wp:extent cx="2926080" cy="4713439"/>
+            <wp:extent cx="1135310" cy="1828800"/>
             <wp:docPr id="7" name="Picture 7"/>
             <wp:cNvGraphicFramePr>
               <a:graphicFrameLocks noChangeAspect="1"/>
@@ -374,7 +374,7 @@
                   <pic:spPr>
                     <a:xfrm>
                       <a:off x="0" y="0"/>
-                      <a:ext cx="2926080" cy="4713439"/>
+                      <a:ext cx="1135310" cy="1828800"/>
                     </a:xfrm>
                     <a:prstGeom prst="rect"/>
                   </pic:spPr>
@@ -406,7 +406,7 @@
       <w:r>
         <w:drawing>
           <wp:inline xmlns:a="http://schemas.openxmlformats.org/drawingml/2006/main" xmlns:pic="http://schemas.openxmlformats.org/drawingml/2006/picture">
-            <wp:extent cx="2926080" cy="6040939"/>
+            <wp:extent cx="885825" cy="1828800"/>
             <wp:docPr id="8" name="Picture 8"/>
             <wp:cNvGraphicFramePr>
               <a:graphicFrameLocks noChangeAspect="1"/>
@@ -427,7 +427,7 @@
                   <pic:spPr>
                     <a:xfrm>
                       <a:off x="0" y="0"/>
-                      <a:ext cx="2926080" cy="6040939"/>
+                      <a:ext cx="885825" cy="1828800"/>
                     </a:xfrm>
                     <a:prstGeom prst="rect"/>
                   </pic:spPr>
@@ -459,7 +459,7 @@
       <w:r>
         <w:drawing>
           <wp:inline xmlns:a="http://schemas.openxmlformats.org/drawingml/2006/main" xmlns:pic="http://schemas.openxmlformats.org/drawingml/2006/picture">
-            <wp:extent cx="2926080" cy="4476033"/>
+            <wp:extent cx="1195526" cy="1828800"/>
             <wp:docPr id="9" name="Picture 9"/>
             <wp:cNvGraphicFramePr>
               <a:graphicFrameLocks noChangeAspect="1"/>
@@ -480,7 +480,7 @@
                   <pic:spPr>
                     <a:xfrm>
                       <a:off x="0" y="0"/>
-                      <a:ext cx="2926080" cy="4476033"/>
+                      <a:ext cx="1195526" cy="1828800"/>
                     </a:xfrm>
                     <a:prstGeom prst="rect"/>
                   </pic:spPr>
@@ -512,7 +512,7 @@
       <w:r>
         <w:drawing>
           <wp:inline xmlns:a="http://schemas.openxmlformats.org/drawingml/2006/main" xmlns:pic="http://schemas.openxmlformats.org/drawingml/2006/picture">
-            <wp:extent cx="2926080" cy="2319454"/>
+            <wp:extent cx="2307101" cy="1828800"/>
             <wp:docPr id="10" name="Picture 10"/>
             <wp:cNvGraphicFramePr>
               <a:graphicFrameLocks noChangeAspect="1"/>
@@ -533,7 +533,7 @@
                   <pic:spPr>
                     <a:xfrm>
                       <a:off x="0" y="0"/>
-                      <a:ext cx="2926080" cy="2319454"/>
+                      <a:ext cx="2307101" cy="1828800"/>
                     </a:xfrm>
                     <a:prstGeom prst="rect"/>
                   </pic:spPr>
@@ -565,7 +565,7 @@
       <w:r>
         <w:drawing>
           <wp:inline xmlns:a="http://schemas.openxmlformats.org/drawingml/2006/main" xmlns:pic="http://schemas.openxmlformats.org/drawingml/2006/picture">
-            <wp:extent cx="2926080" cy="3121152"/>
+            <wp:extent cx="1714500" cy="1828800"/>
             <wp:docPr id="11" name="Picture 11"/>
             <wp:cNvGraphicFramePr>
               <a:graphicFrameLocks noChangeAspect="1"/>
@@ -586,7 +586,7 @@
                   <pic:spPr>
                     <a:xfrm>
                       <a:off x="0" y="0"/>
-                      <a:ext cx="2926080" cy="3121152"/>
+                      <a:ext cx="1714500" cy="1828800"/>
                     </a:xfrm>
                     <a:prstGeom prst="rect"/>
                   </pic:spPr>
@@ -618,7 +618,7 @@
       <w:r>
         <w:drawing>
           <wp:inline xmlns:a="http://schemas.openxmlformats.org/drawingml/2006/main" xmlns:pic="http://schemas.openxmlformats.org/drawingml/2006/picture">
-            <wp:extent cx="2926080" cy="3086413"/>
+            <wp:extent cx="1733797" cy="1828800"/>
             <wp:docPr id="12" name="Picture 12"/>
             <wp:cNvGraphicFramePr>
               <a:graphicFrameLocks noChangeAspect="1"/>
@@ -639,7 +639,7 @@
                   <pic:spPr>
                     <a:xfrm>
                       <a:off x="0" y="0"/>
-                      <a:ext cx="2926080" cy="3086413"/>
+                      <a:ext cx="1733797" cy="1828800"/>
                     </a:xfrm>
                     <a:prstGeom prst="rect"/>
                   </pic:spPr>
@@ -671,7 +671,7 @@
       <w:r>
         <w:drawing>
           <wp:inline xmlns:a="http://schemas.openxmlformats.org/drawingml/2006/main" xmlns:pic="http://schemas.openxmlformats.org/drawingml/2006/picture">
-            <wp:extent cx="2926080" cy="6930189"/>
+            <wp:extent cx="772160" cy="1828800"/>
             <wp:docPr id="13" name="Picture 13"/>
             <wp:cNvGraphicFramePr>
               <a:graphicFrameLocks noChangeAspect="1"/>
@@ -692,7 +692,7 @@
                   <pic:spPr>
                     <a:xfrm>
                       <a:off x="0" y="0"/>
-                      <a:ext cx="2926080" cy="6930189"/>
+                      <a:ext cx="772160" cy="1828800"/>
                     </a:xfrm>
                     <a:prstGeom prst="rect"/>
                   </pic:spPr>
@@ -724,7 +724,7 @@
       <w:r>
         <w:drawing>
           <wp:inline xmlns:a="http://schemas.openxmlformats.org/drawingml/2006/main" xmlns:pic="http://schemas.openxmlformats.org/drawingml/2006/picture">
-            <wp:extent cx="2926080" cy="5013477"/>
+            <wp:extent cx="1067366" cy="1828800"/>
             <wp:docPr id="14" name="Picture 14"/>
             <wp:cNvGraphicFramePr>
               <a:graphicFrameLocks noChangeAspect="1"/>
@@ -745,7 +745,7 @@
                   <pic:spPr>
                     <a:xfrm>
                       <a:off x="0" y="0"/>
-                      <a:ext cx="2926080" cy="5013477"/>
+                      <a:ext cx="1067366" cy="1828800"/>
                     </a:xfrm>
                     <a:prstGeom prst="rect"/>
                   </pic:spPr>
@@ -777,7 +777,7 @@
       <w:r>
         <w:drawing>
           <wp:inline xmlns:a="http://schemas.openxmlformats.org/drawingml/2006/main" xmlns:pic="http://schemas.openxmlformats.org/drawingml/2006/picture">
-            <wp:extent cx="2926080" cy="4226560"/>
+            <wp:extent cx="1266092" cy="1828800"/>
             <wp:docPr id="15" name="Picture 15"/>
             <wp:cNvGraphicFramePr>
               <a:graphicFrameLocks noChangeAspect="1"/>
@@ -798,7 +798,7 @@
                   <pic:spPr>
                     <a:xfrm>
                       <a:off x="0" y="0"/>
-                      <a:ext cx="2926080" cy="4226560"/>
+                      <a:ext cx="1266092" cy="1828800"/>
                     </a:xfrm>
                     <a:prstGeom prst="rect"/>
                   </pic:spPr>
@@ -830,7 +830,7 @@
       <w:r>
         <w:drawing>
           <wp:inline xmlns:a="http://schemas.openxmlformats.org/drawingml/2006/main" xmlns:pic="http://schemas.openxmlformats.org/drawingml/2006/picture">
-            <wp:extent cx="2926080" cy="5575372"/>
+            <wp:extent cx="959795" cy="1828800"/>
             <wp:docPr id="16" name="Picture 16"/>
             <wp:cNvGraphicFramePr>
               <a:graphicFrameLocks noChangeAspect="1"/>
@@ -851,7 +851,7 @@
                   <pic:spPr>
                     <a:xfrm>
                       <a:off x="0" y="0"/>
-                      <a:ext cx="2926080" cy="5575372"/>
+                      <a:ext cx="959795" cy="1828800"/>
                     </a:xfrm>
                     <a:prstGeom prst="rect"/>
                   </pic:spPr>
@@ -883,7 +883,7 @@
       <w:r>
         <w:drawing>
           <wp:inline xmlns:a="http://schemas.openxmlformats.org/drawingml/2006/main" xmlns:pic="http://schemas.openxmlformats.org/drawingml/2006/picture">
-            <wp:extent cx="2926080" cy="4019941"/>
+            <wp:extent cx="1331167" cy="1828800"/>
             <wp:docPr id="17" name="Picture 17"/>
             <wp:cNvGraphicFramePr>
               <a:graphicFrameLocks noChangeAspect="1"/>
@@ -904,7 +904,7 @@
                   <pic:spPr>
                     <a:xfrm>
                       <a:off x="0" y="0"/>
-                      <a:ext cx="2926080" cy="4019941"/>
+                      <a:ext cx="1331167" cy="1828800"/>
                     </a:xfrm>
                     <a:prstGeom prst="rect"/>
                   </pic:spPr>
@@ -936,7 +936,7 @@
       <w:r>
         <w:drawing>
           <wp:inline xmlns:a="http://schemas.openxmlformats.org/drawingml/2006/main" xmlns:pic="http://schemas.openxmlformats.org/drawingml/2006/picture">
-            <wp:extent cx="2926080" cy="3485852"/>
+            <wp:extent cx="1535124" cy="1828800"/>
             <wp:docPr id="18" name="Picture 18"/>
             <wp:cNvGraphicFramePr>
               <a:graphicFrameLocks noChangeAspect="1"/>
@@ -957,7 +957,7 @@
                   <pic:spPr>
                     <a:xfrm>
                       <a:off x="0" y="0"/>
-                      <a:ext cx="2926080" cy="3485852"/>
+                      <a:ext cx="1535124" cy="1828800"/>
                     </a:xfrm>
                     <a:prstGeom prst="rect"/>
                   </pic:spPr>
@@ -989,7 +989,7 @@
       <w:r>
         <w:drawing>
           <wp:inline xmlns:a="http://schemas.openxmlformats.org/drawingml/2006/main" xmlns:pic="http://schemas.openxmlformats.org/drawingml/2006/picture">
-            <wp:extent cx="2926080" cy="5255394"/>
+            <wp:extent cx="1018232" cy="1828800"/>
             <wp:docPr id="19" name="Picture 19"/>
             <wp:cNvGraphicFramePr>
               <a:graphicFrameLocks noChangeAspect="1"/>
@@ -1010,7 +1010,7 @@
                   <pic:spPr>
                     <a:xfrm>
                       <a:off x="0" y="0"/>
-                      <a:ext cx="2926080" cy="5255394"/>
+                      <a:ext cx="1018232" cy="1828800"/>
                     </a:xfrm>
                     <a:prstGeom prst="rect"/>
                   </pic:spPr>
@@ -1042,7 +1042,7 @@
       <w:r>
         <w:drawing>
           <wp:inline xmlns:a="http://schemas.openxmlformats.org/drawingml/2006/main" xmlns:pic="http://schemas.openxmlformats.org/drawingml/2006/picture">
-            <wp:extent cx="2926080" cy="4116350"/>
+            <wp:extent cx="1299990" cy="1828799"/>
             <wp:docPr id="20" name="Picture 20"/>
             <wp:cNvGraphicFramePr>
               <a:graphicFrameLocks noChangeAspect="1"/>
@@ -1063,7 +1063,7 @@
                   <pic:spPr>
                     <a:xfrm>
                       <a:off x="0" y="0"/>
-                      <a:ext cx="2926080" cy="4116350"/>
+                      <a:ext cx="1299990" cy="1828799"/>
                     </a:xfrm>
                     <a:prstGeom prst="rect"/>
                   </pic:spPr>
@@ -1095,7 +1095,7 @@
       <w:r>
         <w:drawing>
           <wp:inline xmlns:a="http://schemas.openxmlformats.org/drawingml/2006/main" xmlns:pic="http://schemas.openxmlformats.org/drawingml/2006/picture">
-            <wp:extent cx="2926080" cy="3117605"/>
+            <wp:extent cx="1716450" cy="1828800"/>
             <wp:docPr id="21" name="Picture 21"/>
             <wp:cNvGraphicFramePr>
               <a:graphicFrameLocks noChangeAspect="1"/>
@@ -1116,7 +1116,7 @@
                   <pic:spPr>
                     <a:xfrm>
                       <a:off x="0" y="0"/>
-                      <a:ext cx="2926080" cy="3117605"/>
+                      <a:ext cx="1716450" cy="1828800"/>
                     </a:xfrm>
                     <a:prstGeom prst="rect"/>
                   </pic:spPr>
@@ -1148,7 +1148,7 @@
       <w:r>
         <w:drawing>
           <wp:inline xmlns:a="http://schemas.openxmlformats.org/drawingml/2006/main" xmlns:pic="http://schemas.openxmlformats.org/drawingml/2006/picture">
-            <wp:extent cx="2926080" cy="2937926"/>
+            <wp:extent cx="1821425" cy="1828800"/>
             <wp:docPr id="22" name="Picture 22"/>
             <wp:cNvGraphicFramePr>
               <a:graphicFrameLocks noChangeAspect="1"/>
@@ -1169,7 +1169,7 @@
                   <pic:spPr>
                     <a:xfrm>
                       <a:off x="0" y="0"/>
-                      <a:ext cx="2926080" cy="2937926"/>
+                      <a:ext cx="1821425" cy="1828800"/>
                     </a:xfrm>
                     <a:prstGeom prst="rect"/>
                   </pic:spPr>
@@ -1201,7 +1201,7 @@
       <w:r>
         <w:drawing>
           <wp:inline xmlns:a="http://schemas.openxmlformats.org/drawingml/2006/main" xmlns:pic="http://schemas.openxmlformats.org/drawingml/2006/picture">
-            <wp:extent cx="2926080" cy="3082660"/>
+            <wp:extent cx="1735908" cy="1828800"/>
             <wp:docPr id="23" name="Picture 23"/>
             <wp:cNvGraphicFramePr>
               <a:graphicFrameLocks noChangeAspect="1"/>
@@ -1222,7 +1222,7 @@
                   <pic:spPr>
                     <a:xfrm>
                       <a:off x="0" y="0"/>
-                      <a:ext cx="2926080" cy="3082660"/>
+                      <a:ext cx="1735908" cy="1828800"/>
                     </a:xfrm>
                     <a:prstGeom prst="rect"/>
                   </pic:spPr>
@@ -1254,7 +1254,7 @@
       <w:r>
         <w:drawing>
           <wp:inline xmlns:a="http://schemas.openxmlformats.org/drawingml/2006/main" xmlns:pic="http://schemas.openxmlformats.org/drawingml/2006/picture">
-            <wp:extent cx="2926080" cy="6182934"/>
+            <wp:extent cx="865481" cy="1828800"/>
             <wp:docPr id="24" name="Picture 24"/>
             <wp:cNvGraphicFramePr>
               <a:graphicFrameLocks noChangeAspect="1"/>
@@ -1275,7 +1275,7 @@
                   <pic:spPr>
                     <a:xfrm>
                       <a:off x="0" y="0"/>
-                      <a:ext cx="2926080" cy="6182934"/>
+                      <a:ext cx="865481" cy="1828800"/>
                     </a:xfrm>
                     <a:prstGeom prst="rect"/>
                   </pic:spPr>
@@ -1307,7 +1307,7 @@
       <w:r>
         <w:drawing>
           <wp:inline xmlns:a="http://schemas.openxmlformats.org/drawingml/2006/main" xmlns:pic="http://schemas.openxmlformats.org/drawingml/2006/picture">
-            <wp:extent cx="2926080" cy="4610277"/>
+            <wp:extent cx="1160714" cy="1828800"/>
             <wp:docPr id="25" name="Picture 25"/>
             <wp:cNvGraphicFramePr>
               <a:graphicFrameLocks noChangeAspect="1"/>
@@ -1328,7 +1328,7 @@
                   <pic:spPr>
                     <a:xfrm>
                       <a:off x="0" y="0"/>
-                      <a:ext cx="2926080" cy="4610277"/>
+                      <a:ext cx="1160714" cy="1828800"/>
                     </a:xfrm>
                     <a:prstGeom prst="rect"/>
                   </pic:spPr>
@@ -1360,7 +1360,7 @@
       <w:r>
         <w:drawing>
           <wp:inline xmlns:a="http://schemas.openxmlformats.org/drawingml/2006/main" xmlns:pic="http://schemas.openxmlformats.org/drawingml/2006/picture">
-            <wp:extent cx="2926080" cy="4649859"/>
+            <wp:extent cx="1150833" cy="1828800"/>
             <wp:docPr id="26" name="Picture 26"/>
             <wp:cNvGraphicFramePr>
               <a:graphicFrameLocks noChangeAspect="1"/>
@@ -1381,7 +1381,7 @@
                   <pic:spPr>
                     <a:xfrm>
                       <a:off x="0" y="0"/>
-                      <a:ext cx="2926080" cy="4649859"/>
+                      <a:ext cx="1150833" cy="1828800"/>
                     </a:xfrm>
                     <a:prstGeom prst="rect"/>
                   </pic:spPr>
@@ -1413,7 +1413,7 @@
       <w:r>
         <w:drawing>
           <wp:inline xmlns:a="http://schemas.openxmlformats.org/drawingml/2006/main" xmlns:pic="http://schemas.openxmlformats.org/drawingml/2006/picture">
-            <wp:extent cx="2926080" cy="4684611"/>
+            <wp:extent cx="1142296" cy="1828800"/>
             <wp:docPr id="27" name="Picture 27"/>
             <wp:cNvGraphicFramePr>
               <a:graphicFrameLocks noChangeAspect="1"/>
@@ -1434,7 +1434,7 @@
                   <pic:spPr>
                     <a:xfrm>
                       <a:off x="0" y="0"/>
-                      <a:ext cx="2926080" cy="4684611"/>
+                      <a:ext cx="1142296" cy="1828800"/>
                     </a:xfrm>
                     <a:prstGeom prst="rect"/>
                   </pic:spPr>
@@ -1466,7 +1466,7 @@
       <w:r>
         <w:drawing>
           <wp:inline xmlns:a="http://schemas.openxmlformats.org/drawingml/2006/main" xmlns:pic="http://schemas.openxmlformats.org/drawingml/2006/picture">
-            <wp:extent cx="2926080" cy="3493008"/>
+            <wp:extent cx="1531979" cy="1828800"/>
             <wp:docPr id="28" name="Picture 28"/>
             <wp:cNvGraphicFramePr>
               <a:graphicFrameLocks noChangeAspect="1"/>
@@ -1487,7 +1487,7 @@
                   <pic:spPr>
                     <a:xfrm>
                       <a:off x="0" y="0"/>
-                      <a:ext cx="2926080" cy="3493008"/>
+                      <a:ext cx="1531979" cy="1828800"/>
                     </a:xfrm>
                     <a:prstGeom prst="rect"/>
                   </pic:spPr>
@@ -1519,7 +1519,7 @@
       <w:r>
         <w:drawing>
           <wp:inline xmlns:a="http://schemas.openxmlformats.org/drawingml/2006/main" xmlns:pic="http://schemas.openxmlformats.org/drawingml/2006/picture">
-            <wp:extent cx="2926080" cy="5806080"/>
+            <wp:extent cx="921657" cy="1828800"/>
             <wp:docPr id="29" name="Picture 29"/>
             <wp:cNvGraphicFramePr>
               <a:graphicFrameLocks noChangeAspect="1"/>
@@ -1540,7 +1540,7 @@
                   <pic:spPr>
                     <a:xfrm>
                       <a:off x="0" y="0"/>
-                      <a:ext cx="2926080" cy="5806080"/>
+                      <a:ext cx="921657" cy="1828800"/>
                     </a:xfrm>
                     <a:prstGeom prst="rect"/>
                   </pic:spPr>
@@ -1580,7 +1580,7 @@
       <w:r>
         <w:drawing>
           <wp:inline xmlns:a="http://schemas.openxmlformats.org/drawingml/2006/main" xmlns:pic="http://schemas.openxmlformats.org/drawingml/2006/picture">
-            <wp:extent cx="2926080" cy="5762402"/>
+            <wp:extent cx="928642" cy="1828800"/>
             <wp:docPr id="30" name="Picture 30"/>
             <wp:cNvGraphicFramePr>
               <a:graphicFrameLocks noChangeAspect="1"/>
@@ -1601,7 +1601,7 @@
                   <pic:spPr>
                     <a:xfrm>
                       <a:off x="0" y="0"/>
-                      <a:ext cx="2926080" cy="5762402"/>
+                      <a:ext cx="928642" cy="1828800"/>
                     </a:xfrm>
                     <a:prstGeom prst="rect"/>
                   </pic:spPr>
@@ -1633,7 +1633,7 @@
       <w:r>
         <w:drawing>
           <wp:inline xmlns:a="http://schemas.openxmlformats.org/drawingml/2006/main" xmlns:pic="http://schemas.openxmlformats.org/drawingml/2006/picture">
-            <wp:extent cx="2926080" cy="4334256"/>
+            <wp:extent cx="1234632" cy="1828799"/>
             <wp:docPr id="31" name="Picture 31"/>
             <wp:cNvGraphicFramePr>
               <a:graphicFrameLocks noChangeAspect="1"/>
@@ -1654,7 +1654,7 @@
                   <pic:spPr>
                     <a:xfrm>
                       <a:off x="0" y="0"/>
-                      <a:ext cx="2926080" cy="4334256"/>
+                      <a:ext cx="1234632" cy="1828799"/>
                     </a:xfrm>
                     <a:prstGeom prst="rect"/>
                   </pic:spPr>
@@ -1686,7 +1686,7 @@
       <w:r>
         <w:drawing>
           <wp:inline xmlns:a="http://schemas.openxmlformats.org/drawingml/2006/main" xmlns:pic="http://schemas.openxmlformats.org/drawingml/2006/picture">
-            <wp:extent cx="2926080" cy="3916446"/>
+            <wp:extent cx="1366344" cy="1828800"/>
             <wp:docPr id="32" name="Picture 32"/>
             <wp:cNvGraphicFramePr>
               <a:graphicFrameLocks noChangeAspect="1"/>
@@ -1707,7 +1707,7 @@
                   <pic:spPr>
                     <a:xfrm>
                       <a:off x="0" y="0"/>
-                      <a:ext cx="2926080" cy="3916446"/>
+                      <a:ext cx="1366344" cy="1828800"/>
                     </a:xfrm>
                     <a:prstGeom prst="rect"/>
                   </pic:spPr>
@@ -1739,7 +1739,7 @@
       <w:r>
         <w:drawing>
           <wp:inline xmlns:a="http://schemas.openxmlformats.org/drawingml/2006/main" xmlns:pic="http://schemas.openxmlformats.org/drawingml/2006/picture">
-            <wp:extent cx="2926080" cy="1627842"/>
+            <wp:extent cx="2377440" cy="1322621"/>
             <wp:docPr id="33" name="Picture 33"/>
             <wp:cNvGraphicFramePr>
               <a:graphicFrameLocks noChangeAspect="1"/>
@@ -1760,7 +1760,7 @@
                   <pic:spPr>
                     <a:xfrm>
                       <a:off x="0" y="0"/>
-                      <a:ext cx="2926080" cy="1627842"/>
+                      <a:ext cx="2377440" cy="1322621"/>
                     </a:xfrm>
                     <a:prstGeom prst="rect"/>
                   </pic:spPr>
@@ -1792,7 +1792,7 @@
       <w:r>
         <w:drawing>
           <wp:inline xmlns:a="http://schemas.openxmlformats.org/drawingml/2006/main" xmlns:pic="http://schemas.openxmlformats.org/drawingml/2006/picture">
-            <wp:extent cx="2926080" cy="2223360"/>
+            <wp:extent cx="2377440" cy="1806480"/>
             <wp:docPr id="34" name="Picture 34"/>
             <wp:cNvGraphicFramePr>
               <a:graphicFrameLocks noChangeAspect="1"/>
@@ -1813,7 +1813,7 @@
                   <pic:spPr>
                     <a:xfrm>
                       <a:off x="0" y="0"/>
-                      <a:ext cx="2926080" cy="2223360"/>
+                      <a:ext cx="2377440" cy="1806480"/>
                     </a:xfrm>
                     <a:prstGeom prst="rect"/>
                   </pic:spPr>
@@ -1845,7 +1845,7 @@
       <w:r>
         <w:drawing>
           <wp:inline xmlns:a="http://schemas.openxmlformats.org/drawingml/2006/main" xmlns:pic="http://schemas.openxmlformats.org/drawingml/2006/picture">
-            <wp:extent cx="2926080" cy="4323365"/>
+            <wp:extent cx="1237742" cy="1828800"/>
             <wp:docPr id="35" name="Picture 35"/>
             <wp:cNvGraphicFramePr>
               <a:graphicFrameLocks noChangeAspect="1"/>
@@ -1866,7 +1866,7 @@
                   <pic:spPr>
                     <a:xfrm>
                       <a:off x="0" y="0"/>
-                      <a:ext cx="2926080" cy="4323365"/>
+                      <a:ext cx="1237742" cy="1828800"/>
                     </a:xfrm>
                     <a:prstGeom prst="rect"/>
                   </pic:spPr>
@@ -1898,7 +1898,7 @@
       <w:r>
         <w:drawing>
           <wp:inline xmlns:a="http://schemas.openxmlformats.org/drawingml/2006/main" xmlns:pic="http://schemas.openxmlformats.org/drawingml/2006/picture">
-            <wp:extent cx="2926080" cy="4214115"/>
+            <wp:extent cx="1269831" cy="1828800"/>
             <wp:docPr id="36" name="Picture 36"/>
             <wp:cNvGraphicFramePr>
               <a:graphicFrameLocks noChangeAspect="1"/>
@@ -1919,7 +1919,7 @@
                   <pic:spPr>
                     <a:xfrm>
                       <a:off x="0" y="0"/>
-                      <a:ext cx="2926080" cy="4214115"/>
+                      <a:ext cx="1269831" cy="1828800"/>
                     </a:xfrm>
                     <a:prstGeom prst="rect"/>
                   </pic:spPr>
@@ -1951,7 +1951,7 @@
       <w:r>
         <w:drawing>
           <wp:inline xmlns:a="http://schemas.openxmlformats.org/drawingml/2006/main" xmlns:pic="http://schemas.openxmlformats.org/drawingml/2006/picture">
-            <wp:extent cx="2926080" cy="3672329"/>
+            <wp:extent cx="1457172" cy="1828799"/>
             <wp:docPr id="37" name="Picture 37"/>
             <wp:cNvGraphicFramePr>
               <a:graphicFrameLocks noChangeAspect="1"/>
@@ -1972,7 +1972,7 @@
                   <pic:spPr>
                     <a:xfrm>
                       <a:off x="0" y="0"/>
-                      <a:ext cx="2926080" cy="3672329"/>
+                      <a:ext cx="1457172" cy="1828799"/>
                     </a:xfrm>
                     <a:prstGeom prst="rect"/>
                   </pic:spPr>
@@ -2004,7 +2004,7 @@
       <w:r>
         <w:drawing>
           <wp:inline xmlns:a="http://schemas.openxmlformats.org/drawingml/2006/main" xmlns:pic="http://schemas.openxmlformats.org/drawingml/2006/picture">
-            <wp:extent cx="2926080" cy="5831259"/>
+            <wp:extent cx="917677" cy="1828800"/>
             <wp:docPr id="38" name="Picture 38"/>
             <wp:cNvGraphicFramePr>
               <a:graphicFrameLocks noChangeAspect="1"/>
@@ -2025,7 +2025,7 @@
                   <pic:spPr>
                     <a:xfrm>
                       <a:off x="0" y="0"/>
-                      <a:ext cx="2926080" cy="5831259"/>
+                      <a:ext cx="917677" cy="1828800"/>
                     </a:xfrm>
                     <a:prstGeom prst="rect"/>
                   </pic:spPr>
@@ -2057,7 +2057,7 @@
       <w:r>
         <w:drawing>
           <wp:inline xmlns:a="http://schemas.openxmlformats.org/drawingml/2006/main" xmlns:pic="http://schemas.openxmlformats.org/drawingml/2006/picture">
-            <wp:extent cx="2926080" cy="4976088"/>
+            <wp:extent cx="1075385" cy="1828800"/>
             <wp:docPr id="39" name="Picture 39"/>
             <wp:cNvGraphicFramePr>
               <a:graphicFrameLocks noChangeAspect="1"/>
@@ -2078,7 +2078,7 @@
                   <pic:spPr>
                     <a:xfrm>
                       <a:off x="0" y="0"/>
-                      <a:ext cx="2926080" cy="4976088"/>
+                      <a:ext cx="1075385" cy="1828800"/>
                     </a:xfrm>
                     <a:prstGeom prst="rect"/>
                   </pic:spPr>
@@ -2110,7 +2110,7 @@
       <w:r>
         <w:drawing>
           <wp:inline xmlns:a="http://schemas.openxmlformats.org/drawingml/2006/main" xmlns:pic="http://schemas.openxmlformats.org/drawingml/2006/picture">
-            <wp:extent cx="2926080" cy="4053560"/>
+            <wp:extent cx="1320127" cy="1828800"/>
             <wp:docPr id="40" name="Picture 40"/>
             <wp:cNvGraphicFramePr>
               <a:graphicFrameLocks noChangeAspect="1"/>
@@ -2131,7 +2131,7 @@
                   <pic:spPr>
                     <a:xfrm>
                       <a:off x="0" y="0"/>
-                      <a:ext cx="2926080" cy="4053560"/>
+                      <a:ext cx="1320127" cy="1828800"/>
                     </a:xfrm>
                     <a:prstGeom prst="rect"/>
                   </pic:spPr>
@@ -2163,7 +2163,7 @@
       <w:r>
         <w:drawing>
           <wp:inline xmlns:a="http://schemas.openxmlformats.org/drawingml/2006/main" xmlns:pic="http://schemas.openxmlformats.org/drawingml/2006/picture">
-            <wp:extent cx="2926080" cy="4885509"/>
+            <wp:extent cx="1095324" cy="1828799"/>
             <wp:docPr id="41" name="Picture 41"/>
             <wp:cNvGraphicFramePr>
               <a:graphicFrameLocks noChangeAspect="1"/>
@@ -2184,7 +2184,7 @@
                   <pic:spPr>
                     <a:xfrm>
                       <a:off x="0" y="0"/>
-                      <a:ext cx="2926080" cy="4885509"/>
+                      <a:ext cx="1095324" cy="1828799"/>
                     </a:xfrm>
                     <a:prstGeom prst="rect"/>
                   </pic:spPr>
@@ -2216,7 +2216,7 @@
       <w:r>
         <w:drawing>
           <wp:inline xmlns:a="http://schemas.openxmlformats.org/drawingml/2006/main" xmlns:pic="http://schemas.openxmlformats.org/drawingml/2006/picture">
-            <wp:extent cx="2926080" cy="4750364"/>
+            <wp:extent cx="1126485" cy="1828800"/>
             <wp:docPr id="42" name="Picture 42"/>
             <wp:cNvGraphicFramePr>
               <a:graphicFrameLocks noChangeAspect="1"/>
@@ -2237,7 +2237,7 @@
                   <pic:spPr>
                     <a:xfrm>
                       <a:off x="0" y="0"/>
-                      <a:ext cx="2926080" cy="4750364"/>
+                      <a:ext cx="1126485" cy="1828800"/>
                     </a:xfrm>
                     <a:prstGeom prst="rect"/>
                   </pic:spPr>
@@ -2269,7 +2269,7 @@
       <w:r>
         <w:drawing>
           <wp:inline xmlns:a="http://schemas.openxmlformats.org/drawingml/2006/main" xmlns:pic="http://schemas.openxmlformats.org/drawingml/2006/picture">
-            <wp:extent cx="2926080" cy="6000584"/>
+            <wp:extent cx="891782" cy="1828800"/>
             <wp:docPr id="43" name="Picture 43"/>
             <wp:cNvGraphicFramePr>
               <a:graphicFrameLocks noChangeAspect="1"/>
@@ -2290,7 +2290,7 @@
                   <pic:spPr>
                     <a:xfrm>
                       <a:off x="0" y="0"/>
-                      <a:ext cx="2926080" cy="6000584"/>
+                      <a:ext cx="891782" cy="1828800"/>
                     </a:xfrm>
                     <a:prstGeom prst="rect"/>
                   </pic:spPr>
@@ -2322,7 +2322,7 @@
       <w:r>
         <w:drawing>
           <wp:inline xmlns:a="http://schemas.openxmlformats.org/drawingml/2006/main" xmlns:pic="http://schemas.openxmlformats.org/drawingml/2006/picture">
-            <wp:extent cx="2926080" cy="3981882"/>
+            <wp:extent cx="1343890" cy="1828800"/>
             <wp:docPr id="44" name="Picture 44"/>
             <wp:cNvGraphicFramePr>
               <a:graphicFrameLocks noChangeAspect="1"/>
@@ -2343,7 +2343,7 @@
                   <pic:spPr>
                     <a:xfrm>
                       <a:off x="0" y="0"/>
-                      <a:ext cx="2926080" cy="3981882"/>
+                      <a:ext cx="1343890" cy="1828800"/>
                     </a:xfrm>
                     <a:prstGeom prst="rect"/>
                   </pic:spPr>
@@ -2375,7 +2375,7 @@
       <w:r>
         <w:drawing>
           <wp:inline xmlns:a="http://schemas.openxmlformats.org/drawingml/2006/main" xmlns:pic="http://schemas.openxmlformats.org/drawingml/2006/picture">
-            <wp:extent cx="2926080" cy="3345628"/>
+            <wp:extent cx="1599464" cy="1828800"/>
             <wp:docPr id="45" name="Picture 45"/>
             <wp:cNvGraphicFramePr>
               <a:graphicFrameLocks noChangeAspect="1"/>
@@ -2396,7 +2396,7 @@
                   <pic:spPr>
                     <a:xfrm>
                       <a:off x="0" y="0"/>
-                      <a:ext cx="2926080" cy="3345628"/>
+                      <a:ext cx="1599464" cy="1828800"/>
                     </a:xfrm>
                     <a:prstGeom prst="rect"/>
                   </pic:spPr>
@@ -2428,7 +2428,7 @@
       <w:r>
         <w:drawing>
           <wp:inline xmlns:a="http://schemas.openxmlformats.org/drawingml/2006/main" xmlns:pic="http://schemas.openxmlformats.org/drawingml/2006/picture">
-            <wp:extent cx="2926080" cy="3090041"/>
+            <wp:extent cx="1731761" cy="1828800"/>
             <wp:docPr id="46" name="Picture 46"/>
             <wp:cNvGraphicFramePr>
               <a:graphicFrameLocks noChangeAspect="1"/>
@@ -2449,7 +2449,7 @@
                   <pic:spPr>
                     <a:xfrm>
                       <a:off x="0" y="0"/>
-                      <a:ext cx="2926080" cy="3090041"/>
+                      <a:ext cx="1731761" cy="1828800"/>
                     </a:xfrm>
                     <a:prstGeom prst="rect"/>
                   </pic:spPr>
@@ -2481,7 +2481,7 @@
       <w:r>
         <w:drawing>
           <wp:inline xmlns:a="http://schemas.openxmlformats.org/drawingml/2006/main" xmlns:pic="http://schemas.openxmlformats.org/drawingml/2006/picture">
-            <wp:extent cx="2926080" cy="3045783"/>
+            <wp:extent cx="1756925" cy="1828800"/>
             <wp:docPr id="47" name="Picture 47"/>
             <wp:cNvGraphicFramePr>
               <a:graphicFrameLocks noChangeAspect="1"/>
@@ -2502,7 +2502,7 @@
                   <pic:spPr>
                     <a:xfrm>
                       <a:off x="0" y="0"/>
-                      <a:ext cx="2926080" cy="3045783"/>
+                      <a:ext cx="1756925" cy="1828800"/>
                     </a:xfrm>
                     <a:prstGeom prst="rect"/>
                   </pic:spPr>
@@ -2534,7 +2534,7 @@
       <w:r>
         <w:drawing>
           <wp:inline xmlns:a="http://schemas.openxmlformats.org/drawingml/2006/main" xmlns:pic="http://schemas.openxmlformats.org/drawingml/2006/picture">
-            <wp:extent cx="2926080" cy="6251171"/>
+            <wp:extent cx="856034" cy="1828800"/>
             <wp:docPr id="48" name="Picture 48"/>
             <wp:cNvGraphicFramePr>
               <a:graphicFrameLocks noChangeAspect="1"/>
@@ -2555,7 +2555,7 @@
                   <pic:spPr>
                     <a:xfrm>
                       <a:off x="0" y="0"/>
-                      <a:ext cx="2926080" cy="6251171"/>
+                      <a:ext cx="856034" cy="1828800"/>
                     </a:xfrm>
                     <a:prstGeom prst="rect"/>
                   </pic:spPr>
@@ -2587,7 +2587,7 @@
       <w:r>
         <w:drawing>
           <wp:inline xmlns:a="http://schemas.openxmlformats.org/drawingml/2006/main" xmlns:pic="http://schemas.openxmlformats.org/drawingml/2006/picture">
-            <wp:extent cx="2926080" cy="5917184"/>
+            <wp:extent cx="904351" cy="1828800"/>
             <wp:docPr id="49" name="Picture 49"/>
             <wp:cNvGraphicFramePr>
               <a:graphicFrameLocks noChangeAspect="1"/>
@@ -2608,7 +2608,7 @@
                   <pic:spPr>
                     <a:xfrm>
                       <a:off x="0" y="0"/>
-                      <a:ext cx="2926080" cy="5917184"/>
+                      <a:ext cx="904351" cy="1828800"/>
                     </a:xfrm>
                     <a:prstGeom prst="rect"/>
                   </pic:spPr>
@@ -2640,7 +2640,7 @@
       <w:r>
         <w:drawing>
           <wp:inline xmlns:a="http://schemas.openxmlformats.org/drawingml/2006/main" xmlns:pic="http://schemas.openxmlformats.org/drawingml/2006/picture">
-            <wp:extent cx="2926080" cy="4616009"/>
+            <wp:extent cx="1159273" cy="1828800"/>
             <wp:docPr id="50" name="Picture 50"/>
             <wp:cNvGraphicFramePr>
               <a:graphicFrameLocks noChangeAspect="1"/>
@@ -2661,7 +2661,7 @@
                   <pic:spPr>
                     <a:xfrm>
                       <a:off x="0" y="0"/>
-                      <a:ext cx="2926080" cy="4616009"/>
+                      <a:ext cx="1159273" cy="1828800"/>
                     </a:xfrm>
                     <a:prstGeom prst="rect"/>
                   </pic:spPr>
@@ -2693,7 +2693,7 @@
       <w:r>
         <w:drawing>
           <wp:inline xmlns:a="http://schemas.openxmlformats.org/drawingml/2006/main" xmlns:pic="http://schemas.openxmlformats.org/drawingml/2006/picture">
-            <wp:extent cx="2926080" cy="4541020"/>
+            <wp:extent cx="1178416" cy="1828800"/>
             <wp:docPr id="51" name="Picture 51"/>
             <wp:cNvGraphicFramePr>
               <a:graphicFrameLocks noChangeAspect="1"/>
@@ -2714,7 +2714,7 @@
                   <pic:spPr>
                     <a:xfrm>
                       <a:off x="0" y="0"/>
-                      <a:ext cx="2926080" cy="4541020"/>
+                      <a:ext cx="1178416" cy="1828800"/>
                     </a:xfrm>
                     <a:prstGeom prst="rect"/>
                   </pic:spPr>
@@ -2746,7 +2746,7 @@
       <w:r>
         <w:drawing>
           <wp:inline xmlns:a="http://schemas.openxmlformats.org/drawingml/2006/main" xmlns:pic="http://schemas.openxmlformats.org/drawingml/2006/picture">
-            <wp:extent cx="2926080" cy="5078321"/>
+            <wp:extent cx="1053737" cy="1828800"/>
             <wp:docPr id="52" name="Picture 52"/>
             <wp:cNvGraphicFramePr>
               <a:graphicFrameLocks noChangeAspect="1"/>
@@ -2767,7 +2767,7 @@
                   <pic:spPr>
                     <a:xfrm>
                       <a:off x="0" y="0"/>
-                      <a:ext cx="2926080" cy="5078321"/>
+                      <a:ext cx="1053737" cy="1828800"/>
                     </a:xfrm>
                     <a:prstGeom prst="rect"/>
                   </pic:spPr>
@@ -2799,7 +2799,7 @@
       <w:r>
         <w:drawing>
           <wp:inline xmlns:a="http://schemas.openxmlformats.org/drawingml/2006/main" xmlns:pic="http://schemas.openxmlformats.org/drawingml/2006/picture">
-            <wp:extent cx="2926080" cy="4816778"/>
+            <wp:extent cx="1110953" cy="1828799"/>
             <wp:docPr id="53" name="Picture 53"/>
             <wp:cNvGraphicFramePr>
               <a:graphicFrameLocks noChangeAspect="1"/>
@@ -2820,7 +2820,7 @@
                   <pic:spPr>
                     <a:xfrm>
                       <a:off x="0" y="0"/>
-                      <a:ext cx="2926080" cy="4816778"/>
+                      <a:ext cx="1110953" cy="1828799"/>
                     </a:xfrm>
                     <a:prstGeom prst="rect"/>
                   </pic:spPr>
@@ -2852,7 +2852,7 @@
       <w:r>
         <w:drawing>
           <wp:inline xmlns:a="http://schemas.openxmlformats.org/drawingml/2006/main" xmlns:pic="http://schemas.openxmlformats.org/drawingml/2006/picture">
-            <wp:extent cx="2926080" cy="4028987"/>
+            <wp:extent cx="1328178" cy="1828800"/>
             <wp:docPr id="54" name="Picture 54"/>
             <wp:cNvGraphicFramePr>
               <a:graphicFrameLocks noChangeAspect="1"/>
@@ -2873,7 +2873,7 @@
                   <pic:spPr>
                     <a:xfrm>
                       <a:off x="0" y="0"/>
-                      <a:ext cx="2926080" cy="4028987"/>
+                      <a:ext cx="1328178" cy="1828800"/>
                     </a:xfrm>
                     <a:prstGeom prst="rect"/>
                   </pic:spPr>
@@ -2905,7 +2905,7 @@
       <w:r>
         <w:drawing>
           <wp:inline xmlns:a="http://schemas.openxmlformats.org/drawingml/2006/main" xmlns:pic="http://schemas.openxmlformats.org/drawingml/2006/picture">
-            <wp:extent cx="2926080" cy="3767829"/>
+            <wp:extent cx="1420238" cy="1828800"/>
             <wp:docPr id="55" name="Picture 55"/>
             <wp:cNvGraphicFramePr>
               <a:graphicFrameLocks noChangeAspect="1"/>
@@ -2926,7 +2926,7 @@
                   <pic:spPr>
                     <a:xfrm>
                       <a:off x="0" y="0"/>
-                      <a:ext cx="2926080" cy="3767829"/>
+                      <a:ext cx="1420238" cy="1828800"/>
                     </a:xfrm>
                     <a:prstGeom prst="rect"/>
                   </pic:spPr>
@@ -2958,7 +2958,7 @@
       <w:r>
         <w:drawing>
           <wp:inline xmlns:a="http://schemas.openxmlformats.org/drawingml/2006/main" xmlns:pic="http://schemas.openxmlformats.org/drawingml/2006/picture">
-            <wp:extent cx="2926080" cy="3530040"/>
+            <wp:extent cx="1515907" cy="1828800"/>
             <wp:docPr id="56" name="Picture 56"/>
             <wp:cNvGraphicFramePr>
               <a:graphicFrameLocks noChangeAspect="1"/>
@@ -2979,7 +2979,7 @@
                   <pic:spPr>
                     <a:xfrm>
                       <a:off x="0" y="0"/>
-                      <a:ext cx="2926080" cy="3530040"/>
+                      <a:ext cx="1515907" cy="1828800"/>
                     </a:xfrm>
                     <a:prstGeom prst="rect"/>
                   </pic:spPr>
@@ -3011,7 +3011,7 @@
       <w:r>
         <w:drawing>
           <wp:inline xmlns:a="http://schemas.openxmlformats.org/drawingml/2006/main" xmlns:pic="http://schemas.openxmlformats.org/drawingml/2006/picture">
-            <wp:extent cx="2926080" cy="2476592"/>
+            <wp:extent cx="2160717" cy="1828800"/>
             <wp:docPr id="57" name="Picture 57"/>
             <wp:cNvGraphicFramePr>
               <a:graphicFrameLocks noChangeAspect="1"/>
@@ -3032,7 +3032,7 @@
                   <pic:spPr>
                     <a:xfrm>
                       <a:off x="0" y="0"/>
-                      <a:ext cx="2926080" cy="2476592"/>
+                      <a:ext cx="2160717" cy="1828800"/>
                     </a:xfrm>
                     <a:prstGeom prst="rect"/>
                   </pic:spPr>
@@ -3064,7 +3064,7 @@
       <w:r>
         <w:drawing>
           <wp:inline xmlns:a="http://schemas.openxmlformats.org/drawingml/2006/main" xmlns:pic="http://schemas.openxmlformats.org/drawingml/2006/picture">
-            <wp:extent cx="2926080" cy="4241834"/>
+            <wp:extent cx="1261533" cy="1828800"/>
             <wp:docPr id="58" name="Picture 58"/>
             <wp:cNvGraphicFramePr>
               <a:graphicFrameLocks noChangeAspect="1"/>
@@ -3085,7 +3085,7 @@
                   <pic:spPr>
                     <a:xfrm>
                       <a:off x="0" y="0"/>
-                      <a:ext cx="2926080" cy="4241834"/>
+                      <a:ext cx="1261533" cy="1828800"/>
                     </a:xfrm>
                     <a:prstGeom prst="rect"/>
                   </pic:spPr>

</xml_diff>

<commit_message>
POV kit: add 4 new cat videos (C30-C43), per-video green key, watermark-proof cut-outs, scene/time/clip table
</commit_message>
<xml_diff>
--- a/pov-meme-kit/CLIP_CATALOG.docx
+++ b/pov-meme-kit/CLIP_CATALOG.docx
@@ -35,7 +35,7 @@
       <w:r>
         <w:drawing>
           <wp:inline xmlns:a="http://schemas.openxmlformats.org/drawingml/2006/main" xmlns:pic="http://schemas.openxmlformats.org/drawingml/2006/picture">
-            <wp:extent cx="1244990" cy="1828800"/>
+            <wp:extent cx="1235675" cy="1828800"/>
             <wp:docPr id="1" name="Picture 1"/>
             <wp:cNvGraphicFramePr>
               <a:graphicFrameLocks noChangeAspect="1"/>
@@ -56,7 +56,7 @@
                   <pic:spPr>
                     <a:xfrm>
                       <a:off x="0" y="0"/>
-                      <a:ext cx="1244990" cy="1828800"/>
+                      <a:ext cx="1235675" cy="1828800"/>
                     </a:xfrm>
                     <a:prstGeom prst="rect"/>
                   </pic:spPr>
@@ -71,7 +71,7 @@
       <w:r>
         <w:t>Good for: shock, confusion, 'huh?'</w:t>
         <w:br/>
-        <w:t>Time in cat_pack.mp4: 0.00–6.73 s (6.7 s)</w:t>
+        <w:t>File: cat_pack.mp4, 0.00–6.73 s (6.7 s)</w:t>
         <w:br/>
         <w:t>Sound: low voice ~124 Hz (human or bark - check)</w:t>
       </w:r>
@@ -88,7 +88,7 @@
       <w:r>
         <w:drawing>
           <wp:inline xmlns:a="http://schemas.openxmlformats.org/drawingml/2006/main" xmlns:pic="http://schemas.openxmlformats.org/drawingml/2006/picture">
-            <wp:extent cx="1107903" cy="1828800"/>
+            <wp:extent cx="1112520" cy="1828800"/>
             <wp:docPr id="2" name="Picture 2"/>
             <wp:cNvGraphicFramePr>
               <a:graphicFrameLocks noChangeAspect="1"/>
@@ -109,7 +109,7 @@
                   <pic:spPr>
                     <a:xfrm>
                       <a:off x="0" y="0"/>
-                      <a:ext cx="1107903" cy="1828800"/>
+                      <a:ext cx="1112520" cy="1828800"/>
                     </a:xfrm>
                     <a:prstGeom prst="rect"/>
                   </pic:spPr>
@@ -124,7 +124,7 @@
       <w:r>
         <w:t>Good for: hoping, waiting, wishing</w:t>
         <w:br/>
-        <w:t>Time in cat_pack.mp4: 6.73–13.93 s (7.2 s)</w:t>
+        <w:t>File: cat_pack.mp4, 6.73–13.93 s (7.2 s)</w:t>
         <w:br/>
         <w:t>Sound: low voice ~88 Hz (human or bark - check)</w:t>
       </w:r>
@@ -141,7 +141,7 @@
       <w:r>
         <w:drawing>
           <wp:inline xmlns:a="http://schemas.openxmlformats.org/drawingml/2006/main" xmlns:pic="http://schemas.openxmlformats.org/drawingml/2006/picture">
-            <wp:extent cx="1129552" cy="1828800"/>
+            <wp:extent cx="1114594" cy="1828800"/>
             <wp:docPr id="3" name="Picture 3"/>
             <wp:cNvGraphicFramePr>
               <a:graphicFrameLocks noChangeAspect="1"/>
@@ -162,7 +162,7 @@
                   <pic:spPr>
                     <a:xfrm>
                       <a:off x="0" y="0"/>
-                      <a:ext cx="1129552" cy="1828800"/>
+                      <a:ext cx="1114594" cy="1828800"/>
                     </a:xfrm>
                     <a:prstGeom prst="rect"/>
                   </pic:spPr>
@@ -177,7 +177,7 @@
       <w:r>
         <w:t>Good for: calling out, asking</w:t>
         <w:br/>
-        <w:t>Time in cat_pack.mp4: 13.93–19.83 s (5.9 s)</w:t>
+        <w:t>File: cat_pack.mp4, 13.93–19.83 s (5.9 s)</w:t>
         <w:br/>
         <w:t>Sound: animal sound (~500 Hz)</w:t>
       </w:r>
@@ -194,7 +194,7 @@
       <w:r>
         <w:drawing>
           <wp:inline xmlns:a="http://schemas.openxmlformats.org/drawingml/2006/main" xmlns:pic="http://schemas.openxmlformats.org/drawingml/2006/picture">
-            <wp:extent cx="932098" cy="1828800"/>
+            <wp:extent cx="920337" cy="1828800"/>
             <wp:docPr id="4" name="Picture 4"/>
             <wp:cNvGraphicFramePr>
               <a:graphicFrameLocks noChangeAspect="1"/>
@@ -215,7 +215,7 @@
                   <pic:spPr>
                     <a:xfrm>
                       <a:off x="0" y="0"/>
-                      <a:ext cx="932098" cy="1828800"/>
+                      <a:ext cx="920337" cy="1828800"/>
                     </a:xfrm>
                     <a:prstGeom prst="rect"/>
                   </pic:spPr>
@@ -230,7 +230,7 @@
       <w:r>
         <w:t>Good for: demanding, complaining, kid asking</w:t>
         <w:br/>
-        <w:t>Time in cat_pack.mp4: 19.83–24.67 s (4.8 s)</w:t>
+        <w:t>File: cat_pack.mp4, 19.83–24.67 s (4.8 s)</w:t>
         <w:br/>
         <w:t>Sound: animal sound (~1067 Hz)</w:t>
       </w:r>
@@ -283,7 +283,7 @@
       <w:r>
         <w:t>Good for: pleading, arguing</w:t>
         <w:br/>
-        <w:t>Time in cat_pack.mp4: 24.67–28.53 s (3.9 s)</w:t>
+        <w:t>File: cat_pack.mp4, 24.67–28.53 s (3.9 s)</w:t>
         <w:br/>
         <w:t>Sound: animal sound (~1067 Hz)</w:t>
       </w:r>
@@ -300,7 +300,7 @@
       <w:r>
         <w:drawing>
           <wp:inline xmlns:a="http://schemas.openxmlformats.org/drawingml/2006/main" xmlns:pic="http://schemas.openxmlformats.org/drawingml/2006/picture">
-            <wp:extent cx="1072260" cy="1828800"/>
+            <wp:extent cx="1066303" cy="1828800"/>
             <wp:docPr id="6" name="Picture 6"/>
             <wp:cNvGraphicFramePr>
               <a:graphicFrameLocks noChangeAspect="1"/>
@@ -321,7 +321,7 @@
                   <pic:spPr>
                     <a:xfrm>
                       <a:off x="0" y="0"/>
-                      <a:ext cx="1072260" cy="1828800"/>
+                      <a:ext cx="1066303" cy="1828800"/>
                     </a:xfrm>
                     <a:prstGeom prst="rect"/>
                   </pic:spPr>
@@ -336,7 +336,7 @@
       <w:r>
         <w:t>Good for: innocent child, curious, worried (audio: a woman laughing then talking - user flagged)</w:t>
         <w:br/>
-        <w:t>Time in cat_pack.mp4: 28.53–38.37 s (9.8 s)</w:t>
+        <w:t>File: cat_pack.mp4, 28.53–38.37 s (9.8 s)</w:t>
         <w:br/>
         <w:t>Sound: low voice ~258 Hz (human or bark - check)</w:t>
       </w:r>
@@ -353,7 +353,7 @@
       <w:r>
         <w:drawing>
           <wp:inline xmlns:a="http://schemas.openxmlformats.org/drawingml/2006/main" xmlns:pic="http://schemas.openxmlformats.org/drawingml/2006/picture">
-            <wp:extent cx="1135310" cy="1828800"/>
+            <wp:extent cx="1133182" cy="1828800"/>
             <wp:docPr id="7" name="Picture 7"/>
             <wp:cNvGraphicFramePr>
               <a:graphicFrameLocks noChangeAspect="1"/>
@@ -374,7 +374,7 @@
                   <pic:spPr>
                     <a:xfrm>
                       <a:off x="0" y="0"/>
-                      <a:ext cx="1135310" cy="1828800"/>
+                      <a:ext cx="1133182" cy="1828800"/>
                     </a:xfrm>
                     <a:prstGeom prst="rect"/>
                   </pic:spPr>
@@ -389,7 +389,7 @@
       <w:r>
         <w:t>Good for: sad, tired, guilty, quiet sacrifice</w:t>
         <w:br/>
-        <w:t>Time in cat_pack.mp4: 38.37–43.67 s (5.3 s)</w:t>
+        <w:t>File: cat_pack.mp4, 38.37–43.67 s (5.3 s)</w:t>
         <w:br/>
         <w:t>Sound: animal sound (~421 Hz)</w:t>
       </w:r>
@@ -406,7 +406,7 @@
       <w:r>
         <w:drawing>
           <wp:inline xmlns:a="http://schemas.openxmlformats.org/drawingml/2006/main" xmlns:pic="http://schemas.openxmlformats.org/drawingml/2006/picture">
-            <wp:extent cx="885825" cy="1828800"/>
+            <wp:extent cx="874955" cy="1828800"/>
             <wp:docPr id="8" name="Picture 8"/>
             <wp:cNvGraphicFramePr>
               <a:graphicFrameLocks noChangeAspect="1"/>
@@ -427,7 +427,7 @@
                   <pic:spPr>
                     <a:xfrm>
                       <a:off x="0" y="0"/>
-                      <a:ext cx="885825" cy="1828800"/>
+                      <a:ext cx="874955" cy="1828800"/>
                     </a:xfrm>
                     <a:prstGeom prst="rect"/>
                   </pic:spPr>
@@ -442,7 +442,7 @@
       <w:r>
         <w:t>Good for: polite, begging, cute request</w:t>
         <w:br/>
-        <w:t>Time in cat_pack.mp4: 43.67–53.87 s (10.2 s)</w:t>
+        <w:t>File: cat_pack.mp4, 43.67–53.87 s (10.2 s)</w:t>
         <w:br/>
         <w:t>Sound: animal sound (~1231 Hz)</w:t>
       </w:r>
@@ -459,7 +459,7 @@
       <w:r>
         <w:drawing>
           <wp:inline xmlns:a="http://schemas.openxmlformats.org/drawingml/2006/main" xmlns:pic="http://schemas.openxmlformats.org/drawingml/2006/picture">
-            <wp:extent cx="1195526" cy="1828800"/>
+            <wp:extent cx="1199407" cy="1828800"/>
             <wp:docPr id="9" name="Picture 9"/>
             <wp:cNvGraphicFramePr>
               <a:graphicFrameLocks noChangeAspect="1"/>
@@ -480,7 +480,7 @@
                   <pic:spPr>
                     <a:xfrm>
                       <a:off x="0" y="0"/>
-                      <a:ext cx="1195526" cy="1828800"/>
+                      <a:ext cx="1199407" cy="1828800"/>
                     </a:xfrm>
                     <a:prstGeom prst="rect"/>
                   </pic:spPr>
@@ -495,7 +495,7 @@
       <w:r>
         <w:t>Good for: angry, yelling, fighting</w:t>
         <w:br/>
-        <w:t>Time in cat_pack.mp4: 53.87–58.87 s (5.0 s)</w:t>
+        <w:t>File: cat_pack.mp4, 53.87–58.87 s (5.0 s)</w:t>
         <w:br/>
         <w:t>Sound: low voice ~260 Hz (human or bark - check)</w:t>
       </w:r>
@@ -512,7 +512,7 @@
       <w:r>
         <w:drawing>
           <wp:inline xmlns:a="http://schemas.openxmlformats.org/drawingml/2006/main" xmlns:pic="http://schemas.openxmlformats.org/drawingml/2006/picture">
-            <wp:extent cx="2307101" cy="1828800"/>
+            <wp:extent cx="2317897" cy="1828800"/>
             <wp:docPr id="10" name="Picture 10"/>
             <wp:cNvGraphicFramePr>
               <a:graphicFrameLocks noChangeAspect="1"/>
@@ -533,7 +533,7 @@
                   <pic:spPr>
                     <a:xfrm>
                       <a:off x="0" y="0"/>
-                      <a:ext cx="2307101" cy="1828800"/>
+                      <a:ext cx="2317897" cy="1828800"/>
                     </a:xfrm>
                     <a:prstGeom prst="rect"/>
                   </pic:spPr>
@@ -548,7 +548,7 @@
       <w:r>
         <w:t>Good for: baby, newborn, fragile</w:t>
         <w:br/>
-        <w:t>Time in cat_pack.mp4: 58.87–63.73 s (4.9 s)</w:t>
+        <w:t>File: cat_pack.mp4, 58.87–63.73 s (4.9 s)</w:t>
         <w:br/>
         <w:t>Sound: animal sound (~464 Hz)</w:t>
       </w:r>
@@ -565,7 +565,7 @@
       <w:r>
         <w:drawing>
           <wp:inline xmlns:a="http://schemas.openxmlformats.org/drawingml/2006/main" xmlns:pic="http://schemas.openxmlformats.org/drawingml/2006/picture">
-            <wp:extent cx="1714500" cy="1828800"/>
+            <wp:extent cx="1707776" cy="1828800"/>
             <wp:docPr id="11" name="Picture 11"/>
             <wp:cNvGraphicFramePr>
               <a:graphicFrameLocks noChangeAspect="1"/>
@@ -586,7 +586,7 @@
                   <pic:spPr>
                     <a:xfrm>
                       <a:off x="0" y="0"/>
-                      <a:ext cx="1714500" cy="1828800"/>
+                      <a:ext cx="1707776" cy="1828800"/>
                     </a:xfrm>
                     <a:prstGeom prst="rect"/>
                   </pic:spPr>
@@ -601,7 +601,7 @@
       <w:r>
         <w:t>Good for: ignoring, upset, walking away</w:t>
         <w:br/>
-        <w:t>Time in cat_pack.mp4: 63.73–70.00 s (6.3 s)</w:t>
+        <w:t>File: cat_pack.mp4, 63.73–70.00 s (6.3 s)</w:t>
         <w:br/>
         <w:t>Sound: low voice ~348 Hz (human or bark - check)</w:t>
       </w:r>
@@ -618,7 +618,7 @@
       <w:r>
         <w:drawing>
           <wp:inline xmlns:a="http://schemas.openxmlformats.org/drawingml/2006/main" xmlns:pic="http://schemas.openxmlformats.org/drawingml/2006/picture">
-            <wp:extent cx="1733797" cy="1828800"/>
+            <wp:extent cx="1744578" cy="1828800"/>
             <wp:docPr id="12" name="Picture 12"/>
             <wp:cNvGraphicFramePr>
               <a:graphicFrameLocks noChangeAspect="1"/>
@@ -639,7 +639,7 @@
                   <pic:spPr>
                     <a:xfrm>
                       <a:off x="0" y="0"/>
-                      <a:ext cx="1733797" cy="1828800"/>
+                      <a:ext cx="1744578" cy="1828800"/>
                     </a:xfrm>
                     <a:prstGeom prst="rect"/>
                   </pic:spPr>
@@ -654,7 +654,7 @@
       <w:r>
         <w:t>Good for: tiny in distance, playing</w:t>
         <w:br/>
-        <w:t>Time in cat_pack.mp4: 70.00–74.43 s (4.4 s)</w:t>
+        <w:t>File: cat_pack.mp4, 70.00–74.43 s (4.4 s)</w:t>
         <w:br/>
         <w:t>Sound: animal sound (~405 Hz)</w:t>
       </w:r>
@@ -671,7 +671,7 @@
       <w:r>
         <w:drawing>
           <wp:inline xmlns:a="http://schemas.openxmlformats.org/drawingml/2006/main" xmlns:pic="http://schemas.openxmlformats.org/drawingml/2006/picture">
-            <wp:extent cx="772160" cy="1828800"/>
+            <wp:extent cx="764122" cy="1828800"/>
             <wp:docPr id="13" name="Picture 13"/>
             <wp:cNvGraphicFramePr>
               <a:graphicFrameLocks noChangeAspect="1"/>
@@ -692,7 +692,7 @@
                   <pic:spPr>
                     <a:xfrm>
                       <a:off x="0" y="0"/>
-                      <a:ext cx="772160" cy="1828800"/>
+                      <a:ext cx="764122" cy="1828800"/>
                     </a:xfrm>
                     <a:prstGeom prst="rect"/>
                   </pic:spPr>
@@ -707,7 +707,7 @@
       <w:r>
         <w:t>Good for: spying, secretly watching, worried</w:t>
         <w:br/>
-        <w:t>Time in cat_pack.mp4: 74.43–79.37 s (4.9 s)</w:t>
+        <w:t>File: cat_pack.mp4, 74.43–79.37 s (4.9 s)</w:t>
         <w:br/>
         <w:t>Sound: animal sound (~842 Hz)</w:t>
       </w:r>
@@ -724,7 +724,7 @@
       <w:r>
         <w:drawing>
           <wp:inline xmlns:a="http://schemas.openxmlformats.org/drawingml/2006/main" xmlns:pic="http://schemas.openxmlformats.org/drawingml/2006/picture">
-            <wp:extent cx="1067366" cy="1828800"/>
+            <wp:extent cx="1061662" cy="1828800"/>
             <wp:docPr id="14" name="Picture 14"/>
             <wp:cNvGraphicFramePr>
               <a:graphicFrameLocks noChangeAspect="1"/>
@@ -745,7 +745,7 @@
                   <pic:spPr>
                     <a:xfrm>
                       <a:off x="0" y="0"/>
-                      <a:ext cx="1067366" cy="1828800"/>
+                      <a:ext cx="1061662" cy="1828800"/>
                     </a:xfrm>
                     <a:prstGeom prst="rect"/>
                   </pic:spPr>
@@ -760,7 +760,7 @@
       <w:r>
         <w:t>Good for: panicking, tantrum, crying out</w:t>
         <w:br/>
-        <w:t>Time in cat_pack.mp4: 79.37–83.17 s (3.8 s)</w:t>
+        <w:t>File: cat_pack.mp4, 79.37–83.17 s (3.8 s)</w:t>
         <w:br/>
         <w:t>Sound: animal sound (~762 Hz)</w:t>
       </w:r>
@@ -777,7 +777,7 @@
       <w:r>
         <w:drawing>
           <wp:inline xmlns:a="http://schemas.openxmlformats.org/drawingml/2006/main" xmlns:pic="http://schemas.openxmlformats.org/drawingml/2006/picture">
-            <wp:extent cx="1266092" cy="1828800"/>
+            <wp:extent cx="1251857" cy="1828800"/>
             <wp:docPr id="15" name="Picture 15"/>
             <wp:cNvGraphicFramePr>
               <a:graphicFrameLocks noChangeAspect="1"/>
@@ -798,7 +798,7 @@
                   <pic:spPr>
                     <a:xfrm>
                       <a:off x="0" y="0"/>
-                      <a:ext cx="1266092" cy="1828800"/>
+                      <a:ext cx="1251857" cy="1828800"/>
                     </a:xfrm>
                     <a:prstGeom prst="rect"/>
                   </pic:spPr>
@@ -813,7 +813,7 @@
       <w:r>
         <w:t>Good for: waiting, lonely, calm</w:t>
         <w:br/>
-        <w:t>Time in cat_pack.mp4: 83.17–92.43 s (9.3 s)</w:t>
+        <w:t>File: cat_pack.mp4, 83.17–92.43 s (9.3 s)</w:t>
         <w:br/>
         <w:t>Sound: low voice ~151 Hz (human or bark - check)</w:t>
       </w:r>
@@ -830,7 +830,7 @@
       <w:r>
         <w:drawing>
           <wp:inline xmlns:a="http://schemas.openxmlformats.org/drawingml/2006/main" xmlns:pic="http://schemas.openxmlformats.org/drawingml/2006/picture">
-            <wp:extent cx="959795" cy="1828800"/>
+            <wp:extent cx="966651" cy="1828800"/>
             <wp:docPr id="16" name="Picture 16"/>
             <wp:cNvGraphicFramePr>
               <a:graphicFrameLocks noChangeAspect="1"/>
@@ -851,7 +851,7 @@
                   <pic:spPr>
                     <a:xfrm>
                       <a:off x="0" y="0"/>
-                      <a:ext cx="959795" cy="1828800"/>
+                      <a:ext cx="966651" cy="1828800"/>
                     </a:xfrm>
                     <a:prstGeom prst="rect"/>
                   </pic:spPr>
@@ -866,7 +866,7 @@
       <w:r>
         <w:t>Good for: serious, stern, shocked silence</w:t>
         <w:br/>
-        <w:t>Time in cat_pack.mp4: 92.43–95.77 s (3.3 s)</w:t>
+        <w:t>File: cat_pack.mp4, 92.43–95.77 s (3.3 s)</w:t>
         <w:br/>
         <w:t>Sound: animal sound (~889 Hz)</w:t>
       </w:r>
@@ -883,7 +883,7 @@
       <w:r>
         <w:drawing>
           <wp:inline xmlns:a="http://schemas.openxmlformats.org/drawingml/2006/main" xmlns:pic="http://schemas.openxmlformats.org/drawingml/2006/picture">
-            <wp:extent cx="1331167" cy="1828800"/>
+            <wp:extent cx="1323227" cy="1828800"/>
             <wp:docPr id="17" name="Picture 17"/>
             <wp:cNvGraphicFramePr>
               <a:graphicFrameLocks noChangeAspect="1"/>
@@ -904,7 +904,7 @@
                   <pic:spPr>
                     <a:xfrm>
                       <a:off x="0" y="0"/>
-                      <a:ext cx="1331167" cy="1828800"/>
+                      <a:ext cx="1323227" cy="1828800"/>
                     </a:xfrm>
                     <a:prstGeom prst="rect"/>
                   </pic:spPr>
@@ -919,7 +919,7 @@
       <w:r>
         <w:t>Good for: comforting, hugging, together</w:t>
         <w:br/>
-        <w:t>Time in cat_pack.mp4: 95.77–103.87 s (8.1 s)</w:t>
+        <w:t>File: cat_pack.mp4, 95.77–103.87 s (8.1 s)</w:t>
         <w:br/>
         <w:t>Sound: silent</w:t>
       </w:r>
@@ -936,7 +936,7 @@
       <w:r>
         <w:drawing>
           <wp:inline xmlns:a="http://schemas.openxmlformats.org/drawingml/2006/main" xmlns:pic="http://schemas.openxmlformats.org/drawingml/2006/picture">
-            <wp:extent cx="1535124" cy="1828800"/>
+            <wp:extent cx="1546411" cy="1828800"/>
             <wp:docPr id="18" name="Picture 18"/>
             <wp:cNvGraphicFramePr>
               <a:graphicFrameLocks noChangeAspect="1"/>
@@ -957,7 +957,7 @@
                   <pic:spPr>
                     <a:xfrm>
                       <a:off x="0" y="0"/>
-                      <a:ext cx="1535124" cy="1828800"/>
+                      <a:ext cx="1546411" cy="1828800"/>
                     </a:xfrm>
                     <a:prstGeom prst="rect"/>
                   </pic:spPr>
@@ -972,7 +972,7 @@
       <w:r>
         <w:t>Good for: crying, heartbroken, tears of joy</w:t>
         <w:br/>
-        <w:t>Time in cat_pack.mp4: 103.87–110.70 s (6.8 s)</w:t>
+        <w:t>File: cat_pack.mp4, 103.87–110.70 s (6.8 s)</w:t>
         <w:br/>
         <w:t>Sound: animal sound (~1231 Hz)</w:t>
       </w:r>
@@ -989,7 +989,7 @@
       <w:r>
         <w:drawing>
           <wp:inline xmlns:a="http://schemas.openxmlformats.org/drawingml/2006/main" xmlns:pic="http://schemas.openxmlformats.org/drawingml/2006/picture">
-            <wp:extent cx="1018232" cy="1828800"/>
+            <wp:extent cx="1012250" cy="1828800"/>
             <wp:docPr id="19" name="Picture 19"/>
             <wp:cNvGraphicFramePr>
               <a:graphicFrameLocks noChangeAspect="1"/>
@@ -1010,7 +1010,7 @@
                   <pic:spPr>
                     <a:xfrm>
                       <a:off x="0" y="0"/>
-                      <a:ext cx="1018232" cy="1828800"/>
+                      <a:ext cx="1012250" cy="1828800"/>
                     </a:xfrm>
                     <a:prstGeom prst="rect"/>
                   </pic:spPr>
@@ -1025,7 +1025,7 @@
       <w:r>
         <w:t>Good for: happy, excited, celebrating, greeting</w:t>
         <w:br/>
-        <w:t>Time in cat_pack.mp4: 110.70–118.53 s (7.8 s)</w:t>
+        <w:t>File: cat_pack.mp4, 110.70–118.53 s (7.8 s)</w:t>
         <w:br/>
         <w:t>Sound: silent</w:t>
       </w:r>
@@ -1042,7 +1042,7 @@
       <w:r>
         <w:drawing>
           <wp:inline xmlns:a="http://schemas.openxmlformats.org/drawingml/2006/main" xmlns:pic="http://schemas.openxmlformats.org/drawingml/2006/picture">
-            <wp:extent cx="1299990" cy="1828799"/>
+            <wp:extent cx="1295708" cy="1828800"/>
             <wp:docPr id="20" name="Picture 20"/>
             <wp:cNvGraphicFramePr>
               <a:graphicFrameLocks noChangeAspect="1"/>
@@ -1063,7 +1063,7 @@
                   <pic:spPr>
                     <a:xfrm>
                       <a:off x="0" y="0"/>
-                      <a:ext cx="1299990" cy="1828799"/>
+                      <a:ext cx="1295708" cy="1828800"/>
                     </a:xfrm>
                     <a:prstGeom prst="rect"/>
                   </pic:spPr>
@@ -1078,7 +1078,7 @@
       <w:r>
         <w:t>Good for: eating, hungry, leftovers</w:t>
         <w:br/>
-        <w:t>Time in cat_pack.mp4: 118.53–124.10 s (5.6 s)</w:t>
+        <w:t>File: cat_pack.mp4, 118.53–124.10 s (5.6 s)</w:t>
         <w:br/>
         <w:t>Sound: low voice ~356 Hz (human or bark - check)</w:t>
       </w:r>
@@ -1131,7 +1131,7 @@
       <w:r>
         <w:t>Good for: driving, picking someone up</w:t>
         <w:br/>
-        <w:t>Time in cat_pack.mp4: 124.10–132.10 s (8.0 s)</w:t>
+        <w:t>File: cat_pack.mp4, 124.10–132.10 s (8.0 s)</w:t>
         <w:br/>
         <w:t>Sound: animal sound (~1231 Hz)</w:t>
       </w:r>
@@ -1148,7 +1148,7 @@
       <w:r>
         <w:drawing>
           <wp:inline xmlns:a="http://schemas.openxmlformats.org/drawingml/2006/main" xmlns:pic="http://schemas.openxmlformats.org/drawingml/2006/picture">
-            <wp:extent cx="1821425" cy="1828800"/>
+            <wp:extent cx="1828800" cy="1828800"/>
             <wp:docPr id="22" name="Picture 22"/>
             <wp:cNvGraphicFramePr>
               <a:graphicFrameLocks noChangeAspect="1"/>
@@ -1169,7 +1169,7 @@
                   <pic:spPr>
                     <a:xfrm>
                       <a:off x="0" y="0"/>
-                      <a:ext cx="1821425" cy="1828800"/>
+                      <a:ext cx="1828800" cy="1828800"/>
                     </a:xfrm>
                     <a:prstGeom prst="rect"/>
                   </pic:spPr>
@@ -1184,7 +1184,7 @@
       <w:r>
         <w:t>Good for: tired, unimpressed</w:t>
         <w:br/>
-        <w:t>Time in cat_pack.mp4: 132.10–136.97 s (4.9 s)</w:t>
+        <w:t>File: cat_pack.mp4, 132.10–136.97 s (4.9 s)</w:t>
         <w:br/>
         <w:t>Sound: animal sound (~1000 Hz)</w:t>
       </w:r>
@@ -1201,7 +1201,7 @@
       <w:r>
         <w:drawing>
           <wp:inline xmlns:a="http://schemas.openxmlformats.org/drawingml/2006/main" xmlns:pic="http://schemas.openxmlformats.org/drawingml/2006/picture">
-            <wp:extent cx="1735908" cy="1828800"/>
+            <wp:extent cx="1724297" cy="1828800"/>
             <wp:docPr id="23" name="Picture 23"/>
             <wp:cNvGraphicFramePr>
               <a:graphicFrameLocks noChangeAspect="1"/>
@@ -1222,7 +1222,7 @@
                   <pic:spPr>
                     <a:xfrm>
                       <a:off x="0" y="0"/>
-                      <a:ext cx="1735908" cy="1828800"/>
+                      <a:ext cx="1724297" cy="1828800"/>
                     </a:xfrm>
                     <a:prstGeom prst="rect"/>
                   </pic:spPr>
@@ -1237,7 +1237,7 @@
       <w:r>
         <w:t>Good for: talking, singing, proud (audio is a human singing)</w:t>
         <w:br/>
-        <w:t>Time in cat_pack.mp4: 136.97–152.60 s (15.6 s)</w:t>
+        <w:t>File: cat_pack.mp4, 136.97–152.60 s (15.6 s)</w:t>
         <w:br/>
         <w:t>Sound: low voice ~286 Hz (human or bark - check)</w:t>
       </w:r>
@@ -1254,7 +1254,7 @@
       <w:r>
         <w:drawing>
           <wp:inline xmlns:a="http://schemas.openxmlformats.org/drawingml/2006/main" xmlns:pic="http://schemas.openxmlformats.org/drawingml/2006/picture">
-            <wp:extent cx="865481" cy="1828800"/>
+            <wp:extent cx="861500" cy="1828800"/>
             <wp:docPr id="24" name="Picture 24"/>
             <wp:cNvGraphicFramePr>
               <a:graphicFrameLocks noChangeAspect="1"/>
@@ -1275,7 +1275,7 @@
                   <pic:spPr>
                     <a:xfrm>
                       <a:off x="0" y="0"/>
-                      <a:ext cx="865481" cy="1828800"/>
+                      <a:ext cx="861500" cy="1828800"/>
                     </a:xfrm>
                     <a:prstGeom prst="rect"/>
                   </pic:spPr>
@@ -1290,7 +1290,7 @@
       <w:r>
         <w:t>Good for: worker, delivery, playful</w:t>
         <w:br/>
-        <w:t>Time in cat_pack.mp4: 152.60–155.60 s (3.0 s)</w:t>
+        <w:t>File: cat_pack.mp4, 152.60–155.60 s (3.0 s)</w:t>
         <w:br/>
         <w:t>Sound: silent</w:t>
       </w:r>
@@ -1307,7 +1307,7 @@
       <w:r>
         <w:drawing>
           <wp:inline xmlns:a="http://schemas.openxmlformats.org/drawingml/2006/main" xmlns:pic="http://schemas.openxmlformats.org/drawingml/2006/picture">
-            <wp:extent cx="1160714" cy="1828800"/>
+            <wp:extent cx="1169344" cy="1828800"/>
             <wp:docPr id="25" name="Picture 25"/>
             <wp:cNvGraphicFramePr>
               <a:graphicFrameLocks noChangeAspect="1"/>
@@ -1328,7 +1328,7 @@
                   <pic:spPr>
                     <a:xfrm>
                       <a:off x="0" y="0"/>
-                      <a:ext cx="1160714" cy="1828800"/>
+                      <a:ext cx="1169344" cy="1828800"/>
                     </a:xfrm>
                     <a:prstGeom prst="rect"/>
                   </pic:spPr>
@@ -1343,7 +1343,7 @@
       <w:r>
         <w:t>Good for: party, celebration, silly</w:t>
         <w:br/>
-        <w:t>Time in cat_pack.mp4: 155.60–162.03 s (6.4 s)</w:t>
+        <w:t>File: cat_pack.mp4, 155.60–162.03 s (6.4 s)</w:t>
         <w:br/>
         <w:t>Sound: silent</w:t>
       </w:r>
@@ -1360,7 +1360,7 @@
       <w:r>
         <w:drawing>
           <wp:inline xmlns:a="http://schemas.openxmlformats.org/drawingml/2006/main" xmlns:pic="http://schemas.openxmlformats.org/drawingml/2006/picture">
-            <wp:extent cx="1150833" cy="1828800"/>
+            <wp:extent cx="1154430" cy="1828800"/>
             <wp:docPr id="26" name="Picture 26"/>
             <wp:cNvGraphicFramePr>
               <a:graphicFrameLocks noChangeAspect="1"/>
@@ -1381,7 +1381,7 @@
                   <pic:spPr>
                     <a:xfrm>
                       <a:off x="0" y="0"/>
-                      <a:ext cx="1150833" cy="1828800"/>
+                      <a:ext cx="1154430" cy="1828800"/>
                     </a:xfrm>
                     <a:prstGeom prst="rect"/>
                   </pic:spPr>
@@ -1396,7 +1396,7 @@
       <w:r>
         <w:t>Good for: shocked, surprised, frozen</w:t>
         <w:br/>
-        <w:t>Time in cat_pack.mp4: 162.03–168.50 s (6.5 s)</w:t>
+        <w:t>File: cat_pack.mp4, 162.03–168.50 s (6.5 s)</w:t>
         <w:br/>
         <w:t>Sound: low voice ~183 Hz (human or bark - check)</w:t>
       </w:r>
@@ -1413,7 +1413,7 @@
       <w:r>
         <w:drawing>
           <wp:inline xmlns:a="http://schemas.openxmlformats.org/drawingml/2006/main" xmlns:pic="http://schemas.openxmlformats.org/drawingml/2006/picture">
-            <wp:extent cx="1142296" cy="1828800"/>
+            <wp:extent cx="1143707" cy="1828800"/>
             <wp:docPr id="27" name="Picture 27"/>
             <wp:cNvGraphicFramePr>
               <a:graphicFrameLocks noChangeAspect="1"/>
@@ -1434,7 +1434,7 @@
                   <pic:spPr>
                     <a:xfrm>
                       <a:off x="0" y="0"/>
-                      <a:ext cx="1142296" cy="1828800"/>
+                      <a:ext cx="1143707" cy="1828800"/>
                     </a:xfrm>
                     <a:prstGeom prst="rect"/>
                   </pic:spPr>
@@ -1449,7 +1449,7 @@
       <w:r>
         <w:t>Good for: heartbroken, sad, about to cry</w:t>
         <w:br/>
-        <w:t>Time in cat_pack.mp4: 168.50–175.77 s (7.3 s)</w:t>
+        <w:t>File: cat_pack.mp4, 168.50–175.77 s (7.3 s)</w:t>
         <w:br/>
         <w:t>Sound: low voice ~117 Hz (human or bark - check)</w:t>
       </w:r>
@@ -1466,7 +1466,7 @@
       <w:r>
         <w:drawing>
           <wp:inline xmlns:a="http://schemas.openxmlformats.org/drawingml/2006/main" xmlns:pic="http://schemas.openxmlformats.org/drawingml/2006/picture">
-            <wp:extent cx="1531979" cy="1828800"/>
+            <wp:extent cx="1530416" cy="1828800"/>
             <wp:docPr id="28" name="Picture 28"/>
             <wp:cNvGraphicFramePr>
               <a:graphicFrameLocks noChangeAspect="1"/>
@@ -1487,7 +1487,7 @@
                   <pic:spPr>
                     <a:xfrm>
                       <a:off x="0" y="0"/>
-                      <a:ext cx="1531979" cy="1828800"/>
+                      <a:ext cx="1530416" cy="1828800"/>
                     </a:xfrm>
                     <a:prstGeom prst="rect"/>
                   </pic:spPr>
@@ -1502,7 +1502,7 @@
       <w:r>
         <w:t>Good for: relaxed, lazy, comfy</w:t>
         <w:br/>
-        <w:t>Time in cat_pack.mp4: 175.77–181.20 s (5.4 s)</w:t>
+        <w:t>File: cat_pack.mp4, 175.77–181.20 s (5.4 s)</w:t>
         <w:br/>
         <w:t>Sound: animal sound (~485 Hz)</w:t>
       </w:r>
@@ -1519,7 +1519,7 @@
       <w:r>
         <w:drawing>
           <wp:inline xmlns:a="http://schemas.openxmlformats.org/drawingml/2006/main" xmlns:pic="http://schemas.openxmlformats.org/drawingml/2006/picture">
-            <wp:extent cx="921657" cy="1828800"/>
+            <wp:extent cx="914400" cy="1828800"/>
             <wp:docPr id="29" name="Picture 29"/>
             <wp:cNvGraphicFramePr>
               <a:graphicFrameLocks noChangeAspect="1"/>
@@ -1540,7 +1540,7 @@
                   <pic:spPr>
                     <a:xfrm>
                       <a:off x="0" y="0"/>
-                      <a:ext cx="921657" cy="1828800"/>
+                      <a:ext cx="914400" cy="1828800"/>
                     </a:xfrm>
                     <a:prstGeom prst="rect"/>
                   </pic:spPr>
@@ -1555,9 +1555,751 @@
       <w:r>
         <w:t>Good for: waiting, standing guard, determined</w:t>
         <w:br/>
-        <w:t>Time in cat_pack.mp4: 181.20–194.63 s (13.4 s)</w:t>
+        <w:t>File: cat_pack.mp4, 181.20–194.63 s (13.4 s)</w:t>
         <w:br/>
         <w:t>Sound: animal sound (~421 Hz)</w:t>
+      </w:r>
+    </w:p>
+    <w:p>
+      <w:pPr>
+        <w:pStyle w:val="Heading2"/>
+      </w:pPr>
+      <w:r>
+        <w:t>30. Clip C30 — Small calico kitten sitting, talking ('German painter' meme)</w:t>
+      </w:r>
+    </w:p>
+    <w:p>
+      <w:r>
+        <w:drawing>
+          <wp:inline xmlns:a="http://schemas.openxmlformats.org/drawingml/2006/main" xmlns:pic="http://schemas.openxmlformats.org/drawingml/2006/picture">
+            <wp:extent cx="2132020" cy="1828800"/>
+            <wp:docPr id="30" name="Picture 30"/>
+            <wp:cNvGraphicFramePr>
+              <a:graphicFrameLocks noChangeAspect="1"/>
+            </wp:cNvGraphicFramePr>
+            <a:graphic>
+              <a:graphicData uri="http://schemas.openxmlformats.org/drawingml/2006/picture">
+                <pic:pic>
+                  <pic:nvPicPr>
+                    <pic:cNvPr id="0" name="C30.jpg"/>
+                    <pic:cNvPicPr/>
+                  </pic:nvPicPr>
+                  <pic:blipFill>
+                    <a:blip r:embed="rId38"/>
+                    <a:stretch>
+                      <a:fillRect/>
+                    </a:stretch>
+                  </pic:blipFill>
+                  <pic:spPr>
+                    <a:xfrm>
+                      <a:off x="0" y="0"/>
+                      <a:ext cx="2132020" cy="1828800"/>
+                    </a:xfrm>
+                    <a:prstGeom prst="rect"/>
+                  </pic:spPr>
+                </pic:pic>
+              </a:graphicData>
+            </a:graphic>
+          </wp:inline>
+        </w:drawing>
+      </w:r>
+    </w:p>
+    <w:p>
+      <w:r>
+        <w:t>Good for: explaining, chatting, small child talking (audio: the meme's voice-over, not a meow)</w:t>
+        <w:br/>
+        <w:t>File: cat_german_painter.mp4, 0.00–4.90 s (4.9 s)</w:t>
+        <w:br/>
+        <w:t>Sound: low voice ~372 Hz (human or bark - check)</w:t>
+      </w:r>
+    </w:p>
+    <w:p>
+      <w:pPr>
+        <w:pStyle w:val="Heading2"/>
+      </w:pPr>
+      <w:r>
+        <w:t>31. Clip C31 — Orange cat screaming/laughing, mouth wide open, close-up</w:t>
+      </w:r>
+    </w:p>
+    <w:p>
+      <w:r>
+        <w:drawing>
+          <wp:inline xmlns:a="http://schemas.openxmlformats.org/drawingml/2006/main" xmlns:pic="http://schemas.openxmlformats.org/drawingml/2006/picture">
+            <wp:extent cx="1917374" cy="1828800"/>
+            <wp:docPr id="31" name="Picture 31"/>
+            <wp:cNvGraphicFramePr>
+              <a:graphicFrameLocks noChangeAspect="1"/>
+            </wp:cNvGraphicFramePr>
+            <a:graphic>
+              <a:graphicData uri="http://schemas.openxmlformats.org/drawingml/2006/picture">
+                <pic:pic>
+                  <pic:nvPicPr>
+                    <pic:cNvPr id="0" name="C31.jpg"/>
+                    <pic:cNvPicPr/>
+                  </pic:nvPicPr>
+                  <pic:blipFill>
+                    <a:blip r:embed="rId39"/>
+                    <a:stretch>
+                      <a:fillRect/>
+                    </a:stretch>
+                  </pic:blipFill>
+                  <pic:spPr>
+                    <a:xfrm>
+                      <a:off x="0" y="0"/>
+                      <a:ext cx="1917374" cy="1828800"/>
+                    </a:xfrm>
+                    <a:prstGeom prst="rect"/>
+                  </pic:spPr>
+                </pic:pic>
+              </a:graphicData>
+            </a:graphic>
+          </wp:inline>
+        </w:drawing>
+      </w:r>
+    </w:p>
+    <w:p>
+      <w:r>
+        <w:t>Good for: laughing hard, screaming, shocked outburst</w:t>
+        <w:br/>
+        <w:t>File: cat_screaming_orange.mp4, 0.60–3.50 s (2.9 s)</w:t>
+        <w:br/>
+        <w:t>Sound: animal sound (~552 Hz)</w:t>
+      </w:r>
+    </w:p>
+    <w:p>
+      <w:pPr>
+        <w:pStyle w:val="Heading2"/>
+      </w:pPr>
+      <w:r>
+        <w:t>32. Clip C32 — 'Happy happy happy' cat dancing on hind legs</w:t>
+      </w:r>
+    </w:p>
+    <w:p>
+      <w:r>
+        <w:drawing>
+          <wp:inline xmlns:a="http://schemas.openxmlformats.org/drawingml/2006/main" xmlns:pic="http://schemas.openxmlformats.org/drawingml/2006/picture">
+            <wp:extent cx="953211" cy="1828800"/>
+            <wp:docPr id="32" name="Picture 32"/>
+            <wp:cNvGraphicFramePr>
+              <a:graphicFrameLocks noChangeAspect="1"/>
+            </wp:cNvGraphicFramePr>
+            <a:graphic>
+              <a:graphicData uri="http://schemas.openxmlformats.org/drawingml/2006/picture">
+                <pic:pic>
+                  <pic:nvPicPr>
+                    <pic:cNvPr id="0" name="C32.jpg"/>
+                    <pic:cNvPicPr/>
+                  </pic:nvPicPr>
+                  <pic:blipFill>
+                    <a:blip r:embed="rId40"/>
+                    <a:stretch>
+                      <a:fillRect/>
+                    </a:stretch>
+                  </pic:blipFill>
+                  <pic:spPr>
+                    <a:xfrm>
+                      <a:off x="0" y="0"/>
+                      <a:ext cx="953211" cy="1828800"/>
+                    </a:xfrm>
+                    <a:prstGeom prst="rect"/>
+                  </pic:spPr>
+                </pic:pic>
+              </a:graphicData>
+            </a:graphic>
+          </wp:inline>
+        </w:drawing>
+      </w:r>
+    </w:p>
+    <w:p>
+      <w:r>
+        <w:t>Good for: very happy, celebrating, dancing (audio: the 'happy happy happy' meme song)</w:t>
+        <w:br/>
+        <w:t>File: cat_happy_happy.mp4, 0.00–7.10 s (7.1 s)</w:t>
+        <w:br/>
+        <w:t>Sound: low voice ~296 Hz (human or bark - check)</w:t>
+      </w:r>
+    </w:p>
+    <w:p>
+      <w:pPr>
+        <w:pStyle w:val="Heading2"/>
+      </w:pPr>
+      <w:r>
+        <w:t>33. Clip C33 — Banana-suit cat laughing/singing</w:t>
+      </w:r>
+    </w:p>
+    <w:p>
+      <w:r>
+        <w:drawing>
+          <wp:inline xmlns:a="http://schemas.openxmlformats.org/drawingml/2006/main" xmlns:pic="http://schemas.openxmlformats.org/drawingml/2006/picture">
+            <wp:extent cx="861848" cy="1828800"/>
+            <wp:docPr id="33" name="Picture 33"/>
+            <wp:cNvGraphicFramePr>
+              <a:graphicFrameLocks noChangeAspect="1"/>
+            </wp:cNvGraphicFramePr>
+            <a:graphic>
+              <a:graphicData uri="http://schemas.openxmlformats.org/drawingml/2006/picture">
+                <pic:pic>
+                  <pic:nvPicPr>
+                    <pic:cNvPr id="0" name="C33.jpg"/>
+                    <pic:cNvPicPr/>
+                  </pic:nvPicPr>
+                  <pic:blipFill>
+                    <a:blip r:embed="rId41"/>
+                    <a:stretch>
+                      <a:fillRect/>
+                    </a:stretch>
+                  </pic:blipFill>
+                  <pic:spPr>
+                    <a:xfrm>
+                      <a:off x="0" y="0"/>
+                      <a:ext cx="861848" cy="1828800"/>
+                    </a:xfrm>
+                    <a:prstGeom prst="rect"/>
+                  </pic:spPr>
+                </pic:pic>
+              </a:graphicData>
+            </a:graphic>
+          </wp:inline>
+        </w:drawing>
+      </w:r>
+    </w:p>
+    <w:p>
+      <w:r>
+        <w:t>Good for: happy, laughing, cheerful</w:t>
+        <w:br/>
+        <w:t>File: cat_banana_pack.mp4, 2.07–5.10 s (3.0 s)</w:t>
+        <w:br/>
+        <w:t>Sound: low voice ~212 Hz (human or bark - check)</w:t>
+      </w:r>
+    </w:p>
+    <w:p>
+      <w:pPr>
+        <w:pStyle w:val="Heading2"/>
+      </w:pPr>
+      <w:r>
+        <w:t>34. Clip C34 — Banana-suit cat (dark face) looking away</w:t>
+      </w:r>
+    </w:p>
+    <w:p>
+      <w:r>
+        <w:drawing>
+          <wp:inline xmlns:a="http://schemas.openxmlformats.org/drawingml/2006/main" xmlns:pic="http://schemas.openxmlformats.org/drawingml/2006/picture">
+            <wp:extent cx="1085385" cy="1828800"/>
+            <wp:docPr id="34" name="Picture 34"/>
+            <wp:cNvGraphicFramePr>
+              <a:graphicFrameLocks noChangeAspect="1"/>
+            </wp:cNvGraphicFramePr>
+            <a:graphic>
+              <a:graphicData uri="http://schemas.openxmlformats.org/drawingml/2006/picture">
+                <pic:pic>
+                  <pic:nvPicPr>
+                    <pic:cNvPr id="0" name="C34.jpg"/>
+                    <pic:cNvPicPr/>
+                  </pic:nvPicPr>
+                  <pic:blipFill>
+                    <a:blip r:embed="rId42"/>
+                    <a:stretch>
+                      <a:fillRect/>
+                    </a:stretch>
+                  </pic:blipFill>
+                  <pic:spPr>
+                    <a:xfrm>
+                      <a:off x="0" y="0"/>
+                      <a:ext cx="1085385" cy="1828800"/>
+                    </a:xfrm>
+                    <a:prstGeom prst="rect"/>
+                  </pic:spPr>
+                </pic:pic>
+              </a:graphicData>
+            </a:graphic>
+          </wp:inline>
+        </w:drawing>
+      </w:r>
+    </w:p>
+    <w:p>
+      <w:r>
+        <w:t>Good for: sulking, ignoring, sad</w:t>
+        <w:br/>
+        <w:t>File: cat_banana_pack.mp4, 5.10–10.30 s (5.2 s)</w:t>
+        <w:br/>
+        <w:t>Sound: low voice ~188 Hz (human or bark - check)</w:t>
+      </w:r>
+    </w:p>
+    <w:p>
+      <w:pPr>
+        <w:pStyle w:val="Heading2"/>
+      </w:pPr>
+      <w:r>
+        <w:t>35. Clip C35 — Banana-suit cat looking around, curious</w:t>
+      </w:r>
+    </w:p>
+    <w:p>
+      <w:r>
+        <w:drawing>
+          <wp:inline xmlns:a="http://schemas.openxmlformats.org/drawingml/2006/main" xmlns:pic="http://schemas.openxmlformats.org/drawingml/2006/picture">
+            <wp:extent cx="874929" cy="1828800"/>
+            <wp:docPr id="35" name="Picture 35"/>
+            <wp:cNvGraphicFramePr>
+              <a:graphicFrameLocks noChangeAspect="1"/>
+            </wp:cNvGraphicFramePr>
+            <a:graphic>
+              <a:graphicData uri="http://schemas.openxmlformats.org/drawingml/2006/picture">
+                <pic:pic>
+                  <pic:nvPicPr>
+                    <pic:cNvPr id="0" name="C35.jpg"/>
+                    <pic:cNvPicPr/>
+                  </pic:nvPicPr>
+                  <pic:blipFill>
+                    <a:blip r:embed="rId43"/>
+                    <a:stretch>
+                      <a:fillRect/>
+                    </a:stretch>
+                  </pic:blipFill>
+                  <pic:spPr>
+                    <a:xfrm>
+                      <a:off x="0" y="0"/>
+                      <a:ext cx="874929" cy="1828800"/>
+                    </a:xfrm>
+                    <a:prstGeom prst="rect"/>
+                  </pic:spPr>
+                </pic:pic>
+              </a:graphicData>
+            </a:graphic>
+          </wp:inline>
+        </w:drawing>
+      </w:r>
+    </w:p>
+    <w:p>
+      <w:r>
+        <w:t>Good for: curious, confused, listening</w:t>
+        <w:br/>
+        <w:t>File: cat_banana_pack.mp4, 10.30–20.07 s (9.8 s)</w:t>
+        <w:br/>
+        <w:t>Sound: animal sound (~1231 Hz)</w:t>
+      </w:r>
+    </w:p>
+    <w:p>
+      <w:pPr>
+        <w:pStyle w:val="Heading2"/>
+      </w:pPr>
+      <w:r>
+        <w:t>36. Clip C36 — Banana-suit cat with pale screaming face</w:t>
+      </w:r>
+    </w:p>
+    <w:p>
+      <w:r>
+        <w:drawing>
+          <wp:inline xmlns:a="http://schemas.openxmlformats.org/drawingml/2006/main" xmlns:pic="http://schemas.openxmlformats.org/drawingml/2006/picture">
+            <wp:extent cx="679076" cy="1828800"/>
+            <wp:docPr id="36" name="Picture 36"/>
+            <wp:cNvGraphicFramePr>
+              <a:graphicFrameLocks noChangeAspect="1"/>
+            </wp:cNvGraphicFramePr>
+            <a:graphic>
+              <a:graphicData uri="http://schemas.openxmlformats.org/drawingml/2006/picture">
+                <pic:pic>
+                  <pic:nvPicPr>
+                    <pic:cNvPr id="0" name="C36.jpg"/>
+                    <pic:cNvPicPr/>
+                  </pic:nvPicPr>
+                  <pic:blipFill>
+                    <a:blip r:embed="rId44"/>
+                    <a:stretch>
+                      <a:fillRect/>
+                    </a:stretch>
+                  </pic:blipFill>
+                  <pic:spPr>
+                    <a:xfrm>
+                      <a:off x="0" y="0"/>
+                      <a:ext cx="679076" cy="1828800"/>
+                    </a:xfrm>
+                    <a:prstGeom prst="rect"/>
+                  </pic:spPr>
+                </pic:pic>
+              </a:graphicData>
+            </a:graphic>
+          </wp:inline>
+        </w:drawing>
+      </w:r>
+    </w:p>
+    <w:p>
+      <w:r>
+        <w:t>Good for: screaming, shocked, terrified</w:t>
+        <w:br/>
+        <w:t>File: cat_banana_pack.mp4, 20.07–25.23 s (5.2 s)</w:t>
+        <w:br/>
+        <w:t>Sound: animal sound (~1000 Hz)</w:t>
+      </w:r>
+    </w:p>
+    <w:p>
+      <w:pPr>
+        <w:pStyle w:val="Heading2"/>
+      </w:pPr>
+      <w:r>
+        <w:t>37. Clip C37 — Banana-suit cat screaming, closer</w:t>
+      </w:r>
+    </w:p>
+    <w:p>
+      <w:r>
+        <w:drawing>
+          <wp:inline xmlns:a="http://schemas.openxmlformats.org/drawingml/2006/main" xmlns:pic="http://schemas.openxmlformats.org/drawingml/2006/picture">
+            <wp:extent cx="816677" cy="1828800"/>
+            <wp:docPr id="37" name="Picture 37"/>
+            <wp:cNvGraphicFramePr>
+              <a:graphicFrameLocks noChangeAspect="1"/>
+            </wp:cNvGraphicFramePr>
+            <a:graphic>
+              <a:graphicData uri="http://schemas.openxmlformats.org/drawingml/2006/picture">
+                <pic:pic>
+                  <pic:nvPicPr>
+                    <pic:cNvPr id="0" name="C37.jpg"/>
+                    <pic:cNvPicPr/>
+                  </pic:nvPicPr>
+                  <pic:blipFill>
+                    <a:blip r:embed="rId45"/>
+                    <a:stretch>
+                      <a:fillRect/>
+                    </a:stretch>
+                  </pic:blipFill>
+                  <pic:spPr>
+                    <a:xfrm>
+                      <a:off x="0" y="0"/>
+                      <a:ext cx="816677" cy="1828800"/>
+                    </a:xfrm>
+                    <a:prstGeom prst="rect"/>
+                  </pic:spPr>
+                </pic:pic>
+              </a:graphicData>
+            </a:graphic>
+          </wp:inline>
+        </w:drawing>
+      </w:r>
+    </w:p>
+    <w:p>
+      <w:r>
+        <w:t>Good for: horrified, panicking</w:t>
+        <w:br/>
+        <w:t>File: cat_banana_pack.mp4, 25.23–30.43 s (5.2 s)</w:t>
+        <w:br/>
+        <w:t>Sound: animal sound (~889 Hz)</w:t>
+      </w:r>
+    </w:p>
+    <w:p>
+      <w:pPr>
+        <w:pStyle w:val="Heading2"/>
+      </w:pPr>
+      <w:r>
+        <w:t>38. Clip C38 — Banana-suit cat crying with tear streams</w:t>
+      </w:r>
+    </w:p>
+    <w:p>
+      <w:r>
+        <w:drawing>
+          <wp:inline xmlns:a="http://schemas.openxmlformats.org/drawingml/2006/main" xmlns:pic="http://schemas.openxmlformats.org/drawingml/2006/picture">
+            <wp:extent cx="1944651" cy="1828800"/>
+            <wp:docPr id="38" name="Picture 38"/>
+            <wp:cNvGraphicFramePr>
+              <a:graphicFrameLocks noChangeAspect="1"/>
+            </wp:cNvGraphicFramePr>
+            <a:graphic>
+              <a:graphicData uri="http://schemas.openxmlformats.org/drawingml/2006/picture">
+                <pic:pic>
+                  <pic:nvPicPr>
+                    <pic:cNvPr id="0" name="C38.jpg"/>
+                    <pic:cNvPicPr/>
+                  </pic:nvPicPr>
+                  <pic:blipFill>
+                    <a:blip r:embed="rId46"/>
+                    <a:stretch>
+                      <a:fillRect/>
+                    </a:stretch>
+                  </pic:blipFill>
+                  <pic:spPr>
+                    <a:xfrm>
+                      <a:off x="0" y="0"/>
+                      <a:ext cx="1944651" cy="1828800"/>
+                    </a:xfrm>
+                    <a:prstGeom prst="rect"/>
+                  </pic:spPr>
+                </pic:pic>
+              </a:graphicData>
+            </a:graphic>
+          </wp:inline>
+        </w:drawing>
+      </w:r>
+    </w:p>
+    <w:p>
+      <w:r>
+        <w:t>Good for: crying hard, heartbroken</w:t>
+        <w:br/>
+        <w:t>File: cat_banana_pack.mp4, 30.43–36.20 s (5.8 s)</w:t>
+        <w:br/>
+        <w:t>Sound: low voice ~372 Hz (human or bark - check)</w:t>
+      </w:r>
+    </w:p>
+    <w:p>
+      <w:pPr>
+        <w:pStyle w:val="Heading2"/>
+      </w:pPr>
+      <w:r>
+        <w:t>39. Clip C39 — Banana-suit cat crying with hands up + spinning (rapid cuts)</w:t>
+      </w:r>
+    </w:p>
+    <w:p>
+      <w:r>
+        <w:drawing>
+          <wp:inline xmlns:a="http://schemas.openxmlformats.org/drawingml/2006/main" xmlns:pic="http://schemas.openxmlformats.org/drawingml/2006/picture">
+            <wp:extent cx="957942" cy="1828800"/>
+            <wp:docPr id="39" name="Picture 39"/>
+            <wp:cNvGraphicFramePr>
+              <a:graphicFrameLocks noChangeAspect="1"/>
+            </wp:cNvGraphicFramePr>
+            <a:graphic>
+              <a:graphicData uri="http://schemas.openxmlformats.org/drawingml/2006/picture">
+                <pic:pic>
+                  <pic:nvPicPr>
+                    <pic:cNvPr id="0" name="C39.jpg"/>
+                    <pic:cNvPicPr/>
+                  </pic:nvPicPr>
+                  <pic:blipFill>
+                    <a:blip r:embed="rId47"/>
+                    <a:stretch>
+                      <a:fillRect/>
+                    </a:stretch>
+                  </pic:blipFill>
+                  <pic:spPr>
+                    <a:xfrm>
+                      <a:off x="0" y="0"/>
+                      <a:ext cx="957942" cy="1828800"/>
+                    </a:xfrm>
+                    <a:prstGeom prst="rect"/>
+                  </pic:spPr>
+                </pic:pic>
+              </a:graphicData>
+            </a:graphic>
+          </wp:inline>
+        </w:drawing>
+      </w:r>
+    </w:p>
+    <w:p>
+      <w:r>
+        <w:t>Good for: dramatic crying, breakdown</w:t>
+        <w:br/>
+        <w:t>File: cat_banana_pack.mp4, 36.20–46.37 s (10.2 s)</w:t>
+        <w:br/>
+        <w:t>Sound: animal sound (~667 Hz)</w:t>
+      </w:r>
+    </w:p>
+    <w:p>
+      <w:pPr>
+        <w:pStyle w:val="Heading2"/>
+      </w:pPr>
+      <w:r>
+        <w:t>40. Clip C40 — Banana-suit cat collapsed lying sideways</w:t>
+      </w:r>
+    </w:p>
+    <w:p>
+      <w:r>
+        <w:drawing>
+          <wp:inline xmlns:a="http://schemas.openxmlformats.org/drawingml/2006/main" xmlns:pic="http://schemas.openxmlformats.org/drawingml/2006/picture">
+            <wp:extent cx="2377440" cy="1280160"/>
+            <wp:docPr id="40" name="Picture 40"/>
+            <wp:cNvGraphicFramePr>
+              <a:graphicFrameLocks noChangeAspect="1"/>
+            </wp:cNvGraphicFramePr>
+            <a:graphic>
+              <a:graphicData uri="http://schemas.openxmlformats.org/drawingml/2006/picture">
+                <pic:pic>
+                  <pic:nvPicPr>
+                    <pic:cNvPr id="0" name="C40.jpg"/>
+                    <pic:cNvPicPr/>
+                  </pic:nvPicPr>
+                  <pic:blipFill>
+                    <a:blip r:embed="rId48"/>
+                    <a:stretch>
+                      <a:fillRect/>
+                    </a:stretch>
+                  </pic:blipFill>
+                  <pic:spPr>
+                    <a:xfrm>
+                      <a:off x="0" y="0"/>
+                      <a:ext cx="2377440" cy="1280160"/>
+                    </a:xfrm>
+                    <a:prstGeom prst="rect"/>
+                  </pic:spPr>
+                </pic:pic>
+              </a:graphicData>
+            </a:graphic>
+          </wp:inline>
+        </w:drawing>
+      </w:r>
+    </w:p>
+    <w:p>
+      <w:r>
+        <w:t>Good for: exhausted, fainted, giving up</w:t>
+        <w:br/>
+        <w:t>File: cat_banana_pack.mp4, 46.37–52.43 s (6.1 s)</w:t>
+        <w:br/>
+        <w:t>Sound: animal sound (~640 Hz)</w:t>
+      </w:r>
+    </w:p>
+    <w:p>
+      <w:pPr>
+        <w:pStyle w:val="Heading2"/>
+      </w:pPr>
+      <w:r>
+        <w:t>41. Clip C41 — Banana-suit cat with a sweat drop</w:t>
+      </w:r>
+    </w:p>
+    <w:p>
+      <w:r>
+        <w:drawing>
+          <wp:inline xmlns:a="http://schemas.openxmlformats.org/drawingml/2006/main" xmlns:pic="http://schemas.openxmlformats.org/drawingml/2006/picture">
+            <wp:extent cx="697014" cy="1828800"/>
+            <wp:docPr id="41" name="Picture 41"/>
+            <wp:cNvGraphicFramePr>
+              <a:graphicFrameLocks noChangeAspect="1"/>
+            </wp:cNvGraphicFramePr>
+            <a:graphic>
+              <a:graphicData uri="http://schemas.openxmlformats.org/drawingml/2006/picture">
+                <pic:pic>
+                  <pic:nvPicPr>
+                    <pic:cNvPr id="0" name="C41.jpg"/>
+                    <pic:cNvPicPr/>
+                  </pic:nvPicPr>
+                  <pic:blipFill>
+                    <a:blip r:embed="rId49"/>
+                    <a:stretch>
+                      <a:fillRect/>
+                    </a:stretch>
+                  </pic:blipFill>
+                  <pic:spPr>
+                    <a:xfrm>
+                      <a:off x="0" y="0"/>
+                      <a:ext cx="697014" cy="1828800"/>
+                    </a:xfrm>
+                    <a:prstGeom prst="rect"/>
+                  </pic:spPr>
+                </pic:pic>
+              </a:graphicData>
+            </a:graphic>
+          </wp:inline>
+        </w:drawing>
+      </w:r>
+    </w:p>
+    <w:p>
+      <w:r>
+        <w:t>Good for: nervous, embarrassed, awkward</w:t>
+        <w:br/>
+        <w:t>File: cat_banana_pack.mp4, 52.43–56.57 s (4.1 s)</w:t>
+        <w:br/>
+        <w:t>Sound: noise / effects (no clear voice)</w:t>
+      </w:r>
+    </w:p>
+    <w:p>
+      <w:pPr>
+        <w:pStyle w:val="Heading2"/>
+      </w:pPr>
+      <w:r>
+        <w:t>42. Clip C42 — Tiny banana-suit cat walking away in the distance</w:t>
+      </w:r>
+    </w:p>
+    <w:p>
+      <w:r>
+        <w:drawing>
+          <wp:inline xmlns:a="http://schemas.openxmlformats.org/drawingml/2006/main" xmlns:pic="http://schemas.openxmlformats.org/drawingml/2006/picture">
+            <wp:extent cx="717176" cy="1828800"/>
+            <wp:docPr id="42" name="Picture 42"/>
+            <wp:cNvGraphicFramePr>
+              <a:graphicFrameLocks noChangeAspect="1"/>
+            </wp:cNvGraphicFramePr>
+            <a:graphic>
+              <a:graphicData uri="http://schemas.openxmlformats.org/drawingml/2006/picture">
+                <pic:pic>
+                  <pic:nvPicPr>
+                    <pic:cNvPr id="0" name="C42.jpg"/>
+                    <pic:cNvPicPr/>
+                  </pic:nvPicPr>
+                  <pic:blipFill>
+                    <a:blip r:embed="rId50"/>
+                    <a:stretch>
+                      <a:fillRect/>
+                    </a:stretch>
+                  </pic:blipFill>
+                  <pic:spPr>
+                    <a:xfrm>
+                      <a:off x="0" y="0"/>
+                      <a:ext cx="717176" cy="1828800"/>
+                    </a:xfrm>
+                    <a:prstGeom prst="rect"/>
+                  </pic:spPr>
+                </pic:pic>
+              </a:graphicData>
+            </a:graphic>
+          </wp:inline>
+        </w:drawing>
+      </w:r>
+    </w:p>
+    <w:p>
+      <w:r>
+        <w:t>Good for: leaving, alone, walking home</w:t>
+        <w:br/>
+        <w:t>File: cat_banana_pack.mp4, 56.57–61.77 s (5.2 s)</w:t>
+        <w:br/>
+        <w:t>Sound: animal sound (~1231 Hz)</w:t>
+      </w:r>
+    </w:p>
+    <w:p>
+      <w:pPr>
+        <w:pStyle w:val="Heading2"/>
+      </w:pPr>
+      <w:r>
+        <w:t>43. Clip C43 — Banana-suit cat standing sadly</w:t>
+      </w:r>
+    </w:p>
+    <w:p>
+      <w:r>
+        <w:drawing>
+          <wp:inline xmlns:a="http://schemas.openxmlformats.org/drawingml/2006/main" xmlns:pic="http://schemas.openxmlformats.org/drawingml/2006/picture">
+            <wp:extent cx="798490" cy="1828800"/>
+            <wp:docPr id="43" name="Picture 43"/>
+            <wp:cNvGraphicFramePr>
+              <a:graphicFrameLocks noChangeAspect="1"/>
+            </wp:cNvGraphicFramePr>
+            <a:graphic>
+              <a:graphicData uri="http://schemas.openxmlformats.org/drawingml/2006/picture">
+                <pic:pic>
+                  <pic:nvPicPr>
+                    <pic:cNvPr id="0" name="C43.jpg"/>
+                    <pic:cNvPicPr/>
+                  </pic:nvPicPr>
+                  <pic:blipFill>
+                    <a:blip r:embed="rId51"/>
+                    <a:stretch>
+                      <a:fillRect/>
+                    </a:stretch>
+                  </pic:blipFill>
+                  <pic:spPr>
+                    <a:xfrm>
+                      <a:off x="0" y="0"/>
+                      <a:ext cx="798490" cy="1828800"/>
+                    </a:xfrm>
+                    <a:prstGeom prst="rect"/>
+                  </pic:spPr>
+                </pic:pic>
+              </a:graphicData>
+            </a:graphic>
+          </wp:inline>
+        </w:drawing>
+      </w:r>
+    </w:p>
+    <w:p>
+      <w:r>
+        <w:t>Good for: sad, lonely, waiting</w:t>
+        <w:br/>
+        <w:t>File: cat_banana_pack.mp4, 61.77–71.30 s (9.5 s)</w:t>
+        <w:br/>
+        <w:t>Sound: animal sound (~410 Hz)</w:t>
       </w:r>
     </w:p>
     <w:p>
@@ -1580,8 +2322,8 @@
       <w:r>
         <w:drawing>
           <wp:inline xmlns:a="http://schemas.openxmlformats.org/drawingml/2006/main" xmlns:pic="http://schemas.openxmlformats.org/drawingml/2006/picture">
-            <wp:extent cx="928642" cy="1828800"/>
-            <wp:docPr id="30" name="Picture 30"/>
+            <wp:extent cx="925830" cy="1828800"/>
+            <wp:docPr id="44" name="Picture 44"/>
             <wp:cNvGraphicFramePr>
               <a:graphicFrameLocks noChangeAspect="1"/>
             </wp:cNvGraphicFramePr>
@@ -1593,7 +2335,7 @@
                     <pic:cNvPicPr/>
                   </pic:nvPicPr>
                   <pic:blipFill>
-                    <a:blip r:embed="rId38"/>
+                    <a:blip r:embed="rId52"/>
                     <a:stretch>
                       <a:fillRect/>
                     </a:stretch>
@@ -1601,7 +2343,7 @@
                   <pic:spPr>
                     <a:xfrm>
                       <a:off x="0" y="0"/>
-                      <a:ext cx="928642" cy="1828800"/>
+                      <a:ext cx="925830" cy="1828800"/>
                     </a:xfrm>
                     <a:prstGeom prst="rect"/>
                   </pic:spPr>
@@ -1616,7 +2358,7 @@
       <w:r>
         <w:t>Good for: smug, proud, ignoring</w:t>
         <w:br/>
-        <w:t>Time in dog_pack.mp4: 0.00–6.43 s (6.4 s)</w:t>
+        <w:t>File: dog_pack.mp4, 0.00–6.43 s (6.4 s)</w:t>
         <w:br/>
         <w:t>Sound: low voice ~208 Hz (human or bark - check)</w:t>
       </w:r>
@@ -1633,8 +2375,8 @@
       <w:r>
         <w:drawing>
           <wp:inline xmlns:a="http://schemas.openxmlformats.org/drawingml/2006/main" xmlns:pic="http://schemas.openxmlformats.org/drawingml/2006/picture">
-            <wp:extent cx="1234632" cy="1828799"/>
-            <wp:docPr id="31" name="Picture 31"/>
+            <wp:extent cx="1234830" cy="1828800"/>
+            <wp:docPr id="45" name="Picture 45"/>
             <wp:cNvGraphicFramePr>
               <a:graphicFrameLocks noChangeAspect="1"/>
             </wp:cNvGraphicFramePr>
@@ -1646,7 +2388,7 @@
                     <pic:cNvPicPr/>
                   </pic:nvPicPr>
                   <pic:blipFill>
-                    <a:blip r:embed="rId39"/>
+                    <a:blip r:embed="rId53"/>
                     <a:stretch>
                       <a:fillRect/>
                     </a:stretch>
@@ -1654,7 +2396,7 @@
                   <pic:spPr>
                     <a:xfrm>
                       <a:off x="0" y="0"/>
-                      <a:ext cx="1234632" cy="1828799"/>
+                      <a:ext cx="1234830" cy="1828800"/>
                     </a:xfrm>
                     <a:prstGeom prst="rect"/>
                   </pic:spPr>
@@ -1669,7 +2411,7 @@
       <w:r>
         <w:t>Good for: happy, excited, running to greet</w:t>
         <w:br/>
-        <w:t>Time in dog_pack.mp4: 6.43–14.50 s (8.1 s)</w:t>
+        <w:t>File: dog_pack.mp4, 6.43–14.50 s (8.1 s)</w:t>
         <w:br/>
         <w:t>Sound: animal sound (~615 Hz)</w:t>
       </w:r>
@@ -1686,8 +2428,8 @@
       <w:r>
         <w:drawing>
           <wp:inline xmlns:a="http://schemas.openxmlformats.org/drawingml/2006/main" xmlns:pic="http://schemas.openxmlformats.org/drawingml/2006/picture">
-            <wp:extent cx="1366344" cy="1828800"/>
-            <wp:docPr id="32" name="Picture 32"/>
+            <wp:extent cx="1369834" cy="1828800"/>
+            <wp:docPr id="46" name="Picture 46"/>
             <wp:cNvGraphicFramePr>
               <a:graphicFrameLocks noChangeAspect="1"/>
             </wp:cNvGraphicFramePr>
@@ -1699,7 +2441,7 @@
                     <pic:cNvPicPr/>
                   </pic:nvPicPr>
                   <pic:blipFill>
-                    <a:blip r:embed="rId40"/>
+                    <a:blip r:embed="rId54"/>
                     <a:stretch>
                       <a:fillRect/>
                     </a:stretch>
@@ -1707,7 +2449,7 @@
                   <pic:spPr>
                     <a:xfrm>
                       <a:off x="0" y="0"/>
-                      <a:ext cx="1366344" cy="1828800"/>
+                      <a:ext cx="1369834" cy="1828800"/>
                     </a:xfrm>
                     <a:prstGeom prst="rect"/>
                   </pic:spPr>
@@ -1722,7 +2464,7 @@
       <w:r>
         <w:t>Good for: calm, gentle, butterfly / spirit</w:t>
         <w:br/>
-        <w:t>Time in dog_pack.mp4: 14.50–21.47 s (7.0 s)</w:t>
+        <w:t>File: dog_pack.mp4, 14.50–21.47 s (7.0 s)</w:t>
         <w:br/>
         <w:t>Sound: low voice ~229 Hz (human or bark - check)</w:t>
       </w:r>
@@ -1739,8 +2481,8 @@
       <w:r>
         <w:drawing>
           <wp:inline xmlns:a="http://schemas.openxmlformats.org/drawingml/2006/main" xmlns:pic="http://schemas.openxmlformats.org/drawingml/2006/picture">
-            <wp:extent cx="2377440" cy="1322621"/>
-            <wp:docPr id="33" name="Picture 33"/>
+            <wp:extent cx="2377440" cy="1320800"/>
+            <wp:docPr id="47" name="Picture 47"/>
             <wp:cNvGraphicFramePr>
               <a:graphicFrameLocks noChangeAspect="1"/>
             </wp:cNvGraphicFramePr>
@@ -1752,7 +2494,7 @@
                     <pic:cNvPicPr/>
                   </pic:nvPicPr>
                   <pic:blipFill>
-                    <a:blip r:embed="rId41"/>
+                    <a:blip r:embed="rId55"/>
                     <a:stretch>
                       <a:fillRect/>
                     </a:stretch>
@@ -1760,7 +2502,7 @@
                   <pic:spPr>
                     <a:xfrm>
                       <a:off x="0" y="0"/>
-                      <a:ext cx="2377440" cy="1322621"/>
+                      <a:ext cx="2377440" cy="1320800"/>
                     </a:xfrm>
                     <a:prstGeom prst="rect"/>
                   </pic:spPr>
@@ -1775,7 +2517,7 @@
       <w:r>
         <w:t>Good for: curious, sniffing, shocked zoom</w:t>
         <w:br/>
-        <w:t>Time in dog_pack.mp4: 21.47–32.10 s (10.6 s)</w:t>
+        <w:t>File: dog_pack.mp4, 21.47–32.10 s (10.6 s)</w:t>
         <w:br/>
         <w:t>Sound: animal sound (~727 Hz)</w:t>
       </w:r>
@@ -1792,8 +2534,8 @@
       <w:r>
         <w:drawing>
           <wp:inline xmlns:a="http://schemas.openxmlformats.org/drawingml/2006/main" xmlns:pic="http://schemas.openxmlformats.org/drawingml/2006/picture">
-            <wp:extent cx="2377440" cy="1806480"/>
-            <wp:docPr id="34" name="Picture 34"/>
+            <wp:extent cx="2377440" cy="1804223"/>
+            <wp:docPr id="48" name="Picture 48"/>
             <wp:cNvGraphicFramePr>
               <a:graphicFrameLocks noChangeAspect="1"/>
             </wp:cNvGraphicFramePr>
@@ -1805,7 +2547,7 @@
                     <pic:cNvPicPr/>
                   </pic:nvPicPr>
                   <pic:blipFill>
-                    <a:blip r:embed="rId42"/>
+                    <a:blip r:embed="rId56"/>
                     <a:stretch>
                       <a:fillRect/>
                     </a:stretch>
@@ -1813,7 +2555,7 @@
                   <pic:spPr>
                     <a:xfrm>
                       <a:off x="0" y="0"/>
-                      <a:ext cx="2377440" cy="1806480"/>
+                      <a:ext cx="2377440" cy="1804223"/>
                     </a:xfrm>
                     <a:prstGeom prst="rect"/>
                   </pic:spPr>
@@ -1828,7 +2570,7 @@
       <w:r>
         <w:t>Good for: sick, cold, cozy, cared for</w:t>
         <w:br/>
-        <w:t>Time in dog_pack.mp4: 32.10–38.60 s (6.5 s)</w:t>
+        <w:t>File: dog_pack.mp4, 32.10–38.60 s (6.5 s)</w:t>
         <w:br/>
         <w:t>Sound: low voice ~356 Hz (human or bark - check)</w:t>
       </w:r>
@@ -1845,8 +2587,8 @@
       <w:r>
         <w:drawing>
           <wp:inline xmlns:a="http://schemas.openxmlformats.org/drawingml/2006/main" xmlns:pic="http://schemas.openxmlformats.org/drawingml/2006/picture">
-            <wp:extent cx="1237742" cy="1828800"/>
-            <wp:docPr id="35" name="Picture 35"/>
+            <wp:extent cx="1228506" cy="1828800"/>
+            <wp:docPr id="49" name="Picture 49"/>
             <wp:cNvGraphicFramePr>
               <a:graphicFrameLocks noChangeAspect="1"/>
             </wp:cNvGraphicFramePr>
@@ -1858,7 +2600,7 @@
                     <pic:cNvPicPr/>
                   </pic:nvPicPr>
                   <pic:blipFill>
-                    <a:blip r:embed="rId43"/>
+                    <a:blip r:embed="rId57"/>
                     <a:stretch>
                       <a:fillRect/>
                     </a:stretch>
@@ -1866,7 +2608,7 @@
                   <pic:spPr>
                     <a:xfrm>
                       <a:off x="0" y="0"/>
-                      <a:ext cx="1237742" cy="1828800"/>
+                      <a:ext cx="1228506" cy="1828800"/>
                     </a:xfrm>
                     <a:prstGeom prst="rect"/>
                   </pic:spPr>
@@ -1881,7 +2623,7 @@
       <w:r>
         <w:t>Good for: disgusted, sassy, teasing</w:t>
         <w:br/>
-        <w:t>Time in dog_pack.mp4: 38.60–43.67 s (5.1 s)</w:t>
+        <w:t>File: dog_pack.mp4, 38.60–43.67 s (5.1 s)</w:t>
         <w:br/>
         <w:t>Sound: animal sound (~892 Hz)</w:t>
       </w:r>
@@ -1898,8 +2640,8 @@
       <w:r>
         <w:drawing>
           <wp:inline xmlns:a="http://schemas.openxmlformats.org/drawingml/2006/main" xmlns:pic="http://schemas.openxmlformats.org/drawingml/2006/picture">
-            <wp:extent cx="1269831" cy="1828800"/>
-            <wp:docPr id="36" name="Picture 36"/>
+            <wp:extent cx="1267968" cy="1828800"/>
+            <wp:docPr id="50" name="Picture 50"/>
             <wp:cNvGraphicFramePr>
               <a:graphicFrameLocks noChangeAspect="1"/>
             </wp:cNvGraphicFramePr>
@@ -1911,7 +2653,7 @@
                     <pic:cNvPicPr/>
                   </pic:nvPicPr>
                   <pic:blipFill>
-                    <a:blip r:embed="rId44"/>
+                    <a:blip r:embed="rId58"/>
                     <a:stretch>
                       <a:fillRect/>
                     </a:stretch>
@@ -1919,7 +2661,7 @@
                   <pic:spPr>
                     <a:xfrm>
                       <a:off x="0" y="0"/>
-                      <a:ext cx="1269831" cy="1828800"/>
+                      <a:ext cx="1267968" cy="1828800"/>
                     </a:xfrm>
                     <a:prstGeom prst="rect"/>
                   </pic:spPr>
@@ -1934,7 +2676,7 @@
       <w:r>
         <w:t>Good for: suspicious, judging</w:t>
         <w:br/>
-        <w:t>Time in dog_pack.mp4: 43.67–51.43 s (7.8 s)</w:t>
+        <w:t>File: dog_pack.mp4, 43.67–51.43 s (7.8 s)</w:t>
         <w:br/>
         <w:t>Sound: silent</w:t>
       </w:r>
@@ -1951,8 +2693,8 @@
       <w:r>
         <w:drawing>
           <wp:inline xmlns:a="http://schemas.openxmlformats.org/drawingml/2006/main" xmlns:pic="http://schemas.openxmlformats.org/drawingml/2006/picture">
-            <wp:extent cx="1457172" cy="1828799"/>
-            <wp:docPr id="37" name="Picture 37"/>
+            <wp:extent cx="1455174" cy="1828800"/>
+            <wp:docPr id="51" name="Picture 51"/>
             <wp:cNvGraphicFramePr>
               <a:graphicFrameLocks noChangeAspect="1"/>
             </wp:cNvGraphicFramePr>
@@ -1964,7 +2706,7 @@
                     <pic:cNvPicPr/>
                   </pic:nvPicPr>
                   <pic:blipFill>
-                    <a:blip r:embed="rId45"/>
+                    <a:blip r:embed="rId59"/>
                     <a:stretch>
                       <a:fillRect/>
                     </a:stretch>
@@ -1972,7 +2714,7 @@
                   <pic:spPr>
                     <a:xfrm>
                       <a:off x="0" y="0"/>
-                      <a:ext cx="1457172" cy="1828799"/>
+                      <a:ext cx="1455174" cy="1828800"/>
                     </a:xfrm>
                     <a:prstGeom prst="rect"/>
                   </pic:spPr>
@@ -1987,7 +2729,7 @@
       <w:r>
         <w:t>Good for: walking away, arriving</w:t>
         <w:br/>
-        <w:t>Time in dog_pack.mp4: 51.43–61.00 s (9.6 s)</w:t>
+        <w:t>File: dog_pack.mp4, 51.43–61.00 s (9.6 s)</w:t>
         <w:br/>
         <w:t>Sound: animal sound (~543 Hz)</w:t>
       </w:r>
@@ -2004,8 +2746,8 @@
       <w:r>
         <w:drawing>
           <wp:inline xmlns:a="http://schemas.openxmlformats.org/drawingml/2006/main" xmlns:pic="http://schemas.openxmlformats.org/drawingml/2006/picture">
-            <wp:extent cx="917677" cy="1828800"/>
-            <wp:docPr id="38" name="Picture 38"/>
+            <wp:extent cx="897894" cy="1828800"/>
+            <wp:docPr id="52" name="Picture 52"/>
             <wp:cNvGraphicFramePr>
               <a:graphicFrameLocks noChangeAspect="1"/>
             </wp:cNvGraphicFramePr>
@@ -2017,7 +2759,7 @@
                     <pic:cNvPicPr/>
                   </pic:nvPicPr>
                   <pic:blipFill>
-                    <a:blip r:embed="rId46"/>
+                    <a:blip r:embed="rId60"/>
                     <a:stretch>
                       <a:fillRect/>
                     </a:stretch>
@@ -2025,7 +2767,7 @@
                   <pic:spPr>
                     <a:xfrm>
                       <a:off x="0" y="0"/>
-                      <a:ext cx="917677" cy="1828800"/>
+                      <a:ext cx="897894" cy="1828800"/>
                     </a:xfrm>
                     <a:prstGeom prst="rect"/>
                   </pic:spPr>
@@ -2040,7 +2782,7 @@
       <w:r>
         <w:t>Good for: groom, formal, polite gentleman</w:t>
         <w:br/>
-        <w:t>Time in dog_pack.mp4: 61.00–67.83 s (6.8 s)</w:t>
+        <w:t>File: dog_pack.mp4, 61.00–67.83 s (6.8 s)</w:t>
         <w:br/>
         <w:t>Sound: low voice ~126 Hz (human or bark - check)</w:t>
       </w:r>
@@ -2057,8 +2799,8 @@
       <w:r>
         <w:drawing>
           <wp:inline xmlns:a="http://schemas.openxmlformats.org/drawingml/2006/main" xmlns:pic="http://schemas.openxmlformats.org/drawingml/2006/picture">
-            <wp:extent cx="1075385" cy="1828800"/>
-            <wp:docPr id="39" name="Picture 39"/>
+            <wp:extent cx="1066261" cy="1828800"/>
+            <wp:docPr id="53" name="Picture 53"/>
             <wp:cNvGraphicFramePr>
               <a:graphicFrameLocks noChangeAspect="1"/>
             </wp:cNvGraphicFramePr>
@@ -2070,7 +2812,7 @@
                     <pic:cNvPicPr/>
                   </pic:nvPicPr>
                   <pic:blipFill>
-                    <a:blip r:embed="rId47"/>
+                    <a:blip r:embed="rId61"/>
                     <a:stretch>
                       <a:fillRect/>
                     </a:stretch>
@@ -2078,7 +2820,7 @@
                   <pic:spPr>
                     <a:xfrm>
                       <a:off x="0" y="0"/>
-                      <a:ext cx="1075385" cy="1828800"/>
+                      <a:ext cx="1066261" cy="1828800"/>
                     </a:xfrm>
                     <a:prstGeom prst="rect"/>
                   </pic:spPr>
@@ -2093,7 +2835,7 @@
       <w:r>
         <w:t>Good for: serious, listening</w:t>
         <w:br/>
-        <w:t>Time in dog_pack.mp4: 67.83–75.57 s (7.7 s)</w:t>
+        <w:t>File: dog_pack.mp4, 67.83–75.57 s (7.7 s)</w:t>
         <w:br/>
         <w:t>Sound: low voice ~225 Hz (human or bark - check)</w:t>
       </w:r>
@@ -2110,8 +2852,8 @@
       <w:r>
         <w:drawing>
           <wp:inline xmlns:a="http://schemas.openxmlformats.org/drawingml/2006/main" xmlns:pic="http://schemas.openxmlformats.org/drawingml/2006/picture">
-            <wp:extent cx="1320127" cy="1828800"/>
-            <wp:docPr id="40" name="Picture 40"/>
+            <wp:extent cx="1318437" cy="1828800"/>
+            <wp:docPr id="54" name="Picture 54"/>
             <wp:cNvGraphicFramePr>
               <a:graphicFrameLocks noChangeAspect="1"/>
             </wp:cNvGraphicFramePr>
@@ -2123,7 +2865,7 @@
                     <pic:cNvPicPr/>
                   </pic:nvPicPr>
                   <pic:blipFill>
-                    <a:blip r:embed="rId48"/>
+                    <a:blip r:embed="rId62"/>
                     <a:stretch>
                       <a:fillRect/>
                     </a:stretch>
@@ -2131,7 +2873,7 @@
                   <pic:spPr>
                     <a:xfrm>
                       <a:off x="0" y="0"/>
-                      <a:ext cx="1320127" cy="1828800"/>
+                      <a:ext cx="1318437" cy="1828800"/>
                     </a:xfrm>
                     <a:prstGeom prst="rect"/>
                   </pic:spPr>
@@ -2146,7 +2888,7 @@
       <w:r>
         <w:t>Good for: shocked, scared, 'what?!'</w:t>
         <w:br/>
-        <w:t>Time in dog_pack.mp4: 75.57–83.07 s (7.5 s)</w:t>
+        <w:t>File: dog_pack.mp4, 75.57–83.07 s (7.5 s)</w:t>
         <w:br/>
         <w:t>Sound: animal sound (~552 Hz)</w:t>
       </w:r>
@@ -2163,8 +2905,8 @@
       <w:r>
         <w:drawing>
           <wp:inline xmlns:a="http://schemas.openxmlformats.org/drawingml/2006/main" xmlns:pic="http://schemas.openxmlformats.org/drawingml/2006/picture">
-            <wp:extent cx="1095324" cy="1828799"/>
-            <wp:docPr id="41" name="Picture 41"/>
+            <wp:extent cx="1081548" cy="1828800"/>
+            <wp:docPr id="55" name="Picture 55"/>
             <wp:cNvGraphicFramePr>
               <a:graphicFrameLocks noChangeAspect="1"/>
             </wp:cNvGraphicFramePr>
@@ -2176,7 +2918,7 @@
                     <pic:cNvPicPr/>
                   </pic:nvPicPr>
                   <pic:blipFill>
-                    <a:blip r:embed="rId49"/>
+                    <a:blip r:embed="rId63"/>
                     <a:stretch>
                       <a:fillRect/>
                     </a:stretch>
@@ -2184,7 +2926,7 @@
                   <pic:spPr>
                     <a:xfrm>
                       <a:off x="0" y="0"/>
-                      <a:ext cx="1095324" cy="1828799"/>
+                      <a:ext cx="1081548" cy="1828800"/>
                     </a:xfrm>
                     <a:prstGeom prst="rect"/>
                   </pic:spPr>
@@ -2199,7 +2941,7 @@
       <w:r>
         <w:t>Good for: nervous smile, awkward</w:t>
         <w:br/>
-        <w:t>Time in dog_pack.mp4: 83.07–86.57 s (3.5 s)</w:t>
+        <w:t>File: dog_pack.mp4, 83.07–86.57 s (3.5 s)</w:t>
         <w:br/>
         <w:t>Sound: low voice ~189 Hz (human or bark - check)</w:t>
       </w:r>
@@ -2216,8 +2958,8 @@
       <w:r>
         <w:drawing>
           <wp:inline xmlns:a="http://schemas.openxmlformats.org/drawingml/2006/main" xmlns:pic="http://schemas.openxmlformats.org/drawingml/2006/picture">
-            <wp:extent cx="1126485" cy="1828800"/>
-            <wp:docPr id="42" name="Picture 42"/>
+            <wp:extent cx="1121103" cy="1828800"/>
+            <wp:docPr id="56" name="Picture 56"/>
             <wp:cNvGraphicFramePr>
               <a:graphicFrameLocks noChangeAspect="1"/>
             </wp:cNvGraphicFramePr>
@@ -2229,7 +2971,7 @@
                     <pic:cNvPicPr/>
                   </pic:nvPicPr>
                   <pic:blipFill>
-                    <a:blip r:embed="rId50"/>
+                    <a:blip r:embed="rId64"/>
                     <a:stretch>
                       <a:fillRect/>
                     </a:stretch>
@@ -2237,7 +2979,7 @@
                   <pic:spPr>
                     <a:xfrm>
                       <a:off x="0" y="0"/>
-                      <a:ext cx="1126485" cy="1828800"/>
+                      <a:ext cx="1121103" cy="1828800"/>
                     </a:xfrm>
                     <a:prstGeom prst="rect"/>
                   </pic:spPr>
@@ -2252,7 +2994,7 @@
       <w:r>
         <w:t>Good for: happy, friendly</w:t>
         <w:br/>
-        <w:t>Time in dog_pack.mp4: 86.57–97.33 s (10.8 s)</w:t>
+        <w:t>File: dog_pack.mp4, 86.57–97.33 s (10.8 s)</w:t>
         <w:br/>
         <w:t>Sound: silent</w:t>
       </w:r>
@@ -2269,8 +3011,8 @@
       <w:r>
         <w:drawing>
           <wp:inline xmlns:a="http://schemas.openxmlformats.org/drawingml/2006/main" xmlns:pic="http://schemas.openxmlformats.org/drawingml/2006/picture">
-            <wp:extent cx="891782" cy="1828800"/>
-            <wp:docPr id="43" name="Picture 43"/>
+            <wp:extent cx="888459" cy="1828800"/>
+            <wp:docPr id="57" name="Picture 57"/>
             <wp:cNvGraphicFramePr>
               <a:graphicFrameLocks noChangeAspect="1"/>
             </wp:cNvGraphicFramePr>
@@ -2282,7 +3024,7 @@
                     <pic:cNvPicPr/>
                   </pic:nvPicPr>
                   <pic:blipFill>
-                    <a:blip r:embed="rId51"/>
+                    <a:blip r:embed="rId65"/>
                     <a:stretch>
                       <a:fillRect/>
                     </a:stretch>
@@ -2290,7 +3032,7 @@
                   <pic:spPr>
                     <a:xfrm>
                       <a:off x="0" y="0"/>
-                      <a:ext cx="891782" cy="1828800"/>
+                      <a:ext cx="888459" cy="1828800"/>
                     </a:xfrm>
                     <a:prstGeom prst="rect"/>
                   </pic:spPr>
@@ -2305,7 +3047,7 @@
       <w:r>
         <w:t>Good for: funny, silly, surprised</w:t>
         <w:br/>
-        <w:t>Time in dog_pack.mp4: 97.33–104.20 s (6.9 s)</w:t>
+        <w:t>File: dog_pack.mp4, 97.33–104.20 s (6.9 s)</w:t>
         <w:br/>
         <w:t>Sound: animal sound (~842 Hz)</w:t>
       </w:r>
@@ -2322,8 +3064,8 @@
       <w:r>
         <w:drawing>
           <wp:inline xmlns:a="http://schemas.openxmlformats.org/drawingml/2006/main" xmlns:pic="http://schemas.openxmlformats.org/drawingml/2006/picture">
-            <wp:extent cx="1343890" cy="1828800"/>
-            <wp:docPr id="44" name="Picture 44"/>
+            <wp:extent cx="1342047" cy="1828800"/>
+            <wp:docPr id="58" name="Picture 58"/>
             <wp:cNvGraphicFramePr>
               <a:graphicFrameLocks noChangeAspect="1"/>
             </wp:cNvGraphicFramePr>
@@ -2335,7 +3077,7 @@
                     <pic:cNvPicPr/>
                   </pic:nvPicPr>
                   <pic:blipFill>
-                    <a:blip r:embed="rId52"/>
+                    <a:blip r:embed="rId66"/>
                     <a:stretch>
                       <a:fillRect/>
                     </a:stretch>
@@ -2343,7 +3085,7 @@
                   <pic:spPr>
                     <a:xfrm>
                       <a:off x="0" y="0"/>
-                      <a:ext cx="1343890" cy="1828800"/>
+                      <a:ext cx="1342047" cy="1828800"/>
                     </a:xfrm>
                     <a:prstGeom prst="rect"/>
                   </pic:spPr>
@@ -2358,7 +3100,7 @@
       <w:r>
         <w:t>Good for: eating, hungry, happy child</w:t>
         <w:br/>
-        <w:t>Time in dog_pack.mp4: 104.20–111.00 s (6.8 s)</w:t>
+        <w:t>File: dog_pack.mp4, 104.20–111.00 s (6.8 s)</w:t>
         <w:br/>
         <w:t>Sound: silent</w:t>
       </w:r>
@@ -2376,7 +3118,7 @@
         <w:drawing>
           <wp:inline xmlns:a="http://schemas.openxmlformats.org/drawingml/2006/main" xmlns:pic="http://schemas.openxmlformats.org/drawingml/2006/picture">
             <wp:extent cx="1599464" cy="1828800"/>
-            <wp:docPr id="45" name="Picture 45"/>
+            <wp:docPr id="59" name="Picture 59"/>
             <wp:cNvGraphicFramePr>
               <a:graphicFrameLocks noChangeAspect="1"/>
             </wp:cNvGraphicFramePr>
@@ -2388,7 +3130,7 @@
                     <pic:cNvPicPr/>
                   </pic:nvPicPr>
                   <pic:blipFill>
-                    <a:blip r:embed="rId53"/>
+                    <a:blip r:embed="rId67"/>
                     <a:stretch>
                       <a:fillRect/>
                     </a:stretch>
@@ -2411,7 +3153,7 @@
       <w:r>
         <w:t>Good for: awkward, guilty grin</w:t>
         <w:br/>
-        <w:t>Time in dog_pack.mp4: 111.00–117.20 s (6.2 s)</w:t>
+        <w:t>File: dog_pack.mp4, 111.00–117.20 s (6.2 s)</w:t>
         <w:br/>
         <w:t>Sound: low voice ~179 Hz (human or bark - check)</w:t>
       </w:r>
@@ -2429,7 +3171,7 @@
         <w:drawing>
           <wp:inline xmlns:a="http://schemas.openxmlformats.org/drawingml/2006/main" xmlns:pic="http://schemas.openxmlformats.org/drawingml/2006/picture">
             <wp:extent cx="1731761" cy="1828800"/>
-            <wp:docPr id="46" name="Picture 46"/>
+            <wp:docPr id="60" name="Picture 60"/>
             <wp:cNvGraphicFramePr>
               <a:graphicFrameLocks noChangeAspect="1"/>
             </wp:cNvGraphicFramePr>
@@ -2441,7 +3183,7 @@
                     <pic:cNvPicPr/>
                   </pic:nvPicPr>
                   <pic:blipFill>
-                    <a:blip r:embed="rId54"/>
+                    <a:blip r:embed="rId68"/>
                     <a:stretch>
                       <a:fillRect/>
                     </a:stretch>
@@ -2464,7 +3206,7 @@
       <w:r>
         <w:t>Good for: phone call, farmer, grandpa</w:t>
         <w:br/>
-        <w:t>Time in dog_pack.mp4: 117.20–123.30 s (6.1 s)</w:t>
+        <w:t>File: dog_pack.mp4, 117.20–123.30 s (6.1 s)</w:t>
         <w:br/>
         <w:t>Sound: animal sound (~390 Hz)</w:t>
       </w:r>
@@ -2481,8 +3223,8 @@
       <w:r>
         <w:drawing>
           <wp:inline xmlns:a="http://schemas.openxmlformats.org/drawingml/2006/main" xmlns:pic="http://schemas.openxmlformats.org/drawingml/2006/picture">
-            <wp:extent cx="1756925" cy="1828800"/>
-            <wp:docPr id="47" name="Picture 47"/>
+            <wp:extent cx="1748236" cy="1828800"/>
+            <wp:docPr id="61" name="Picture 61"/>
             <wp:cNvGraphicFramePr>
               <a:graphicFrameLocks noChangeAspect="1"/>
             </wp:cNvGraphicFramePr>
@@ -2494,7 +3236,7 @@
                     <pic:cNvPicPr/>
                   </pic:nvPicPr>
                   <pic:blipFill>
-                    <a:blip r:embed="rId55"/>
+                    <a:blip r:embed="rId69"/>
                     <a:stretch>
                       <a:fillRect/>
                     </a:stretch>
@@ -2502,7 +3244,7 @@
                   <pic:spPr>
                     <a:xfrm>
                       <a:off x="0" y="0"/>
-                      <a:ext cx="1756925" cy="1828800"/>
+                      <a:ext cx="1748236" cy="1828800"/>
                     </a:xfrm>
                     <a:prstGeom prst="rect"/>
                   </pic:spPr>
@@ -2517,7 +3259,7 @@
       <w:r>
         <w:t>Good for: stern, disappointed</w:t>
         <w:br/>
-        <w:t>Time in dog_pack.mp4: 123.30–129.73 s (6.4 s)</w:t>
+        <w:t>File: dog_pack.mp4, 123.30–129.73 s (6.4 s)</w:t>
         <w:br/>
         <w:t>Sound: animal sound (~1143 Hz)</w:t>
       </w:r>
@@ -2534,8 +3276,8 @@
       <w:r>
         <w:drawing>
           <wp:inline xmlns:a="http://schemas.openxmlformats.org/drawingml/2006/main" xmlns:pic="http://schemas.openxmlformats.org/drawingml/2006/picture">
-            <wp:extent cx="856034" cy="1828800"/>
-            <wp:docPr id="48" name="Picture 48"/>
+            <wp:extent cx="849085" cy="1828800"/>
+            <wp:docPr id="62" name="Picture 62"/>
             <wp:cNvGraphicFramePr>
               <a:graphicFrameLocks noChangeAspect="1"/>
             </wp:cNvGraphicFramePr>
@@ -2547,7 +3289,7 @@
                     <pic:cNvPicPr/>
                   </pic:nvPicPr>
                   <pic:blipFill>
-                    <a:blip r:embed="rId56"/>
+                    <a:blip r:embed="rId70"/>
                     <a:stretch>
                       <a:fillRect/>
                     </a:stretch>
@@ -2555,7 +3297,7 @@
                   <pic:spPr>
                     <a:xfrm>
                       <a:off x="0" y="0"/>
-                      <a:ext cx="856034" cy="1828800"/>
+                      <a:ext cx="849085" cy="1828800"/>
                     </a:xfrm>
                     <a:prstGeom prst="rect"/>
                   </pic:spPr>
@@ -2570,7 +3312,7 @@
       <w:r>
         <w:t>Good for: standing, waiting, guard</w:t>
         <w:br/>
-        <w:t>Time in dog_pack.mp4: 129.73–136.50 s (6.8 s)</w:t>
+        <w:t>File: dog_pack.mp4, 129.73–136.50 s (6.8 s)</w:t>
         <w:br/>
         <w:t>Sound: silent</w:t>
       </w:r>
@@ -2587,8 +3329,8 @@
       <w:r>
         <w:drawing>
           <wp:inline xmlns:a="http://schemas.openxmlformats.org/drawingml/2006/main" xmlns:pic="http://schemas.openxmlformats.org/drawingml/2006/picture">
-            <wp:extent cx="904351" cy="1828800"/>
-            <wp:docPr id="49" name="Picture 49"/>
+            <wp:extent cx="897529" cy="1828800"/>
+            <wp:docPr id="63" name="Picture 63"/>
             <wp:cNvGraphicFramePr>
               <a:graphicFrameLocks noChangeAspect="1"/>
             </wp:cNvGraphicFramePr>
@@ -2600,7 +3342,7 @@
                     <pic:cNvPicPr/>
                   </pic:nvPicPr>
                   <pic:blipFill>
-                    <a:blip r:embed="rId57"/>
+                    <a:blip r:embed="rId71"/>
                     <a:stretch>
                       <a:fillRect/>
                     </a:stretch>
@@ -2608,7 +3350,7 @@
                   <pic:spPr>
                     <a:xfrm>
                       <a:off x="0" y="0"/>
-                      <a:ext cx="904351" cy="1828800"/>
+                      <a:ext cx="897529" cy="1828800"/>
                     </a:xfrm>
                     <a:prstGeom prst="rect"/>
                   </pic:spPr>
@@ -2623,7 +3365,7 @@
       <w:r>
         <w:t>Good for: standing, waiting</w:t>
         <w:br/>
-        <w:t>Time in dog_pack.mp4: 136.50–139.17 s (2.7 s)</w:t>
+        <w:t>File: dog_pack.mp4, 136.50–139.17 s (2.7 s)</w:t>
         <w:br/>
         <w:t>Sound: silent</w:t>
       </w:r>
@@ -2640,8 +3382,8 @@
       <w:r>
         <w:drawing>
           <wp:inline xmlns:a="http://schemas.openxmlformats.org/drawingml/2006/main" xmlns:pic="http://schemas.openxmlformats.org/drawingml/2006/picture">
-            <wp:extent cx="1159273" cy="1828800"/>
-            <wp:docPr id="50" name="Picture 50"/>
+            <wp:extent cx="1160944" cy="1828800"/>
+            <wp:docPr id="64" name="Picture 64"/>
             <wp:cNvGraphicFramePr>
               <a:graphicFrameLocks noChangeAspect="1"/>
             </wp:cNvGraphicFramePr>
@@ -2653,7 +3395,7 @@
                     <pic:cNvPicPr/>
                   </pic:nvPicPr>
                   <pic:blipFill>
-                    <a:blip r:embed="rId58"/>
+                    <a:blip r:embed="rId72"/>
                     <a:stretch>
                       <a:fillRect/>
                     </a:stretch>
@@ -2661,7 +3403,7 @@
                   <pic:spPr>
                     <a:xfrm>
                       <a:off x="0" y="0"/>
-                      <a:ext cx="1159273" cy="1828800"/>
+                      <a:ext cx="1160944" cy="1828800"/>
                     </a:xfrm>
                     <a:prstGeom prst="rect"/>
                   </pic:spPr>
@@ -2676,7 +3418,7 @@
       <w:r>
         <w:t>Good for: crying out, singing, missing someone</w:t>
         <w:br/>
-        <w:t>Time in dog_pack.mp4: 139.17–145.63 s (6.5 s)</w:t>
+        <w:t>File: dog_pack.mp4, 139.17–145.63 s (6.5 s)</w:t>
         <w:br/>
         <w:t>Sound: animal sound (~400 Hz)</w:t>
       </w:r>
@@ -2693,8 +3435,8 @@
       <w:r>
         <w:drawing>
           <wp:inline xmlns:a="http://schemas.openxmlformats.org/drawingml/2006/main" xmlns:pic="http://schemas.openxmlformats.org/drawingml/2006/picture">
-            <wp:extent cx="1178416" cy="1828800"/>
-            <wp:docPr id="51" name="Picture 51"/>
+            <wp:extent cx="1180289" cy="1828800"/>
+            <wp:docPr id="65" name="Picture 65"/>
             <wp:cNvGraphicFramePr>
               <a:graphicFrameLocks noChangeAspect="1"/>
             </wp:cNvGraphicFramePr>
@@ -2706,7 +3448,7 @@
                     <pic:cNvPicPr/>
                   </pic:nvPicPr>
                   <pic:blipFill>
-                    <a:blip r:embed="rId59"/>
+                    <a:blip r:embed="rId73"/>
                     <a:stretch>
                       <a:fillRect/>
                     </a:stretch>
@@ -2714,7 +3456,7 @@
                   <pic:spPr>
                     <a:xfrm>
                       <a:off x="0" y="0"/>
-                      <a:ext cx="1178416" cy="1828800"/>
+                      <a:ext cx="1180289" cy="1828800"/>
                     </a:xfrm>
                     <a:prstGeom prst="rect"/>
                   </pic:spPr>
@@ -2729,7 +3471,7 @@
       <w:r>
         <w:t>Good for: polite, waiting, listening</w:t>
         <w:br/>
-        <w:t>Time in dog_pack.mp4: 145.63–155.43 s (9.8 s)</w:t>
+        <w:t>File: dog_pack.mp4, 145.63–155.43 s (9.8 s)</w:t>
         <w:br/>
         <w:t>Sound: animal sound (~593 Hz)</w:t>
       </w:r>
@@ -2746,8 +3488,8 @@
       <w:r>
         <w:drawing>
           <wp:inline xmlns:a="http://schemas.openxmlformats.org/drawingml/2006/main" xmlns:pic="http://schemas.openxmlformats.org/drawingml/2006/picture">
-            <wp:extent cx="1053737" cy="1828800"/>
-            <wp:docPr id="52" name="Picture 52"/>
+            <wp:extent cx="910024" cy="1828800"/>
+            <wp:docPr id="66" name="Picture 66"/>
             <wp:cNvGraphicFramePr>
               <a:graphicFrameLocks noChangeAspect="1"/>
             </wp:cNvGraphicFramePr>
@@ -2759,7 +3501,7 @@
                     <pic:cNvPicPr/>
                   </pic:nvPicPr>
                   <pic:blipFill>
-                    <a:blip r:embed="rId60"/>
+                    <a:blip r:embed="rId74"/>
                     <a:stretch>
                       <a:fillRect/>
                     </a:stretch>
@@ -2767,7 +3509,7 @@
                   <pic:spPr>
                     <a:xfrm>
                       <a:off x="0" y="0"/>
-                      <a:ext cx="1053737" cy="1828800"/>
+                      <a:ext cx="910024" cy="1828800"/>
                     </a:xfrm>
                     <a:prstGeom prst="rect"/>
                   </pic:spPr>
@@ -2782,7 +3524,7 @@
       <w:r>
         <w:t>Good for: begging, reaching up</w:t>
         <w:br/>
-        <w:t>Time in dog_pack.mp4: 155.43–158.73 s (3.3 s)</w:t>
+        <w:t>File: dog_pack.mp4, 155.43–158.73 s (3.3 s)</w:t>
         <w:br/>
         <w:t>Sound: silent</w:t>
       </w:r>
@@ -2799,8 +3541,8 @@
       <w:r>
         <w:drawing>
           <wp:inline xmlns:a="http://schemas.openxmlformats.org/drawingml/2006/main" xmlns:pic="http://schemas.openxmlformats.org/drawingml/2006/picture">
-            <wp:extent cx="1110953" cy="1828799"/>
-            <wp:docPr id="53" name="Picture 53"/>
+            <wp:extent cx="1104181" cy="1828800"/>
+            <wp:docPr id="67" name="Picture 67"/>
             <wp:cNvGraphicFramePr>
               <a:graphicFrameLocks noChangeAspect="1"/>
             </wp:cNvGraphicFramePr>
@@ -2812,7 +3554,7 @@
                     <pic:cNvPicPr/>
                   </pic:nvPicPr>
                   <pic:blipFill>
-                    <a:blip r:embed="rId61"/>
+                    <a:blip r:embed="rId75"/>
                     <a:stretch>
                       <a:fillRect/>
                     </a:stretch>
@@ -2820,7 +3562,7 @@
                   <pic:spPr>
                     <a:xfrm>
                       <a:off x="0" y="0"/>
-                      <a:ext cx="1110953" cy="1828799"/>
+                      <a:ext cx="1104181" cy="1828800"/>
                     </a:xfrm>
                     <a:prstGeom prst="rect"/>
                   </pic:spPr>
@@ -2835,7 +3577,7 @@
       <w:r>
         <w:t>Good for: baby, small, lost</w:t>
         <w:br/>
-        <w:t>Time in dog_pack.mp4: 158.73–162.00 s (3.3 s)</w:t>
+        <w:t>File: dog_pack.mp4, 158.73–162.00 s (3.3 s)</w:t>
         <w:br/>
         <w:t>Sound: noise / effects (no clear voice)</w:t>
       </w:r>
@@ -2852,8 +3594,8 @@
       <w:r>
         <w:drawing>
           <wp:inline xmlns:a="http://schemas.openxmlformats.org/drawingml/2006/main" xmlns:pic="http://schemas.openxmlformats.org/drawingml/2006/picture">
-            <wp:extent cx="1328178" cy="1828800"/>
-            <wp:docPr id="54" name="Picture 54"/>
+            <wp:extent cx="1330036" cy="1828800"/>
+            <wp:docPr id="68" name="Picture 68"/>
             <wp:cNvGraphicFramePr>
               <a:graphicFrameLocks noChangeAspect="1"/>
             </wp:cNvGraphicFramePr>
@@ -2865,7 +3607,7 @@
                     <pic:cNvPicPr/>
                   </pic:nvPicPr>
                   <pic:blipFill>
-                    <a:blip r:embed="rId62"/>
+                    <a:blip r:embed="rId76"/>
                     <a:stretch>
                       <a:fillRect/>
                     </a:stretch>
@@ -2873,7 +3615,7 @@
                   <pic:spPr>
                     <a:xfrm>
                       <a:off x="0" y="0"/>
-                      <a:ext cx="1328178" cy="1828800"/>
+                      <a:ext cx="1330036" cy="1828800"/>
                     </a:xfrm>
                     <a:prstGeom prst="rect"/>
                   </pic:spPr>
@@ -2888,7 +3630,7 @@
       <w:r>
         <w:t>Good for: small, lonely, walking</w:t>
         <w:br/>
-        <w:t>Time in dog_pack.mp4: 162.00–167.57 s (5.6 s)</w:t>
+        <w:t>File: dog_pack.mp4, 162.00–167.57 s (5.6 s)</w:t>
         <w:br/>
         <w:t>Sound: silent</w:t>
       </w:r>
@@ -2905,8 +3647,8 @@
       <w:r>
         <w:drawing>
           <wp:inline xmlns:a="http://schemas.openxmlformats.org/drawingml/2006/main" xmlns:pic="http://schemas.openxmlformats.org/drawingml/2006/picture">
-            <wp:extent cx="1420238" cy="1828800"/>
-            <wp:docPr id="55" name="Picture 55"/>
+            <wp:extent cx="1445558" cy="1828800"/>
+            <wp:docPr id="69" name="Picture 69"/>
             <wp:cNvGraphicFramePr>
               <a:graphicFrameLocks noChangeAspect="1"/>
             </wp:cNvGraphicFramePr>
@@ -2918,7 +3660,7 @@
                     <pic:cNvPicPr/>
                   </pic:nvPicPr>
                   <pic:blipFill>
-                    <a:blip r:embed="rId63"/>
+                    <a:blip r:embed="rId77"/>
                     <a:stretch>
                       <a:fillRect/>
                     </a:stretch>
@@ -2926,7 +3668,7 @@
                   <pic:spPr>
                     <a:xfrm>
                       <a:off x="0" y="0"/>
-                      <a:ext cx="1420238" cy="1828800"/>
+                      <a:ext cx="1445558" cy="1828800"/>
                     </a:xfrm>
                     <a:prstGeom prst="rect"/>
                   </pic:spPr>
@@ -2941,7 +3683,7 @@
       <w:r>
         <w:t>Good for: cozy, silly, child</w:t>
         <w:br/>
-        <w:t>Time in dog_pack.mp4: 167.57–175.13 s (7.6 s)</w:t>
+        <w:t>File: dog_pack.mp4, 167.57–175.13 s (7.6 s)</w:t>
         <w:br/>
         <w:t>Sound: animal sound (~1143 Hz)</w:t>
       </w:r>
@@ -2958,8 +3700,8 @@
       <w:r>
         <w:drawing>
           <wp:inline xmlns:a="http://schemas.openxmlformats.org/drawingml/2006/main" xmlns:pic="http://schemas.openxmlformats.org/drawingml/2006/picture">
-            <wp:extent cx="1515907" cy="1828800"/>
-            <wp:docPr id="56" name="Picture 56"/>
+            <wp:extent cx="1509571" cy="1828800"/>
+            <wp:docPr id="70" name="Picture 70"/>
             <wp:cNvGraphicFramePr>
               <a:graphicFrameLocks noChangeAspect="1"/>
             </wp:cNvGraphicFramePr>
@@ -2971,7 +3713,7 @@
                     <pic:cNvPicPr/>
                   </pic:nvPicPr>
                   <pic:blipFill>
-                    <a:blip r:embed="rId64"/>
+                    <a:blip r:embed="rId78"/>
                     <a:stretch>
                       <a:fillRect/>
                     </a:stretch>
@@ -2979,7 +3721,7 @@
                   <pic:spPr>
                     <a:xfrm>
                       <a:off x="0" y="0"/>
-                      <a:ext cx="1515907" cy="1828800"/>
+                      <a:ext cx="1509571" cy="1828800"/>
                     </a:xfrm>
                     <a:prstGeom prst="rect"/>
                   </pic:spPr>
@@ -2994,7 +3736,7 @@
       <w:r>
         <w:t>Good for: relaxed, boss, chilling</w:t>
         <w:br/>
-        <w:t>Time in dog_pack.mp4: 175.13–179.13 s (4.0 s)</w:t>
+        <w:t>File: dog_pack.mp4, 175.13–179.13 s (4.0 s)</w:t>
         <w:br/>
         <w:t>Sound: silent</w:t>
       </w:r>
@@ -3011,8 +3753,8 @@
       <w:r>
         <w:drawing>
           <wp:inline xmlns:a="http://schemas.openxmlformats.org/drawingml/2006/main" xmlns:pic="http://schemas.openxmlformats.org/drawingml/2006/picture">
-            <wp:extent cx="2160717" cy="1828800"/>
-            <wp:docPr id="57" name="Picture 57"/>
+            <wp:extent cx="2161902" cy="1828800"/>
+            <wp:docPr id="71" name="Picture 71"/>
             <wp:cNvGraphicFramePr>
               <a:graphicFrameLocks noChangeAspect="1"/>
             </wp:cNvGraphicFramePr>
@@ -3024,7 +3766,7 @@
                     <pic:cNvPicPr/>
                   </pic:nvPicPr>
                   <pic:blipFill>
-                    <a:blip r:embed="rId65"/>
+                    <a:blip r:embed="rId79"/>
                     <a:stretch>
                       <a:fillRect/>
                     </a:stretch>
@@ -3032,7 +3774,7 @@
                   <pic:spPr>
                     <a:xfrm>
                       <a:off x="0" y="0"/>
-                      <a:ext cx="2160717" cy="1828800"/>
+                      <a:ext cx="2161902" cy="1828800"/>
                     </a:xfrm>
                     <a:prstGeom prst="rect"/>
                   </pic:spPr>
@@ -3047,7 +3789,7 @@
       <w:r>
         <w:t>Good for: office worker, call center, doctor, boss</w:t>
         <w:br/>
-        <w:t>Time in dog_pack.mp4: 179.13–185.57 s (6.4 s)</w:t>
+        <w:t>File: dog_pack.mp4, 179.13–185.57 s (6.4 s)</w:t>
         <w:br/>
         <w:t>Sound: low voice ~130 Hz (human or bark - check)</w:t>
       </w:r>
@@ -3064,8 +3806,8 @@
       <w:r>
         <w:drawing>
           <wp:inline xmlns:a="http://schemas.openxmlformats.org/drawingml/2006/main" xmlns:pic="http://schemas.openxmlformats.org/drawingml/2006/picture">
-            <wp:extent cx="1261533" cy="1828800"/>
-            <wp:docPr id="58" name="Picture 58"/>
+            <wp:extent cx="1241882" cy="1828800"/>
+            <wp:docPr id="72" name="Picture 72"/>
             <wp:cNvGraphicFramePr>
               <a:graphicFrameLocks noChangeAspect="1"/>
             </wp:cNvGraphicFramePr>
@@ -3077,7 +3819,7 @@
                     <pic:cNvPicPr/>
                   </pic:nvPicPr>
                   <pic:blipFill>
-                    <a:blip r:embed="rId66"/>
+                    <a:blip r:embed="rId80"/>
                     <a:stretch>
                       <a:fillRect/>
                     </a:stretch>
@@ -3085,7 +3827,7 @@
                   <pic:spPr>
                     <a:xfrm>
                       <a:off x="0" y="0"/>
-                      <a:ext cx="1261533" cy="1828800"/>
+                      <a:ext cx="1241882" cy="1828800"/>
                     </a:xfrm>
                     <a:prstGeom prst="rect"/>
                   </pic:spPr>
@@ -3100,7 +3842,7 @@
       <w:r>
         <w:t>Good for: crying, singing, lonely</w:t>
         <w:br/>
-        <w:t>Time in dog_pack.mp4: 185.57–191.37 s (5.8 s)</w:t>
+        <w:t>File: dog_pack.mp4, 185.57–191.37 s (5.8 s)</w:t>
         <w:br/>
         <w:t>Sound: low voice ~195 Hz (human or bark - check)</w:t>
       </w:r>

</xml_diff>

<commit_message>
POV kit: add yapapa cat (C44), v12 example, handoff update
</commit_message>
<xml_diff>
--- a/pov-meme-kit/CLIP_CATALOG.docx
+++ b/pov-meme-kit/CLIP_CATALOG.docx
@@ -2304,6 +2304,59 @@
     </w:p>
     <w:p>
       <w:pPr>
+        <w:pStyle w:val="Heading2"/>
+      </w:pPr>
+      <w:r>
+        <w:t>44. Clip C44 — 'Yapapa' orange cat singing with eyes closed, head bobbing</w:t>
+      </w:r>
+    </w:p>
+    <w:p>
+      <w:r>
+        <w:drawing>
+          <wp:inline xmlns:a="http://schemas.openxmlformats.org/drawingml/2006/main" xmlns:pic="http://schemas.openxmlformats.org/drawingml/2006/picture">
+            <wp:extent cx="1571716" cy="1828800"/>
+            <wp:docPr id="44" name="Picture 44"/>
+            <wp:cNvGraphicFramePr>
+              <a:graphicFrameLocks noChangeAspect="1"/>
+            </wp:cNvGraphicFramePr>
+            <a:graphic>
+              <a:graphicData uri="http://schemas.openxmlformats.org/drawingml/2006/picture">
+                <pic:pic>
+                  <pic:nvPicPr>
+                    <pic:cNvPr id="0" name="C44.jpg"/>
+                    <pic:cNvPicPr/>
+                  </pic:nvPicPr>
+                  <pic:blipFill>
+                    <a:blip r:embed="rId52"/>
+                    <a:stretch>
+                      <a:fillRect/>
+                    </a:stretch>
+                  </pic:blipFill>
+                  <pic:spPr>
+                    <a:xfrm>
+                      <a:off x="0" y="0"/>
+                      <a:ext cx="1571716" cy="1828800"/>
+                    </a:xfrm>
+                    <a:prstGeom prst="rect"/>
+                  </pic:spPr>
+                </pic:pic>
+              </a:graphicData>
+            </a:graphic>
+          </wp:inline>
+        </w:drawing>
+      </w:r>
+    </w:p>
+    <w:p>
+      <w:r>
+        <w:t>Good for: singing, vibing, happy, cheeky (audio: the 'yapapa' meme song)</w:t>
+        <w:br/>
+        <w:t>File: cat_yapapa.mp4, 0.00–8.00 s (8.0 s)</w:t>
+        <w:br/>
+        <w:t>Sound: animal sound (~451 Hz)</w:t>
+      </w:r>
+    </w:p>
+    <w:p>
+      <w:pPr>
         <w:pStyle w:val="Heading1"/>
       </w:pPr>
       <w:r>
@@ -2323,7 +2376,7 @@
         <w:drawing>
           <wp:inline xmlns:a="http://schemas.openxmlformats.org/drawingml/2006/main" xmlns:pic="http://schemas.openxmlformats.org/drawingml/2006/picture">
             <wp:extent cx="925830" cy="1828800"/>
-            <wp:docPr id="44" name="Picture 44"/>
+            <wp:docPr id="45" name="Picture 45"/>
             <wp:cNvGraphicFramePr>
               <a:graphicFrameLocks noChangeAspect="1"/>
             </wp:cNvGraphicFramePr>
@@ -2335,7 +2388,7 @@
                     <pic:cNvPicPr/>
                   </pic:nvPicPr>
                   <pic:blipFill>
-                    <a:blip r:embed="rId52"/>
+                    <a:blip r:embed="rId53"/>
                     <a:stretch>
                       <a:fillRect/>
                     </a:stretch>
@@ -2376,7 +2429,7 @@
         <w:drawing>
           <wp:inline xmlns:a="http://schemas.openxmlformats.org/drawingml/2006/main" xmlns:pic="http://schemas.openxmlformats.org/drawingml/2006/picture">
             <wp:extent cx="1234830" cy="1828800"/>
-            <wp:docPr id="45" name="Picture 45"/>
+            <wp:docPr id="46" name="Picture 46"/>
             <wp:cNvGraphicFramePr>
               <a:graphicFrameLocks noChangeAspect="1"/>
             </wp:cNvGraphicFramePr>
@@ -2388,7 +2441,7 @@
                     <pic:cNvPicPr/>
                   </pic:nvPicPr>
                   <pic:blipFill>
-                    <a:blip r:embed="rId53"/>
+                    <a:blip r:embed="rId54"/>
                     <a:stretch>
                       <a:fillRect/>
                     </a:stretch>
@@ -2429,7 +2482,7 @@
         <w:drawing>
           <wp:inline xmlns:a="http://schemas.openxmlformats.org/drawingml/2006/main" xmlns:pic="http://schemas.openxmlformats.org/drawingml/2006/picture">
             <wp:extent cx="1369834" cy="1828800"/>
-            <wp:docPr id="46" name="Picture 46"/>
+            <wp:docPr id="47" name="Picture 47"/>
             <wp:cNvGraphicFramePr>
               <a:graphicFrameLocks noChangeAspect="1"/>
             </wp:cNvGraphicFramePr>
@@ -2441,7 +2494,7 @@
                     <pic:cNvPicPr/>
                   </pic:nvPicPr>
                   <pic:blipFill>
-                    <a:blip r:embed="rId54"/>
+                    <a:blip r:embed="rId55"/>
                     <a:stretch>
                       <a:fillRect/>
                     </a:stretch>
@@ -2482,7 +2535,7 @@
         <w:drawing>
           <wp:inline xmlns:a="http://schemas.openxmlformats.org/drawingml/2006/main" xmlns:pic="http://schemas.openxmlformats.org/drawingml/2006/picture">
             <wp:extent cx="2377440" cy="1320800"/>
-            <wp:docPr id="47" name="Picture 47"/>
+            <wp:docPr id="48" name="Picture 48"/>
             <wp:cNvGraphicFramePr>
               <a:graphicFrameLocks noChangeAspect="1"/>
             </wp:cNvGraphicFramePr>
@@ -2494,7 +2547,7 @@
                     <pic:cNvPicPr/>
                   </pic:nvPicPr>
                   <pic:blipFill>
-                    <a:blip r:embed="rId55"/>
+                    <a:blip r:embed="rId56"/>
                     <a:stretch>
                       <a:fillRect/>
                     </a:stretch>
@@ -2535,7 +2588,7 @@
         <w:drawing>
           <wp:inline xmlns:a="http://schemas.openxmlformats.org/drawingml/2006/main" xmlns:pic="http://schemas.openxmlformats.org/drawingml/2006/picture">
             <wp:extent cx="2377440" cy="1804223"/>
-            <wp:docPr id="48" name="Picture 48"/>
+            <wp:docPr id="49" name="Picture 49"/>
             <wp:cNvGraphicFramePr>
               <a:graphicFrameLocks noChangeAspect="1"/>
             </wp:cNvGraphicFramePr>
@@ -2547,7 +2600,7 @@
                     <pic:cNvPicPr/>
                   </pic:nvPicPr>
                   <pic:blipFill>
-                    <a:blip r:embed="rId56"/>
+                    <a:blip r:embed="rId57"/>
                     <a:stretch>
                       <a:fillRect/>
                     </a:stretch>
@@ -2588,7 +2641,7 @@
         <w:drawing>
           <wp:inline xmlns:a="http://schemas.openxmlformats.org/drawingml/2006/main" xmlns:pic="http://schemas.openxmlformats.org/drawingml/2006/picture">
             <wp:extent cx="1228506" cy="1828800"/>
-            <wp:docPr id="49" name="Picture 49"/>
+            <wp:docPr id="50" name="Picture 50"/>
             <wp:cNvGraphicFramePr>
               <a:graphicFrameLocks noChangeAspect="1"/>
             </wp:cNvGraphicFramePr>
@@ -2600,7 +2653,7 @@
                     <pic:cNvPicPr/>
                   </pic:nvPicPr>
                   <pic:blipFill>
-                    <a:blip r:embed="rId57"/>
+                    <a:blip r:embed="rId58"/>
                     <a:stretch>
                       <a:fillRect/>
                     </a:stretch>
@@ -2641,7 +2694,7 @@
         <w:drawing>
           <wp:inline xmlns:a="http://schemas.openxmlformats.org/drawingml/2006/main" xmlns:pic="http://schemas.openxmlformats.org/drawingml/2006/picture">
             <wp:extent cx="1267968" cy="1828800"/>
-            <wp:docPr id="50" name="Picture 50"/>
+            <wp:docPr id="51" name="Picture 51"/>
             <wp:cNvGraphicFramePr>
               <a:graphicFrameLocks noChangeAspect="1"/>
             </wp:cNvGraphicFramePr>
@@ -2653,7 +2706,7 @@
                     <pic:cNvPicPr/>
                   </pic:nvPicPr>
                   <pic:blipFill>
-                    <a:blip r:embed="rId58"/>
+                    <a:blip r:embed="rId59"/>
                     <a:stretch>
                       <a:fillRect/>
                     </a:stretch>
@@ -2694,7 +2747,7 @@
         <w:drawing>
           <wp:inline xmlns:a="http://schemas.openxmlformats.org/drawingml/2006/main" xmlns:pic="http://schemas.openxmlformats.org/drawingml/2006/picture">
             <wp:extent cx="1455174" cy="1828800"/>
-            <wp:docPr id="51" name="Picture 51"/>
+            <wp:docPr id="52" name="Picture 52"/>
             <wp:cNvGraphicFramePr>
               <a:graphicFrameLocks noChangeAspect="1"/>
             </wp:cNvGraphicFramePr>
@@ -2706,7 +2759,7 @@
                     <pic:cNvPicPr/>
                   </pic:nvPicPr>
                   <pic:blipFill>
-                    <a:blip r:embed="rId59"/>
+                    <a:blip r:embed="rId60"/>
                     <a:stretch>
                       <a:fillRect/>
                     </a:stretch>
@@ -2747,7 +2800,7 @@
         <w:drawing>
           <wp:inline xmlns:a="http://schemas.openxmlformats.org/drawingml/2006/main" xmlns:pic="http://schemas.openxmlformats.org/drawingml/2006/picture">
             <wp:extent cx="897894" cy="1828800"/>
-            <wp:docPr id="52" name="Picture 52"/>
+            <wp:docPr id="53" name="Picture 53"/>
             <wp:cNvGraphicFramePr>
               <a:graphicFrameLocks noChangeAspect="1"/>
             </wp:cNvGraphicFramePr>
@@ -2759,7 +2812,7 @@
                     <pic:cNvPicPr/>
                   </pic:nvPicPr>
                   <pic:blipFill>
-                    <a:blip r:embed="rId60"/>
+                    <a:blip r:embed="rId61"/>
                     <a:stretch>
                       <a:fillRect/>
                     </a:stretch>
@@ -2800,7 +2853,7 @@
         <w:drawing>
           <wp:inline xmlns:a="http://schemas.openxmlformats.org/drawingml/2006/main" xmlns:pic="http://schemas.openxmlformats.org/drawingml/2006/picture">
             <wp:extent cx="1066261" cy="1828800"/>
-            <wp:docPr id="53" name="Picture 53"/>
+            <wp:docPr id="54" name="Picture 54"/>
             <wp:cNvGraphicFramePr>
               <a:graphicFrameLocks noChangeAspect="1"/>
             </wp:cNvGraphicFramePr>
@@ -2812,7 +2865,7 @@
                     <pic:cNvPicPr/>
                   </pic:nvPicPr>
                   <pic:blipFill>
-                    <a:blip r:embed="rId61"/>
+                    <a:blip r:embed="rId62"/>
                     <a:stretch>
                       <a:fillRect/>
                     </a:stretch>
@@ -2853,7 +2906,7 @@
         <w:drawing>
           <wp:inline xmlns:a="http://schemas.openxmlformats.org/drawingml/2006/main" xmlns:pic="http://schemas.openxmlformats.org/drawingml/2006/picture">
             <wp:extent cx="1318437" cy="1828800"/>
-            <wp:docPr id="54" name="Picture 54"/>
+            <wp:docPr id="55" name="Picture 55"/>
             <wp:cNvGraphicFramePr>
               <a:graphicFrameLocks noChangeAspect="1"/>
             </wp:cNvGraphicFramePr>
@@ -2865,7 +2918,7 @@
                     <pic:cNvPicPr/>
                   </pic:nvPicPr>
                   <pic:blipFill>
-                    <a:blip r:embed="rId62"/>
+                    <a:blip r:embed="rId63"/>
                     <a:stretch>
                       <a:fillRect/>
                     </a:stretch>
@@ -2906,7 +2959,7 @@
         <w:drawing>
           <wp:inline xmlns:a="http://schemas.openxmlformats.org/drawingml/2006/main" xmlns:pic="http://schemas.openxmlformats.org/drawingml/2006/picture">
             <wp:extent cx="1081548" cy="1828800"/>
-            <wp:docPr id="55" name="Picture 55"/>
+            <wp:docPr id="56" name="Picture 56"/>
             <wp:cNvGraphicFramePr>
               <a:graphicFrameLocks noChangeAspect="1"/>
             </wp:cNvGraphicFramePr>
@@ -2918,7 +2971,7 @@
                     <pic:cNvPicPr/>
                   </pic:nvPicPr>
                   <pic:blipFill>
-                    <a:blip r:embed="rId63"/>
+                    <a:blip r:embed="rId64"/>
                     <a:stretch>
                       <a:fillRect/>
                     </a:stretch>
@@ -2959,7 +3012,7 @@
         <w:drawing>
           <wp:inline xmlns:a="http://schemas.openxmlformats.org/drawingml/2006/main" xmlns:pic="http://schemas.openxmlformats.org/drawingml/2006/picture">
             <wp:extent cx="1121103" cy="1828800"/>
-            <wp:docPr id="56" name="Picture 56"/>
+            <wp:docPr id="57" name="Picture 57"/>
             <wp:cNvGraphicFramePr>
               <a:graphicFrameLocks noChangeAspect="1"/>
             </wp:cNvGraphicFramePr>
@@ -2971,7 +3024,7 @@
                     <pic:cNvPicPr/>
                   </pic:nvPicPr>
                   <pic:blipFill>
-                    <a:blip r:embed="rId64"/>
+                    <a:blip r:embed="rId65"/>
                     <a:stretch>
                       <a:fillRect/>
                     </a:stretch>
@@ -3012,7 +3065,7 @@
         <w:drawing>
           <wp:inline xmlns:a="http://schemas.openxmlformats.org/drawingml/2006/main" xmlns:pic="http://schemas.openxmlformats.org/drawingml/2006/picture">
             <wp:extent cx="888459" cy="1828800"/>
-            <wp:docPr id="57" name="Picture 57"/>
+            <wp:docPr id="58" name="Picture 58"/>
             <wp:cNvGraphicFramePr>
               <a:graphicFrameLocks noChangeAspect="1"/>
             </wp:cNvGraphicFramePr>
@@ -3024,7 +3077,7 @@
                     <pic:cNvPicPr/>
                   </pic:nvPicPr>
                   <pic:blipFill>
-                    <a:blip r:embed="rId65"/>
+                    <a:blip r:embed="rId66"/>
                     <a:stretch>
                       <a:fillRect/>
                     </a:stretch>
@@ -3065,7 +3118,7 @@
         <w:drawing>
           <wp:inline xmlns:a="http://schemas.openxmlformats.org/drawingml/2006/main" xmlns:pic="http://schemas.openxmlformats.org/drawingml/2006/picture">
             <wp:extent cx="1342047" cy="1828800"/>
-            <wp:docPr id="58" name="Picture 58"/>
+            <wp:docPr id="59" name="Picture 59"/>
             <wp:cNvGraphicFramePr>
               <a:graphicFrameLocks noChangeAspect="1"/>
             </wp:cNvGraphicFramePr>
@@ -3077,7 +3130,7 @@
                     <pic:cNvPicPr/>
                   </pic:nvPicPr>
                   <pic:blipFill>
-                    <a:blip r:embed="rId66"/>
+                    <a:blip r:embed="rId67"/>
                     <a:stretch>
                       <a:fillRect/>
                     </a:stretch>
@@ -3118,7 +3171,7 @@
         <w:drawing>
           <wp:inline xmlns:a="http://schemas.openxmlformats.org/drawingml/2006/main" xmlns:pic="http://schemas.openxmlformats.org/drawingml/2006/picture">
             <wp:extent cx="1599464" cy="1828800"/>
-            <wp:docPr id="59" name="Picture 59"/>
+            <wp:docPr id="60" name="Picture 60"/>
             <wp:cNvGraphicFramePr>
               <a:graphicFrameLocks noChangeAspect="1"/>
             </wp:cNvGraphicFramePr>
@@ -3130,7 +3183,7 @@
                     <pic:cNvPicPr/>
                   </pic:nvPicPr>
                   <pic:blipFill>
-                    <a:blip r:embed="rId67"/>
+                    <a:blip r:embed="rId68"/>
                     <a:stretch>
                       <a:fillRect/>
                     </a:stretch>
@@ -3171,7 +3224,7 @@
         <w:drawing>
           <wp:inline xmlns:a="http://schemas.openxmlformats.org/drawingml/2006/main" xmlns:pic="http://schemas.openxmlformats.org/drawingml/2006/picture">
             <wp:extent cx="1731761" cy="1828800"/>
-            <wp:docPr id="60" name="Picture 60"/>
+            <wp:docPr id="61" name="Picture 61"/>
             <wp:cNvGraphicFramePr>
               <a:graphicFrameLocks noChangeAspect="1"/>
             </wp:cNvGraphicFramePr>
@@ -3183,7 +3236,7 @@
                     <pic:cNvPicPr/>
                   </pic:nvPicPr>
                   <pic:blipFill>
-                    <a:blip r:embed="rId68"/>
+                    <a:blip r:embed="rId69"/>
                     <a:stretch>
                       <a:fillRect/>
                     </a:stretch>
@@ -3224,7 +3277,7 @@
         <w:drawing>
           <wp:inline xmlns:a="http://schemas.openxmlformats.org/drawingml/2006/main" xmlns:pic="http://schemas.openxmlformats.org/drawingml/2006/picture">
             <wp:extent cx="1748236" cy="1828800"/>
-            <wp:docPr id="61" name="Picture 61"/>
+            <wp:docPr id="62" name="Picture 62"/>
             <wp:cNvGraphicFramePr>
               <a:graphicFrameLocks noChangeAspect="1"/>
             </wp:cNvGraphicFramePr>
@@ -3236,7 +3289,7 @@
                     <pic:cNvPicPr/>
                   </pic:nvPicPr>
                   <pic:blipFill>
-                    <a:blip r:embed="rId69"/>
+                    <a:blip r:embed="rId70"/>
                     <a:stretch>
                       <a:fillRect/>
                     </a:stretch>
@@ -3277,7 +3330,7 @@
         <w:drawing>
           <wp:inline xmlns:a="http://schemas.openxmlformats.org/drawingml/2006/main" xmlns:pic="http://schemas.openxmlformats.org/drawingml/2006/picture">
             <wp:extent cx="849085" cy="1828800"/>
-            <wp:docPr id="62" name="Picture 62"/>
+            <wp:docPr id="63" name="Picture 63"/>
             <wp:cNvGraphicFramePr>
               <a:graphicFrameLocks noChangeAspect="1"/>
             </wp:cNvGraphicFramePr>
@@ -3289,7 +3342,7 @@
                     <pic:cNvPicPr/>
                   </pic:nvPicPr>
                   <pic:blipFill>
-                    <a:blip r:embed="rId70"/>
+                    <a:blip r:embed="rId71"/>
                     <a:stretch>
                       <a:fillRect/>
                     </a:stretch>
@@ -3330,7 +3383,7 @@
         <w:drawing>
           <wp:inline xmlns:a="http://schemas.openxmlformats.org/drawingml/2006/main" xmlns:pic="http://schemas.openxmlformats.org/drawingml/2006/picture">
             <wp:extent cx="897529" cy="1828800"/>
-            <wp:docPr id="63" name="Picture 63"/>
+            <wp:docPr id="64" name="Picture 64"/>
             <wp:cNvGraphicFramePr>
               <a:graphicFrameLocks noChangeAspect="1"/>
             </wp:cNvGraphicFramePr>
@@ -3342,7 +3395,7 @@
                     <pic:cNvPicPr/>
                   </pic:nvPicPr>
                   <pic:blipFill>
-                    <a:blip r:embed="rId71"/>
+                    <a:blip r:embed="rId72"/>
                     <a:stretch>
                       <a:fillRect/>
                     </a:stretch>
@@ -3383,7 +3436,7 @@
         <w:drawing>
           <wp:inline xmlns:a="http://schemas.openxmlformats.org/drawingml/2006/main" xmlns:pic="http://schemas.openxmlformats.org/drawingml/2006/picture">
             <wp:extent cx="1160944" cy="1828800"/>
-            <wp:docPr id="64" name="Picture 64"/>
+            <wp:docPr id="65" name="Picture 65"/>
             <wp:cNvGraphicFramePr>
               <a:graphicFrameLocks noChangeAspect="1"/>
             </wp:cNvGraphicFramePr>
@@ -3395,7 +3448,7 @@
                     <pic:cNvPicPr/>
                   </pic:nvPicPr>
                   <pic:blipFill>
-                    <a:blip r:embed="rId72"/>
+                    <a:blip r:embed="rId73"/>
                     <a:stretch>
                       <a:fillRect/>
                     </a:stretch>
@@ -3436,7 +3489,7 @@
         <w:drawing>
           <wp:inline xmlns:a="http://schemas.openxmlformats.org/drawingml/2006/main" xmlns:pic="http://schemas.openxmlformats.org/drawingml/2006/picture">
             <wp:extent cx="1180289" cy="1828800"/>
-            <wp:docPr id="65" name="Picture 65"/>
+            <wp:docPr id="66" name="Picture 66"/>
             <wp:cNvGraphicFramePr>
               <a:graphicFrameLocks noChangeAspect="1"/>
             </wp:cNvGraphicFramePr>
@@ -3448,7 +3501,7 @@
                     <pic:cNvPicPr/>
                   </pic:nvPicPr>
                   <pic:blipFill>
-                    <a:blip r:embed="rId73"/>
+                    <a:blip r:embed="rId74"/>
                     <a:stretch>
                       <a:fillRect/>
                     </a:stretch>
@@ -3489,7 +3542,7 @@
         <w:drawing>
           <wp:inline xmlns:a="http://schemas.openxmlformats.org/drawingml/2006/main" xmlns:pic="http://schemas.openxmlformats.org/drawingml/2006/picture">
             <wp:extent cx="910024" cy="1828800"/>
-            <wp:docPr id="66" name="Picture 66"/>
+            <wp:docPr id="67" name="Picture 67"/>
             <wp:cNvGraphicFramePr>
               <a:graphicFrameLocks noChangeAspect="1"/>
             </wp:cNvGraphicFramePr>
@@ -3501,7 +3554,7 @@
                     <pic:cNvPicPr/>
                   </pic:nvPicPr>
                   <pic:blipFill>
-                    <a:blip r:embed="rId74"/>
+                    <a:blip r:embed="rId75"/>
                     <a:stretch>
                       <a:fillRect/>
                     </a:stretch>
@@ -3542,7 +3595,7 @@
         <w:drawing>
           <wp:inline xmlns:a="http://schemas.openxmlformats.org/drawingml/2006/main" xmlns:pic="http://schemas.openxmlformats.org/drawingml/2006/picture">
             <wp:extent cx="1104181" cy="1828800"/>
-            <wp:docPr id="67" name="Picture 67"/>
+            <wp:docPr id="68" name="Picture 68"/>
             <wp:cNvGraphicFramePr>
               <a:graphicFrameLocks noChangeAspect="1"/>
             </wp:cNvGraphicFramePr>
@@ -3554,7 +3607,7 @@
                     <pic:cNvPicPr/>
                   </pic:nvPicPr>
                   <pic:blipFill>
-                    <a:blip r:embed="rId75"/>
+                    <a:blip r:embed="rId76"/>
                     <a:stretch>
                       <a:fillRect/>
                     </a:stretch>
@@ -3595,7 +3648,7 @@
         <w:drawing>
           <wp:inline xmlns:a="http://schemas.openxmlformats.org/drawingml/2006/main" xmlns:pic="http://schemas.openxmlformats.org/drawingml/2006/picture">
             <wp:extent cx="1330036" cy="1828800"/>
-            <wp:docPr id="68" name="Picture 68"/>
+            <wp:docPr id="69" name="Picture 69"/>
             <wp:cNvGraphicFramePr>
               <a:graphicFrameLocks noChangeAspect="1"/>
             </wp:cNvGraphicFramePr>
@@ -3607,7 +3660,7 @@
                     <pic:cNvPicPr/>
                   </pic:nvPicPr>
                   <pic:blipFill>
-                    <a:blip r:embed="rId76"/>
+                    <a:blip r:embed="rId77"/>
                     <a:stretch>
                       <a:fillRect/>
                     </a:stretch>
@@ -3648,7 +3701,7 @@
         <w:drawing>
           <wp:inline xmlns:a="http://schemas.openxmlformats.org/drawingml/2006/main" xmlns:pic="http://schemas.openxmlformats.org/drawingml/2006/picture">
             <wp:extent cx="1445558" cy="1828800"/>
-            <wp:docPr id="69" name="Picture 69"/>
+            <wp:docPr id="70" name="Picture 70"/>
             <wp:cNvGraphicFramePr>
               <a:graphicFrameLocks noChangeAspect="1"/>
             </wp:cNvGraphicFramePr>
@@ -3660,7 +3713,7 @@
                     <pic:cNvPicPr/>
                   </pic:nvPicPr>
                   <pic:blipFill>
-                    <a:blip r:embed="rId77"/>
+                    <a:blip r:embed="rId78"/>
                     <a:stretch>
                       <a:fillRect/>
                     </a:stretch>
@@ -3701,7 +3754,7 @@
         <w:drawing>
           <wp:inline xmlns:a="http://schemas.openxmlformats.org/drawingml/2006/main" xmlns:pic="http://schemas.openxmlformats.org/drawingml/2006/picture">
             <wp:extent cx="1509571" cy="1828800"/>
-            <wp:docPr id="70" name="Picture 70"/>
+            <wp:docPr id="71" name="Picture 71"/>
             <wp:cNvGraphicFramePr>
               <a:graphicFrameLocks noChangeAspect="1"/>
             </wp:cNvGraphicFramePr>
@@ -3713,7 +3766,7 @@
                     <pic:cNvPicPr/>
                   </pic:nvPicPr>
                   <pic:blipFill>
-                    <a:blip r:embed="rId78"/>
+                    <a:blip r:embed="rId79"/>
                     <a:stretch>
                       <a:fillRect/>
                     </a:stretch>
@@ -3754,7 +3807,7 @@
         <w:drawing>
           <wp:inline xmlns:a="http://schemas.openxmlformats.org/drawingml/2006/main" xmlns:pic="http://schemas.openxmlformats.org/drawingml/2006/picture">
             <wp:extent cx="2161902" cy="1828800"/>
-            <wp:docPr id="71" name="Picture 71"/>
+            <wp:docPr id="72" name="Picture 72"/>
             <wp:cNvGraphicFramePr>
               <a:graphicFrameLocks noChangeAspect="1"/>
             </wp:cNvGraphicFramePr>
@@ -3766,7 +3819,7 @@
                     <pic:cNvPicPr/>
                   </pic:nvPicPr>
                   <pic:blipFill>
-                    <a:blip r:embed="rId79"/>
+                    <a:blip r:embed="rId80"/>
                     <a:stretch>
                       <a:fillRect/>
                     </a:stretch>
@@ -3807,7 +3860,7 @@
         <w:drawing>
           <wp:inline xmlns:a="http://schemas.openxmlformats.org/drawingml/2006/main" xmlns:pic="http://schemas.openxmlformats.org/drawingml/2006/picture">
             <wp:extent cx="1241882" cy="1828800"/>
-            <wp:docPr id="72" name="Picture 72"/>
+            <wp:docPr id="73" name="Picture 73"/>
             <wp:cNvGraphicFramePr>
               <a:graphicFrameLocks noChangeAspect="1"/>
             </wp:cNvGraphicFramePr>
@@ -3819,7 +3872,7 @@
                     <pic:cNvPicPr/>
                   </pic:nvPicPr>
                   <pic:blipFill>
-                    <a:blip r:embed="rId80"/>
+                    <a:blip r:embed="rId81"/>
                     <a:stretch>
                       <a:fillRect/>
                     </a:stretch>

</xml_diff>

<commit_message>
POV kit: add ragdoll chewing cat (C45)
</commit_message>
<xml_diff>
--- a/pov-meme-kit/CLIP_CATALOG.docx
+++ b/pov-meme-kit/CLIP_CATALOG.docx
@@ -2357,6 +2357,59 @@
     </w:p>
     <w:p>
       <w:pPr>
+        <w:pStyle w:val="Heading2"/>
+      </w:pPr>
+      <w:r>
+        <w:t>45. Clip C45 — Cream ragdoll-type cat standing, chewing/talking, calm stare</w:t>
+      </w:r>
+    </w:p>
+    <w:p>
+      <w:r>
+        <w:drawing>
+          <wp:inline xmlns:a="http://schemas.openxmlformats.org/drawingml/2006/main" xmlns:pic="http://schemas.openxmlformats.org/drawingml/2006/picture">
+            <wp:extent cx="1317811" cy="1828800"/>
+            <wp:docPr id="45" name="Picture 45"/>
+            <wp:cNvGraphicFramePr>
+              <a:graphicFrameLocks noChangeAspect="1"/>
+            </wp:cNvGraphicFramePr>
+            <a:graphic>
+              <a:graphicData uri="http://schemas.openxmlformats.org/drawingml/2006/picture">
+                <pic:pic>
+                  <pic:nvPicPr>
+                    <pic:cNvPr id="0" name="C45.jpg"/>
+                    <pic:cNvPicPr/>
+                  </pic:nvPicPr>
+                  <pic:blipFill>
+                    <a:blip r:embed="rId53"/>
+                    <a:stretch>
+                      <a:fillRect/>
+                    </a:stretch>
+                  </pic:blipFill>
+                  <pic:spPr>
+                    <a:xfrm>
+                      <a:off x="0" y="0"/>
+                      <a:ext cx="1317811" cy="1828800"/>
+                    </a:xfrm>
+                    <a:prstGeom prst="rect"/>
+                  </pic:spPr>
+                </pic:pic>
+              </a:graphicData>
+            </a:graphic>
+          </wp:inline>
+        </w:drawing>
+      </w:r>
+    </w:p>
+    <w:p>
+      <w:r>
+        <w:t>Good for: calm, unbothered, chatting, judging quietly</w:t>
+        <w:br/>
+        <w:t>File: cat_ragdoll_chewing.mp4, 0.00–5.20 s (5.2 s)</w:t>
+        <w:br/>
+        <w:t>Sound: animal sound (~421 Hz)</w:t>
+      </w:r>
+    </w:p>
+    <w:p>
+      <w:pPr>
         <w:pStyle w:val="Heading1"/>
       </w:pPr>
       <w:r>
@@ -2376,7 +2429,7 @@
         <w:drawing>
           <wp:inline xmlns:a="http://schemas.openxmlformats.org/drawingml/2006/main" xmlns:pic="http://schemas.openxmlformats.org/drawingml/2006/picture">
             <wp:extent cx="925830" cy="1828800"/>
-            <wp:docPr id="45" name="Picture 45"/>
+            <wp:docPr id="46" name="Picture 46"/>
             <wp:cNvGraphicFramePr>
               <a:graphicFrameLocks noChangeAspect="1"/>
             </wp:cNvGraphicFramePr>
@@ -2388,7 +2441,7 @@
                     <pic:cNvPicPr/>
                   </pic:nvPicPr>
                   <pic:blipFill>
-                    <a:blip r:embed="rId53"/>
+                    <a:blip r:embed="rId54"/>
                     <a:stretch>
                       <a:fillRect/>
                     </a:stretch>
@@ -2429,7 +2482,7 @@
         <w:drawing>
           <wp:inline xmlns:a="http://schemas.openxmlformats.org/drawingml/2006/main" xmlns:pic="http://schemas.openxmlformats.org/drawingml/2006/picture">
             <wp:extent cx="1234830" cy="1828800"/>
-            <wp:docPr id="46" name="Picture 46"/>
+            <wp:docPr id="47" name="Picture 47"/>
             <wp:cNvGraphicFramePr>
               <a:graphicFrameLocks noChangeAspect="1"/>
             </wp:cNvGraphicFramePr>
@@ -2441,7 +2494,7 @@
                     <pic:cNvPicPr/>
                   </pic:nvPicPr>
                   <pic:blipFill>
-                    <a:blip r:embed="rId54"/>
+                    <a:blip r:embed="rId55"/>
                     <a:stretch>
                       <a:fillRect/>
                     </a:stretch>
@@ -2482,7 +2535,7 @@
         <w:drawing>
           <wp:inline xmlns:a="http://schemas.openxmlformats.org/drawingml/2006/main" xmlns:pic="http://schemas.openxmlformats.org/drawingml/2006/picture">
             <wp:extent cx="1369834" cy="1828800"/>
-            <wp:docPr id="47" name="Picture 47"/>
+            <wp:docPr id="48" name="Picture 48"/>
             <wp:cNvGraphicFramePr>
               <a:graphicFrameLocks noChangeAspect="1"/>
             </wp:cNvGraphicFramePr>
@@ -2494,7 +2547,7 @@
                     <pic:cNvPicPr/>
                   </pic:nvPicPr>
                   <pic:blipFill>
-                    <a:blip r:embed="rId55"/>
+                    <a:blip r:embed="rId56"/>
                     <a:stretch>
                       <a:fillRect/>
                     </a:stretch>
@@ -2535,7 +2588,7 @@
         <w:drawing>
           <wp:inline xmlns:a="http://schemas.openxmlformats.org/drawingml/2006/main" xmlns:pic="http://schemas.openxmlformats.org/drawingml/2006/picture">
             <wp:extent cx="2377440" cy="1320800"/>
-            <wp:docPr id="48" name="Picture 48"/>
+            <wp:docPr id="49" name="Picture 49"/>
             <wp:cNvGraphicFramePr>
               <a:graphicFrameLocks noChangeAspect="1"/>
             </wp:cNvGraphicFramePr>
@@ -2547,7 +2600,7 @@
                     <pic:cNvPicPr/>
                   </pic:nvPicPr>
                   <pic:blipFill>
-                    <a:blip r:embed="rId56"/>
+                    <a:blip r:embed="rId57"/>
                     <a:stretch>
                       <a:fillRect/>
                     </a:stretch>
@@ -2588,7 +2641,7 @@
         <w:drawing>
           <wp:inline xmlns:a="http://schemas.openxmlformats.org/drawingml/2006/main" xmlns:pic="http://schemas.openxmlformats.org/drawingml/2006/picture">
             <wp:extent cx="2377440" cy="1804223"/>
-            <wp:docPr id="49" name="Picture 49"/>
+            <wp:docPr id="50" name="Picture 50"/>
             <wp:cNvGraphicFramePr>
               <a:graphicFrameLocks noChangeAspect="1"/>
             </wp:cNvGraphicFramePr>
@@ -2600,7 +2653,7 @@
                     <pic:cNvPicPr/>
                   </pic:nvPicPr>
                   <pic:blipFill>
-                    <a:blip r:embed="rId57"/>
+                    <a:blip r:embed="rId58"/>
                     <a:stretch>
                       <a:fillRect/>
                     </a:stretch>
@@ -2641,7 +2694,7 @@
         <w:drawing>
           <wp:inline xmlns:a="http://schemas.openxmlformats.org/drawingml/2006/main" xmlns:pic="http://schemas.openxmlformats.org/drawingml/2006/picture">
             <wp:extent cx="1228506" cy="1828800"/>
-            <wp:docPr id="50" name="Picture 50"/>
+            <wp:docPr id="51" name="Picture 51"/>
             <wp:cNvGraphicFramePr>
               <a:graphicFrameLocks noChangeAspect="1"/>
             </wp:cNvGraphicFramePr>
@@ -2653,7 +2706,7 @@
                     <pic:cNvPicPr/>
                   </pic:nvPicPr>
                   <pic:blipFill>
-                    <a:blip r:embed="rId58"/>
+                    <a:blip r:embed="rId59"/>
                     <a:stretch>
                       <a:fillRect/>
                     </a:stretch>
@@ -2694,7 +2747,7 @@
         <w:drawing>
           <wp:inline xmlns:a="http://schemas.openxmlformats.org/drawingml/2006/main" xmlns:pic="http://schemas.openxmlformats.org/drawingml/2006/picture">
             <wp:extent cx="1267968" cy="1828800"/>
-            <wp:docPr id="51" name="Picture 51"/>
+            <wp:docPr id="52" name="Picture 52"/>
             <wp:cNvGraphicFramePr>
               <a:graphicFrameLocks noChangeAspect="1"/>
             </wp:cNvGraphicFramePr>
@@ -2706,7 +2759,7 @@
                     <pic:cNvPicPr/>
                   </pic:nvPicPr>
                   <pic:blipFill>
-                    <a:blip r:embed="rId59"/>
+                    <a:blip r:embed="rId60"/>
                     <a:stretch>
                       <a:fillRect/>
                     </a:stretch>
@@ -2747,7 +2800,7 @@
         <w:drawing>
           <wp:inline xmlns:a="http://schemas.openxmlformats.org/drawingml/2006/main" xmlns:pic="http://schemas.openxmlformats.org/drawingml/2006/picture">
             <wp:extent cx="1455174" cy="1828800"/>
-            <wp:docPr id="52" name="Picture 52"/>
+            <wp:docPr id="53" name="Picture 53"/>
             <wp:cNvGraphicFramePr>
               <a:graphicFrameLocks noChangeAspect="1"/>
             </wp:cNvGraphicFramePr>
@@ -2759,7 +2812,7 @@
                     <pic:cNvPicPr/>
                   </pic:nvPicPr>
                   <pic:blipFill>
-                    <a:blip r:embed="rId60"/>
+                    <a:blip r:embed="rId61"/>
                     <a:stretch>
                       <a:fillRect/>
                     </a:stretch>
@@ -2800,7 +2853,7 @@
         <w:drawing>
           <wp:inline xmlns:a="http://schemas.openxmlformats.org/drawingml/2006/main" xmlns:pic="http://schemas.openxmlformats.org/drawingml/2006/picture">
             <wp:extent cx="897894" cy="1828800"/>
-            <wp:docPr id="53" name="Picture 53"/>
+            <wp:docPr id="54" name="Picture 54"/>
             <wp:cNvGraphicFramePr>
               <a:graphicFrameLocks noChangeAspect="1"/>
             </wp:cNvGraphicFramePr>
@@ -2812,7 +2865,7 @@
                     <pic:cNvPicPr/>
                   </pic:nvPicPr>
                   <pic:blipFill>
-                    <a:blip r:embed="rId61"/>
+                    <a:blip r:embed="rId62"/>
                     <a:stretch>
                       <a:fillRect/>
                     </a:stretch>
@@ -2853,7 +2906,7 @@
         <w:drawing>
           <wp:inline xmlns:a="http://schemas.openxmlformats.org/drawingml/2006/main" xmlns:pic="http://schemas.openxmlformats.org/drawingml/2006/picture">
             <wp:extent cx="1066261" cy="1828800"/>
-            <wp:docPr id="54" name="Picture 54"/>
+            <wp:docPr id="55" name="Picture 55"/>
             <wp:cNvGraphicFramePr>
               <a:graphicFrameLocks noChangeAspect="1"/>
             </wp:cNvGraphicFramePr>
@@ -2865,7 +2918,7 @@
                     <pic:cNvPicPr/>
                   </pic:nvPicPr>
                   <pic:blipFill>
-                    <a:blip r:embed="rId62"/>
+                    <a:blip r:embed="rId63"/>
                     <a:stretch>
                       <a:fillRect/>
                     </a:stretch>
@@ -2906,7 +2959,7 @@
         <w:drawing>
           <wp:inline xmlns:a="http://schemas.openxmlformats.org/drawingml/2006/main" xmlns:pic="http://schemas.openxmlformats.org/drawingml/2006/picture">
             <wp:extent cx="1318437" cy="1828800"/>
-            <wp:docPr id="55" name="Picture 55"/>
+            <wp:docPr id="56" name="Picture 56"/>
             <wp:cNvGraphicFramePr>
               <a:graphicFrameLocks noChangeAspect="1"/>
             </wp:cNvGraphicFramePr>
@@ -2918,7 +2971,7 @@
                     <pic:cNvPicPr/>
                   </pic:nvPicPr>
                   <pic:blipFill>
-                    <a:blip r:embed="rId63"/>
+                    <a:blip r:embed="rId64"/>
                     <a:stretch>
                       <a:fillRect/>
                     </a:stretch>
@@ -2959,7 +3012,7 @@
         <w:drawing>
           <wp:inline xmlns:a="http://schemas.openxmlformats.org/drawingml/2006/main" xmlns:pic="http://schemas.openxmlformats.org/drawingml/2006/picture">
             <wp:extent cx="1081548" cy="1828800"/>
-            <wp:docPr id="56" name="Picture 56"/>
+            <wp:docPr id="57" name="Picture 57"/>
             <wp:cNvGraphicFramePr>
               <a:graphicFrameLocks noChangeAspect="1"/>
             </wp:cNvGraphicFramePr>
@@ -2971,7 +3024,7 @@
                     <pic:cNvPicPr/>
                   </pic:nvPicPr>
                   <pic:blipFill>
-                    <a:blip r:embed="rId64"/>
+                    <a:blip r:embed="rId65"/>
                     <a:stretch>
                       <a:fillRect/>
                     </a:stretch>
@@ -3012,7 +3065,7 @@
         <w:drawing>
           <wp:inline xmlns:a="http://schemas.openxmlformats.org/drawingml/2006/main" xmlns:pic="http://schemas.openxmlformats.org/drawingml/2006/picture">
             <wp:extent cx="1121103" cy="1828800"/>
-            <wp:docPr id="57" name="Picture 57"/>
+            <wp:docPr id="58" name="Picture 58"/>
             <wp:cNvGraphicFramePr>
               <a:graphicFrameLocks noChangeAspect="1"/>
             </wp:cNvGraphicFramePr>
@@ -3024,7 +3077,7 @@
                     <pic:cNvPicPr/>
                   </pic:nvPicPr>
                   <pic:blipFill>
-                    <a:blip r:embed="rId65"/>
+                    <a:blip r:embed="rId66"/>
                     <a:stretch>
                       <a:fillRect/>
                     </a:stretch>
@@ -3065,7 +3118,7 @@
         <w:drawing>
           <wp:inline xmlns:a="http://schemas.openxmlformats.org/drawingml/2006/main" xmlns:pic="http://schemas.openxmlformats.org/drawingml/2006/picture">
             <wp:extent cx="888459" cy="1828800"/>
-            <wp:docPr id="58" name="Picture 58"/>
+            <wp:docPr id="59" name="Picture 59"/>
             <wp:cNvGraphicFramePr>
               <a:graphicFrameLocks noChangeAspect="1"/>
             </wp:cNvGraphicFramePr>
@@ -3077,7 +3130,7 @@
                     <pic:cNvPicPr/>
                   </pic:nvPicPr>
                   <pic:blipFill>
-                    <a:blip r:embed="rId66"/>
+                    <a:blip r:embed="rId67"/>
                     <a:stretch>
                       <a:fillRect/>
                     </a:stretch>
@@ -3118,7 +3171,7 @@
         <w:drawing>
           <wp:inline xmlns:a="http://schemas.openxmlformats.org/drawingml/2006/main" xmlns:pic="http://schemas.openxmlformats.org/drawingml/2006/picture">
             <wp:extent cx="1342047" cy="1828800"/>
-            <wp:docPr id="59" name="Picture 59"/>
+            <wp:docPr id="60" name="Picture 60"/>
             <wp:cNvGraphicFramePr>
               <a:graphicFrameLocks noChangeAspect="1"/>
             </wp:cNvGraphicFramePr>
@@ -3130,7 +3183,7 @@
                     <pic:cNvPicPr/>
                   </pic:nvPicPr>
                   <pic:blipFill>
-                    <a:blip r:embed="rId67"/>
+                    <a:blip r:embed="rId68"/>
                     <a:stretch>
                       <a:fillRect/>
                     </a:stretch>
@@ -3171,7 +3224,7 @@
         <w:drawing>
           <wp:inline xmlns:a="http://schemas.openxmlformats.org/drawingml/2006/main" xmlns:pic="http://schemas.openxmlformats.org/drawingml/2006/picture">
             <wp:extent cx="1599464" cy="1828800"/>
-            <wp:docPr id="60" name="Picture 60"/>
+            <wp:docPr id="61" name="Picture 61"/>
             <wp:cNvGraphicFramePr>
               <a:graphicFrameLocks noChangeAspect="1"/>
             </wp:cNvGraphicFramePr>
@@ -3183,7 +3236,7 @@
                     <pic:cNvPicPr/>
                   </pic:nvPicPr>
                   <pic:blipFill>
-                    <a:blip r:embed="rId68"/>
+                    <a:blip r:embed="rId69"/>
                     <a:stretch>
                       <a:fillRect/>
                     </a:stretch>
@@ -3224,7 +3277,7 @@
         <w:drawing>
           <wp:inline xmlns:a="http://schemas.openxmlformats.org/drawingml/2006/main" xmlns:pic="http://schemas.openxmlformats.org/drawingml/2006/picture">
             <wp:extent cx="1731761" cy="1828800"/>
-            <wp:docPr id="61" name="Picture 61"/>
+            <wp:docPr id="62" name="Picture 62"/>
             <wp:cNvGraphicFramePr>
               <a:graphicFrameLocks noChangeAspect="1"/>
             </wp:cNvGraphicFramePr>
@@ -3236,7 +3289,7 @@
                     <pic:cNvPicPr/>
                   </pic:nvPicPr>
                   <pic:blipFill>
-                    <a:blip r:embed="rId69"/>
+                    <a:blip r:embed="rId70"/>
                     <a:stretch>
                       <a:fillRect/>
                     </a:stretch>
@@ -3277,7 +3330,7 @@
         <w:drawing>
           <wp:inline xmlns:a="http://schemas.openxmlformats.org/drawingml/2006/main" xmlns:pic="http://schemas.openxmlformats.org/drawingml/2006/picture">
             <wp:extent cx="1748236" cy="1828800"/>
-            <wp:docPr id="62" name="Picture 62"/>
+            <wp:docPr id="63" name="Picture 63"/>
             <wp:cNvGraphicFramePr>
               <a:graphicFrameLocks noChangeAspect="1"/>
             </wp:cNvGraphicFramePr>
@@ -3289,7 +3342,7 @@
                     <pic:cNvPicPr/>
                   </pic:nvPicPr>
                   <pic:blipFill>
-                    <a:blip r:embed="rId70"/>
+                    <a:blip r:embed="rId71"/>
                     <a:stretch>
                       <a:fillRect/>
                     </a:stretch>
@@ -3330,7 +3383,7 @@
         <w:drawing>
           <wp:inline xmlns:a="http://schemas.openxmlformats.org/drawingml/2006/main" xmlns:pic="http://schemas.openxmlformats.org/drawingml/2006/picture">
             <wp:extent cx="849085" cy="1828800"/>
-            <wp:docPr id="63" name="Picture 63"/>
+            <wp:docPr id="64" name="Picture 64"/>
             <wp:cNvGraphicFramePr>
               <a:graphicFrameLocks noChangeAspect="1"/>
             </wp:cNvGraphicFramePr>
@@ -3342,7 +3395,7 @@
                     <pic:cNvPicPr/>
                   </pic:nvPicPr>
                   <pic:blipFill>
-                    <a:blip r:embed="rId71"/>
+                    <a:blip r:embed="rId72"/>
                     <a:stretch>
                       <a:fillRect/>
                     </a:stretch>
@@ -3383,7 +3436,7 @@
         <w:drawing>
           <wp:inline xmlns:a="http://schemas.openxmlformats.org/drawingml/2006/main" xmlns:pic="http://schemas.openxmlformats.org/drawingml/2006/picture">
             <wp:extent cx="897529" cy="1828800"/>
-            <wp:docPr id="64" name="Picture 64"/>
+            <wp:docPr id="65" name="Picture 65"/>
             <wp:cNvGraphicFramePr>
               <a:graphicFrameLocks noChangeAspect="1"/>
             </wp:cNvGraphicFramePr>
@@ -3395,7 +3448,7 @@
                     <pic:cNvPicPr/>
                   </pic:nvPicPr>
                   <pic:blipFill>
-                    <a:blip r:embed="rId72"/>
+                    <a:blip r:embed="rId73"/>
                     <a:stretch>
                       <a:fillRect/>
                     </a:stretch>
@@ -3436,7 +3489,7 @@
         <w:drawing>
           <wp:inline xmlns:a="http://schemas.openxmlformats.org/drawingml/2006/main" xmlns:pic="http://schemas.openxmlformats.org/drawingml/2006/picture">
             <wp:extent cx="1160944" cy="1828800"/>
-            <wp:docPr id="65" name="Picture 65"/>
+            <wp:docPr id="66" name="Picture 66"/>
             <wp:cNvGraphicFramePr>
               <a:graphicFrameLocks noChangeAspect="1"/>
             </wp:cNvGraphicFramePr>
@@ -3448,7 +3501,7 @@
                     <pic:cNvPicPr/>
                   </pic:nvPicPr>
                   <pic:blipFill>
-                    <a:blip r:embed="rId73"/>
+                    <a:blip r:embed="rId74"/>
                     <a:stretch>
                       <a:fillRect/>
                     </a:stretch>
@@ -3489,7 +3542,7 @@
         <w:drawing>
           <wp:inline xmlns:a="http://schemas.openxmlformats.org/drawingml/2006/main" xmlns:pic="http://schemas.openxmlformats.org/drawingml/2006/picture">
             <wp:extent cx="1180289" cy="1828800"/>
-            <wp:docPr id="66" name="Picture 66"/>
+            <wp:docPr id="67" name="Picture 67"/>
             <wp:cNvGraphicFramePr>
               <a:graphicFrameLocks noChangeAspect="1"/>
             </wp:cNvGraphicFramePr>
@@ -3501,7 +3554,7 @@
                     <pic:cNvPicPr/>
                   </pic:nvPicPr>
                   <pic:blipFill>
-                    <a:blip r:embed="rId74"/>
+                    <a:blip r:embed="rId75"/>
                     <a:stretch>
                       <a:fillRect/>
                     </a:stretch>
@@ -3542,7 +3595,7 @@
         <w:drawing>
           <wp:inline xmlns:a="http://schemas.openxmlformats.org/drawingml/2006/main" xmlns:pic="http://schemas.openxmlformats.org/drawingml/2006/picture">
             <wp:extent cx="910024" cy="1828800"/>
-            <wp:docPr id="67" name="Picture 67"/>
+            <wp:docPr id="68" name="Picture 68"/>
             <wp:cNvGraphicFramePr>
               <a:graphicFrameLocks noChangeAspect="1"/>
             </wp:cNvGraphicFramePr>
@@ -3554,7 +3607,7 @@
                     <pic:cNvPicPr/>
                   </pic:nvPicPr>
                   <pic:blipFill>
-                    <a:blip r:embed="rId75"/>
+                    <a:blip r:embed="rId76"/>
                     <a:stretch>
                       <a:fillRect/>
                     </a:stretch>
@@ -3595,7 +3648,7 @@
         <w:drawing>
           <wp:inline xmlns:a="http://schemas.openxmlformats.org/drawingml/2006/main" xmlns:pic="http://schemas.openxmlformats.org/drawingml/2006/picture">
             <wp:extent cx="1104181" cy="1828800"/>
-            <wp:docPr id="68" name="Picture 68"/>
+            <wp:docPr id="69" name="Picture 69"/>
             <wp:cNvGraphicFramePr>
               <a:graphicFrameLocks noChangeAspect="1"/>
             </wp:cNvGraphicFramePr>
@@ -3607,7 +3660,7 @@
                     <pic:cNvPicPr/>
                   </pic:nvPicPr>
                   <pic:blipFill>
-                    <a:blip r:embed="rId76"/>
+                    <a:blip r:embed="rId77"/>
                     <a:stretch>
                       <a:fillRect/>
                     </a:stretch>
@@ -3648,7 +3701,7 @@
         <w:drawing>
           <wp:inline xmlns:a="http://schemas.openxmlformats.org/drawingml/2006/main" xmlns:pic="http://schemas.openxmlformats.org/drawingml/2006/picture">
             <wp:extent cx="1330036" cy="1828800"/>
-            <wp:docPr id="69" name="Picture 69"/>
+            <wp:docPr id="70" name="Picture 70"/>
             <wp:cNvGraphicFramePr>
               <a:graphicFrameLocks noChangeAspect="1"/>
             </wp:cNvGraphicFramePr>
@@ -3660,7 +3713,7 @@
                     <pic:cNvPicPr/>
                   </pic:nvPicPr>
                   <pic:blipFill>
-                    <a:blip r:embed="rId77"/>
+                    <a:blip r:embed="rId78"/>
                     <a:stretch>
                       <a:fillRect/>
                     </a:stretch>
@@ -3701,7 +3754,7 @@
         <w:drawing>
           <wp:inline xmlns:a="http://schemas.openxmlformats.org/drawingml/2006/main" xmlns:pic="http://schemas.openxmlformats.org/drawingml/2006/picture">
             <wp:extent cx="1445558" cy="1828800"/>
-            <wp:docPr id="70" name="Picture 70"/>
+            <wp:docPr id="71" name="Picture 71"/>
             <wp:cNvGraphicFramePr>
               <a:graphicFrameLocks noChangeAspect="1"/>
             </wp:cNvGraphicFramePr>
@@ -3713,7 +3766,7 @@
                     <pic:cNvPicPr/>
                   </pic:nvPicPr>
                   <pic:blipFill>
-                    <a:blip r:embed="rId78"/>
+                    <a:blip r:embed="rId79"/>
                     <a:stretch>
                       <a:fillRect/>
                     </a:stretch>
@@ -3754,7 +3807,7 @@
         <w:drawing>
           <wp:inline xmlns:a="http://schemas.openxmlformats.org/drawingml/2006/main" xmlns:pic="http://schemas.openxmlformats.org/drawingml/2006/picture">
             <wp:extent cx="1509571" cy="1828800"/>
-            <wp:docPr id="71" name="Picture 71"/>
+            <wp:docPr id="72" name="Picture 72"/>
             <wp:cNvGraphicFramePr>
               <a:graphicFrameLocks noChangeAspect="1"/>
             </wp:cNvGraphicFramePr>
@@ -3766,7 +3819,7 @@
                     <pic:cNvPicPr/>
                   </pic:nvPicPr>
                   <pic:blipFill>
-                    <a:blip r:embed="rId79"/>
+                    <a:blip r:embed="rId80"/>
                     <a:stretch>
                       <a:fillRect/>
                     </a:stretch>
@@ -3807,7 +3860,7 @@
         <w:drawing>
           <wp:inline xmlns:a="http://schemas.openxmlformats.org/drawingml/2006/main" xmlns:pic="http://schemas.openxmlformats.org/drawingml/2006/picture">
             <wp:extent cx="2161902" cy="1828800"/>
-            <wp:docPr id="72" name="Picture 72"/>
+            <wp:docPr id="73" name="Picture 73"/>
             <wp:cNvGraphicFramePr>
               <a:graphicFrameLocks noChangeAspect="1"/>
             </wp:cNvGraphicFramePr>
@@ -3819,7 +3872,7 @@
                     <pic:cNvPicPr/>
                   </pic:nvPicPr>
                   <pic:blipFill>
-                    <a:blip r:embed="rId80"/>
+                    <a:blip r:embed="rId81"/>
                     <a:stretch>
                       <a:fillRect/>
                     </a:stretch>
@@ -3860,7 +3913,7 @@
         <w:drawing>
           <wp:inline xmlns:a="http://schemas.openxmlformats.org/drawingml/2006/main" xmlns:pic="http://schemas.openxmlformats.org/drawingml/2006/picture">
             <wp:extent cx="1241882" cy="1828800"/>
-            <wp:docPr id="73" name="Picture 73"/>
+            <wp:docPr id="74" name="Picture 74"/>
             <wp:cNvGraphicFramePr>
               <a:graphicFrameLocks noChangeAspect="1"/>
             </wp:cNvGraphicFramePr>
@@ -3872,7 +3925,7 @@
                     <pic:cNvPicPr/>
                   </pic:nvPicPr>
                   <pic:blipFill>
-                    <a:blip r:embed="rId81"/>
+                    <a:blip r:embed="rId82"/>
                     <a:stretch>
                       <a:fillRect/>
                     </a:stretch>

</xml_diff>

<commit_message>
POV kit: fix fast-forward look (short-clip slowdown, exact frames per scene), split C39/C46
</commit_message>
<xml_diff>
--- a/pov-meme-kit/CLIP_CATALOG.docx
+++ b/pov-meme-kit/CLIP_CATALOG.docx
@@ -2042,14 +2042,14 @@
         <w:pStyle w:val="Heading2"/>
       </w:pPr>
       <w:r>
-        <w:t>39. Clip C39 — Banana-suit cat crying with hands up + spinning (rapid cuts)</w:t>
+        <w:t>39. Clip C39 — Banana-suit cat crying with hands up, tears streaming</w:t>
       </w:r>
     </w:p>
     <w:p>
       <w:r>
         <w:drawing>
           <wp:inline xmlns:a="http://schemas.openxmlformats.org/drawingml/2006/main" xmlns:pic="http://schemas.openxmlformats.org/drawingml/2006/picture">
-            <wp:extent cx="957942" cy="1828800"/>
+            <wp:extent cx="1781092" cy="1828800"/>
             <wp:docPr id="39" name="Picture 39"/>
             <wp:cNvGraphicFramePr>
               <a:graphicFrameLocks noChangeAspect="1"/>
@@ -2070,7 +2070,7 @@
                   <pic:spPr>
                     <a:xfrm>
                       <a:off x="0" y="0"/>
-                      <a:ext cx="957942" cy="1828800"/>
+                      <a:ext cx="1781092" cy="1828800"/>
                     </a:xfrm>
                     <a:prstGeom prst="rect"/>
                   </pic:spPr>
@@ -2085,9 +2085,9 @@
       <w:r>
         <w:t>Good for: dramatic crying, breakdown</w:t>
         <w:br/>
-        <w:t>File: cat_banana_pack.mp4, 36.20–46.37 s (10.2 s)</w:t>
+        <w:t>File: cat_banana_pack.mp4, 36.20–40.90 s (4.7 s)</w:t>
         <w:br/>
-        <w:t>Sound: animal sound (~667 Hz)</w:t>
+        <w:t>Sound: animal sound (~640 Hz)</w:t>
       </w:r>
     </w:p>
     <w:p>
@@ -2410,6 +2410,59 @@
     </w:p>
     <w:p>
       <w:pPr>
+        <w:pStyle w:val="Heading2"/>
+      </w:pPr>
+      <w:r>
+        <w:t>46. Clip C46 — Banana-suit cat spinning/rolling around</w:t>
+      </w:r>
+    </w:p>
+    <w:p>
+      <w:r>
+        <w:drawing>
+          <wp:inline xmlns:a="http://schemas.openxmlformats.org/drawingml/2006/main" xmlns:pic="http://schemas.openxmlformats.org/drawingml/2006/picture">
+            <wp:extent cx="972921" cy="1828800"/>
+            <wp:docPr id="46" name="Picture 46"/>
+            <wp:cNvGraphicFramePr>
+              <a:graphicFrameLocks noChangeAspect="1"/>
+            </wp:cNvGraphicFramePr>
+            <a:graphic>
+              <a:graphicData uri="http://schemas.openxmlformats.org/drawingml/2006/picture">
+                <pic:pic>
+                  <pic:nvPicPr>
+                    <pic:cNvPr id="0" name="C46.jpg"/>
+                    <pic:cNvPicPr/>
+                  </pic:nvPicPr>
+                  <pic:blipFill>
+                    <a:blip r:embed="rId54"/>
+                    <a:stretch>
+                      <a:fillRect/>
+                    </a:stretch>
+                  </pic:blipFill>
+                  <pic:spPr>
+                    <a:xfrm>
+                      <a:off x="0" y="0"/>
+                      <a:ext cx="972921" cy="1828800"/>
+                    </a:xfrm>
+                    <a:prstGeom prst="rect"/>
+                  </pic:spPr>
+                </pic:pic>
+              </a:graphicData>
+            </a:graphic>
+          </wp:inline>
+        </w:drawing>
+      </w:r>
+    </w:p>
+    <w:p>
+      <w:r>
+        <w:t>Good for: dizzy, chaos, rolling on the floor</w:t>
+        <w:br/>
+        <w:t>File: cat_banana_pack.mp4, 41.00–46.37 s (5.4 s)</w:t>
+        <w:br/>
+        <w:t>Sound: animal sound (~696 Hz)</w:t>
+      </w:r>
+    </w:p>
+    <w:p>
+      <w:pPr>
         <w:pStyle w:val="Heading1"/>
       </w:pPr>
       <w:r>
@@ -2429,7 +2482,7 @@
         <w:drawing>
           <wp:inline xmlns:a="http://schemas.openxmlformats.org/drawingml/2006/main" xmlns:pic="http://schemas.openxmlformats.org/drawingml/2006/picture">
             <wp:extent cx="925830" cy="1828800"/>
-            <wp:docPr id="46" name="Picture 46"/>
+            <wp:docPr id="47" name="Picture 47"/>
             <wp:cNvGraphicFramePr>
               <a:graphicFrameLocks noChangeAspect="1"/>
             </wp:cNvGraphicFramePr>
@@ -2441,7 +2494,7 @@
                     <pic:cNvPicPr/>
                   </pic:nvPicPr>
                   <pic:blipFill>
-                    <a:blip r:embed="rId54"/>
+                    <a:blip r:embed="rId55"/>
                     <a:stretch>
                       <a:fillRect/>
                     </a:stretch>
@@ -2482,7 +2535,7 @@
         <w:drawing>
           <wp:inline xmlns:a="http://schemas.openxmlformats.org/drawingml/2006/main" xmlns:pic="http://schemas.openxmlformats.org/drawingml/2006/picture">
             <wp:extent cx="1234830" cy="1828800"/>
-            <wp:docPr id="47" name="Picture 47"/>
+            <wp:docPr id="48" name="Picture 48"/>
             <wp:cNvGraphicFramePr>
               <a:graphicFrameLocks noChangeAspect="1"/>
             </wp:cNvGraphicFramePr>
@@ -2494,7 +2547,7 @@
                     <pic:cNvPicPr/>
                   </pic:nvPicPr>
                   <pic:blipFill>
-                    <a:blip r:embed="rId55"/>
+                    <a:blip r:embed="rId56"/>
                     <a:stretch>
                       <a:fillRect/>
                     </a:stretch>
@@ -2535,7 +2588,7 @@
         <w:drawing>
           <wp:inline xmlns:a="http://schemas.openxmlformats.org/drawingml/2006/main" xmlns:pic="http://schemas.openxmlformats.org/drawingml/2006/picture">
             <wp:extent cx="1369834" cy="1828800"/>
-            <wp:docPr id="48" name="Picture 48"/>
+            <wp:docPr id="49" name="Picture 49"/>
             <wp:cNvGraphicFramePr>
               <a:graphicFrameLocks noChangeAspect="1"/>
             </wp:cNvGraphicFramePr>
@@ -2547,7 +2600,7 @@
                     <pic:cNvPicPr/>
                   </pic:nvPicPr>
                   <pic:blipFill>
-                    <a:blip r:embed="rId56"/>
+                    <a:blip r:embed="rId57"/>
                     <a:stretch>
                       <a:fillRect/>
                     </a:stretch>
@@ -2588,7 +2641,7 @@
         <w:drawing>
           <wp:inline xmlns:a="http://schemas.openxmlformats.org/drawingml/2006/main" xmlns:pic="http://schemas.openxmlformats.org/drawingml/2006/picture">
             <wp:extent cx="2377440" cy="1320800"/>
-            <wp:docPr id="49" name="Picture 49"/>
+            <wp:docPr id="50" name="Picture 50"/>
             <wp:cNvGraphicFramePr>
               <a:graphicFrameLocks noChangeAspect="1"/>
             </wp:cNvGraphicFramePr>
@@ -2600,7 +2653,7 @@
                     <pic:cNvPicPr/>
                   </pic:nvPicPr>
                   <pic:blipFill>
-                    <a:blip r:embed="rId57"/>
+                    <a:blip r:embed="rId58"/>
                     <a:stretch>
                       <a:fillRect/>
                     </a:stretch>
@@ -2641,7 +2694,7 @@
         <w:drawing>
           <wp:inline xmlns:a="http://schemas.openxmlformats.org/drawingml/2006/main" xmlns:pic="http://schemas.openxmlformats.org/drawingml/2006/picture">
             <wp:extent cx="2377440" cy="1804223"/>
-            <wp:docPr id="50" name="Picture 50"/>
+            <wp:docPr id="51" name="Picture 51"/>
             <wp:cNvGraphicFramePr>
               <a:graphicFrameLocks noChangeAspect="1"/>
             </wp:cNvGraphicFramePr>
@@ -2653,7 +2706,7 @@
                     <pic:cNvPicPr/>
                   </pic:nvPicPr>
                   <pic:blipFill>
-                    <a:blip r:embed="rId58"/>
+                    <a:blip r:embed="rId59"/>
                     <a:stretch>
                       <a:fillRect/>
                     </a:stretch>
@@ -2694,7 +2747,7 @@
         <w:drawing>
           <wp:inline xmlns:a="http://schemas.openxmlformats.org/drawingml/2006/main" xmlns:pic="http://schemas.openxmlformats.org/drawingml/2006/picture">
             <wp:extent cx="1228506" cy="1828800"/>
-            <wp:docPr id="51" name="Picture 51"/>
+            <wp:docPr id="52" name="Picture 52"/>
             <wp:cNvGraphicFramePr>
               <a:graphicFrameLocks noChangeAspect="1"/>
             </wp:cNvGraphicFramePr>
@@ -2706,7 +2759,7 @@
                     <pic:cNvPicPr/>
                   </pic:nvPicPr>
                   <pic:blipFill>
-                    <a:blip r:embed="rId59"/>
+                    <a:blip r:embed="rId60"/>
                     <a:stretch>
                       <a:fillRect/>
                     </a:stretch>
@@ -2747,7 +2800,7 @@
         <w:drawing>
           <wp:inline xmlns:a="http://schemas.openxmlformats.org/drawingml/2006/main" xmlns:pic="http://schemas.openxmlformats.org/drawingml/2006/picture">
             <wp:extent cx="1267968" cy="1828800"/>
-            <wp:docPr id="52" name="Picture 52"/>
+            <wp:docPr id="53" name="Picture 53"/>
             <wp:cNvGraphicFramePr>
               <a:graphicFrameLocks noChangeAspect="1"/>
             </wp:cNvGraphicFramePr>
@@ -2759,7 +2812,7 @@
                     <pic:cNvPicPr/>
                   </pic:nvPicPr>
                   <pic:blipFill>
-                    <a:blip r:embed="rId60"/>
+                    <a:blip r:embed="rId61"/>
                     <a:stretch>
                       <a:fillRect/>
                     </a:stretch>
@@ -2800,7 +2853,7 @@
         <w:drawing>
           <wp:inline xmlns:a="http://schemas.openxmlformats.org/drawingml/2006/main" xmlns:pic="http://schemas.openxmlformats.org/drawingml/2006/picture">
             <wp:extent cx="1455174" cy="1828800"/>
-            <wp:docPr id="53" name="Picture 53"/>
+            <wp:docPr id="54" name="Picture 54"/>
             <wp:cNvGraphicFramePr>
               <a:graphicFrameLocks noChangeAspect="1"/>
             </wp:cNvGraphicFramePr>
@@ -2812,7 +2865,7 @@
                     <pic:cNvPicPr/>
                   </pic:nvPicPr>
                   <pic:blipFill>
-                    <a:blip r:embed="rId61"/>
+                    <a:blip r:embed="rId62"/>
                     <a:stretch>
                       <a:fillRect/>
                     </a:stretch>
@@ -2853,7 +2906,7 @@
         <w:drawing>
           <wp:inline xmlns:a="http://schemas.openxmlformats.org/drawingml/2006/main" xmlns:pic="http://schemas.openxmlformats.org/drawingml/2006/picture">
             <wp:extent cx="897894" cy="1828800"/>
-            <wp:docPr id="54" name="Picture 54"/>
+            <wp:docPr id="55" name="Picture 55"/>
             <wp:cNvGraphicFramePr>
               <a:graphicFrameLocks noChangeAspect="1"/>
             </wp:cNvGraphicFramePr>
@@ -2865,7 +2918,7 @@
                     <pic:cNvPicPr/>
                   </pic:nvPicPr>
                   <pic:blipFill>
-                    <a:blip r:embed="rId62"/>
+                    <a:blip r:embed="rId63"/>
                     <a:stretch>
                       <a:fillRect/>
                     </a:stretch>
@@ -2906,7 +2959,7 @@
         <w:drawing>
           <wp:inline xmlns:a="http://schemas.openxmlformats.org/drawingml/2006/main" xmlns:pic="http://schemas.openxmlformats.org/drawingml/2006/picture">
             <wp:extent cx="1066261" cy="1828800"/>
-            <wp:docPr id="55" name="Picture 55"/>
+            <wp:docPr id="56" name="Picture 56"/>
             <wp:cNvGraphicFramePr>
               <a:graphicFrameLocks noChangeAspect="1"/>
             </wp:cNvGraphicFramePr>
@@ -2918,7 +2971,7 @@
                     <pic:cNvPicPr/>
                   </pic:nvPicPr>
                   <pic:blipFill>
-                    <a:blip r:embed="rId63"/>
+                    <a:blip r:embed="rId64"/>
                     <a:stretch>
                       <a:fillRect/>
                     </a:stretch>
@@ -2959,7 +3012,7 @@
         <w:drawing>
           <wp:inline xmlns:a="http://schemas.openxmlformats.org/drawingml/2006/main" xmlns:pic="http://schemas.openxmlformats.org/drawingml/2006/picture">
             <wp:extent cx="1318437" cy="1828800"/>
-            <wp:docPr id="56" name="Picture 56"/>
+            <wp:docPr id="57" name="Picture 57"/>
             <wp:cNvGraphicFramePr>
               <a:graphicFrameLocks noChangeAspect="1"/>
             </wp:cNvGraphicFramePr>
@@ -2971,7 +3024,7 @@
                     <pic:cNvPicPr/>
                   </pic:nvPicPr>
                   <pic:blipFill>
-                    <a:blip r:embed="rId64"/>
+                    <a:blip r:embed="rId65"/>
                     <a:stretch>
                       <a:fillRect/>
                     </a:stretch>
@@ -3012,7 +3065,7 @@
         <w:drawing>
           <wp:inline xmlns:a="http://schemas.openxmlformats.org/drawingml/2006/main" xmlns:pic="http://schemas.openxmlformats.org/drawingml/2006/picture">
             <wp:extent cx="1081548" cy="1828800"/>
-            <wp:docPr id="57" name="Picture 57"/>
+            <wp:docPr id="58" name="Picture 58"/>
             <wp:cNvGraphicFramePr>
               <a:graphicFrameLocks noChangeAspect="1"/>
             </wp:cNvGraphicFramePr>
@@ -3024,7 +3077,7 @@
                     <pic:cNvPicPr/>
                   </pic:nvPicPr>
                   <pic:blipFill>
-                    <a:blip r:embed="rId65"/>
+                    <a:blip r:embed="rId66"/>
                     <a:stretch>
                       <a:fillRect/>
                     </a:stretch>
@@ -3065,7 +3118,7 @@
         <w:drawing>
           <wp:inline xmlns:a="http://schemas.openxmlformats.org/drawingml/2006/main" xmlns:pic="http://schemas.openxmlformats.org/drawingml/2006/picture">
             <wp:extent cx="1121103" cy="1828800"/>
-            <wp:docPr id="58" name="Picture 58"/>
+            <wp:docPr id="59" name="Picture 59"/>
             <wp:cNvGraphicFramePr>
               <a:graphicFrameLocks noChangeAspect="1"/>
             </wp:cNvGraphicFramePr>
@@ -3077,7 +3130,7 @@
                     <pic:cNvPicPr/>
                   </pic:nvPicPr>
                   <pic:blipFill>
-                    <a:blip r:embed="rId66"/>
+                    <a:blip r:embed="rId67"/>
                     <a:stretch>
                       <a:fillRect/>
                     </a:stretch>
@@ -3118,7 +3171,7 @@
         <w:drawing>
           <wp:inline xmlns:a="http://schemas.openxmlformats.org/drawingml/2006/main" xmlns:pic="http://schemas.openxmlformats.org/drawingml/2006/picture">
             <wp:extent cx="888459" cy="1828800"/>
-            <wp:docPr id="59" name="Picture 59"/>
+            <wp:docPr id="60" name="Picture 60"/>
             <wp:cNvGraphicFramePr>
               <a:graphicFrameLocks noChangeAspect="1"/>
             </wp:cNvGraphicFramePr>
@@ -3130,7 +3183,7 @@
                     <pic:cNvPicPr/>
                   </pic:nvPicPr>
                   <pic:blipFill>
-                    <a:blip r:embed="rId67"/>
+                    <a:blip r:embed="rId68"/>
                     <a:stretch>
                       <a:fillRect/>
                     </a:stretch>
@@ -3171,7 +3224,7 @@
         <w:drawing>
           <wp:inline xmlns:a="http://schemas.openxmlformats.org/drawingml/2006/main" xmlns:pic="http://schemas.openxmlformats.org/drawingml/2006/picture">
             <wp:extent cx="1342047" cy="1828800"/>
-            <wp:docPr id="60" name="Picture 60"/>
+            <wp:docPr id="61" name="Picture 61"/>
             <wp:cNvGraphicFramePr>
               <a:graphicFrameLocks noChangeAspect="1"/>
             </wp:cNvGraphicFramePr>
@@ -3183,7 +3236,7 @@
                     <pic:cNvPicPr/>
                   </pic:nvPicPr>
                   <pic:blipFill>
-                    <a:blip r:embed="rId68"/>
+                    <a:blip r:embed="rId69"/>
                     <a:stretch>
                       <a:fillRect/>
                     </a:stretch>
@@ -3224,7 +3277,7 @@
         <w:drawing>
           <wp:inline xmlns:a="http://schemas.openxmlformats.org/drawingml/2006/main" xmlns:pic="http://schemas.openxmlformats.org/drawingml/2006/picture">
             <wp:extent cx="1599464" cy="1828800"/>
-            <wp:docPr id="61" name="Picture 61"/>
+            <wp:docPr id="62" name="Picture 62"/>
             <wp:cNvGraphicFramePr>
               <a:graphicFrameLocks noChangeAspect="1"/>
             </wp:cNvGraphicFramePr>
@@ -3236,7 +3289,7 @@
                     <pic:cNvPicPr/>
                   </pic:nvPicPr>
                   <pic:blipFill>
-                    <a:blip r:embed="rId69"/>
+                    <a:blip r:embed="rId70"/>
                     <a:stretch>
                       <a:fillRect/>
                     </a:stretch>
@@ -3277,7 +3330,7 @@
         <w:drawing>
           <wp:inline xmlns:a="http://schemas.openxmlformats.org/drawingml/2006/main" xmlns:pic="http://schemas.openxmlformats.org/drawingml/2006/picture">
             <wp:extent cx="1731761" cy="1828800"/>
-            <wp:docPr id="62" name="Picture 62"/>
+            <wp:docPr id="63" name="Picture 63"/>
             <wp:cNvGraphicFramePr>
               <a:graphicFrameLocks noChangeAspect="1"/>
             </wp:cNvGraphicFramePr>
@@ -3289,7 +3342,7 @@
                     <pic:cNvPicPr/>
                   </pic:nvPicPr>
                   <pic:blipFill>
-                    <a:blip r:embed="rId70"/>
+                    <a:blip r:embed="rId71"/>
                     <a:stretch>
                       <a:fillRect/>
                     </a:stretch>
@@ -3330,7 +3383,7 @@
         <w:drawing>
           <wp:inline xmlns:a="http://schemas.openxmlformats.org/drawingml/2006/main" xmlns:pic="http://schemas.openxmlformats.org/drawingml/2006/picture">
             <wp:extent cx="1748236" cy="1828800"/>
-            <wp:docPr id="63" name="Picture 63"/>
+            <wp:docPr id="64" name="Picture 64"/>
             <wp:cNvGraphicFramePr>
               <a:graphicFrameLocks noChangeAspect="1"/>
             </wp:cNvGraphicFramePr>
@@ -3342,7 +3395,7 @@
                     <pic:cNvPicPr/>
                   </pic:nvPicPr>
                   <pic:blipFill>
-                    <a:blip r:embed="rId71"/>
+                    <a:blip r:embed="rId72"/>
                     <a:stretch>
                       <a:fillRect/>
                     </a:stretch>
@@ -3383,7 +3436,7 @@
         <w:drawing>
           <wp:inline xmlns:a="http://schemas.openxmlformats.org/drawingml/2006/main" xmlns:pic="http://schemas.openxmlformats.org/drawingml/2006/picture">
             <wp:extent cx="849085" cy="1828800"/>
-            <wp:docPr id="64" name="Picture 64"/>
+            <wp:docPr id="65" name="Picture 65"/>
             <wp:cNvGraphicFramePr>
               <a:graphicFrameLocks noChangeAspect="1"/>
             </wp:cNvGraphicFramePr>
@@ -3395,7 +3448,7 @@
                     <pic:cNvPicPr/>
                   </pic:nvPicPr>
                   <pic:blipFill>
-                    <a:blip r:embed="rId72"/>
+                    <a:blip r:embed="rId73"/>
                     <a:stretch>
                       <a:fillRect/>
                     </a:stretch>
@@ -3436,7 +3489,7 @@
         <w:drawing>
           <wp:inline xmlns:a="http://schemas.openxmlformats.org/drawingml/2006/main" xmlns:pic="http://schemas.openxmlformats.org/drawingml/2006/picture">
             <wp:extent cx="897529" cy="1828800"/>
-            <wp:docPr id="65" name="Picture 65"/>
+            <wp:docPr id="66" name="Picture 66"/>
             <wp:cNvGraphicFramePr>
               <a:graphicFrameLocks noChangeAspect="1"/>
             </wp:cNvGraphicFramePr>
@@ -3448,7 +3501,7 @@
                     <pic:cNvPicPr/>
                   </pic:nvPicPr>
                   <pic:blipFill>
-                    <a:blip r:embed="rId73"/>
+                    <a:blip r:embed="rId74"/>
                     <a:stretch>
                       <a:fillRect/>
                     </a:stretch>
@@ -3489,7 +3542,7 @@
         <w:drawing>
           <wp:inline xmlns:a="http://schemas.openxmlformats.org/drawingml/2006/main" xmlns:pic="http://schemas.openxmlformats.org/drawingml/2006/picture">
             <wp:extent cx="1160944" cy="1828800"/>
-            <wp:docPr id="66" name="Picture 66"/>
+            <wp:docPr id="67" name="Picture 67"/>
             <wp:cNvGraphicFramePr>
               <a:graphicFrameLocks noChangeAspect="1"/>
             </wp:cNvGraphicFramePr>
@@ -3501,7 +3554,7 @@
                     <pic:cNvPicPr/>
                   </pic:nvPicPr>
                   <pic:blipFill>
-                    <a:blip r:embed="rId74"/>
+                    <a:blip r:embed="rId75"/>
                     <a:stretch>
                       <a:fillRect/>
                     </a:stretch>
@@ -3542,7 +3595,7 @@
         <w:drawing>
           <wp:inline xmlns:a="http://schemas.openxmlformats.org/drawingml/2006/main" xmlns:pic="http://schemas.openxmlformats.org/drawingml/2006/picture">
             <wp:extent cx="1180289" cy="1828800"/>
-            <wp:docPr id="67" name="Picture 67"/>
+            <wp:docPr id="68" name="Picture 68"/>
             <wp:cNvGraphicFramePr>
               <a:graphicFrameLocks noChangeAspect="1"/>
             </wp:cNvGraphicFramePr>
@@ -3554,7 +3607,7 @@
                     <pic:cNvPicPr/>
                   </pic:nvPicPr>
                   <pic:blipFill>
-                    <a:blip r:embed="rId75"/>
+                    <a:blip r:embed="rId76"/>
                     <a:stretch>
                       <a:fillRect/>
                     </a:stretch>
@@ -3595,7 +3648,7 @@
         <w:drawing>
           <wp:inline xmlns:a="http://schemas.openxmlformats.org/drawingml/2006/main" xmlns:pic="http://schemas.openxmlformats.org/drawingml/2006/picture">
             <wp:extent cx="910024" cy="1828800"/>
-            <wp:docPr id="68" name="Picture 68"/>
+            <wp:docPr id="69" name="Picture 69"/>
             <wp:cNvGraphicFramePr>
               <a:graphicFrameLocks noChangeAspect="1"/>
             </wp:cNvGraphicFramePr>
@@ -3607,7 +3660,7 @@
                     <pic:cNvPicPr/>
                   </pic:nvPicPr>
                   <pic:blipFill>
-                    <a:blip r:embed="rId76"/>
+                    <a:blip r:embed="rId77"/>
                     <a:stretch>
                       <a:fillRect/>
                     </a:stretch>
@@ -3648,7 +3701,7 @@
         <w:drawing>
           <wp:inline xmlns:a="http://schemas.openxmlformats.org/drawingml/2006/main" xmlns:pic="http://schemas.openxmlformats.org/drawingml/2006/picture">
             <wp:extent cx="1104181" cy="1828800"/>
-            <wp:docPr id="69" name="Picture 69"/>
+            <wp:docPr id="70" name="Picture 70"/>
             <wp:cNvGraphicFramePr>
               <a:graphicFrameLocks noChangeAspect="1"/>
             </wp:cNvGraphicFramePr>
@@ -3660,7 +3713,7 @@
                     <pic:cNvPicPr/>
                   </pic:nvPicPr>
                   <pic:blipFill>
-                    <a:blip r:embed="rId77"/>
+                    <a:blip r:embed="rId78"/>
                     <a:stretch>
                       <a:fillRect/>
                     </a:stretch>
@@ -3701,7 +3754,7 @@
         <w:drawing>
           <wp:inline xmlns:a="http://schemas.openxmlformats.org/drawingml/2006/main" xmlns:pic="http://schemas.openxmlformats.org/drawingml/2006/picture">
             <wp:extent cx="1330036" cy="1828800"/>
-            <wp:docPr id="70" name="Picture 70"/>
+            <wp:docPr id="71" name="Picture 71"/>
             <wp:cNvGraphicFramePr>
               <a:graphicFrameLocks noChangeAspect="1"/>
             </wp:cNvGraphicFramePr>
@@ -3713,7 +3766,7 @@
                     <pic:cNvPicPr/>
                   </pic:nvPicPr>
                   <pic:blipFill>
-                    <a:blip r:embed="rId78"/>
+                    <a:blip r:embed="rId79"/>
                     <a:stretch>
                       <a:fillRect/>
                     </a:stretch>
@@ -3754,7 +3807,7 @@
         <w:drawing>
           <wp:inline xmlns:a="http://schemas.openxmlformats.org/drawingml/2006/main" xmlns:pic="http://schemas.openxmlformats.org/drawingml/2006/picture">
             <wp:extent cx="1445558" cy="1828800"/>
-            <wp:docPr id="71" name="Picture 71"/>
+            <wp:docPr id="72" name="Picture 72"/>
             <wp:cNvGraphicFramePr>
               <a:graphicFrameLocks noChangeAspect="1"/>
             </wp:cNvGraphicFramePr>
@@ -3766,7 +3819,7 @@
                     <pic:cNvPicPr/>
                   </pic:nvPicPr>
                   <pic:blipFill>
-                    <a:blip r:embed="rId79"/>
+                    <a:blip r:embed="rId80"/>
                     <a:stretch>
                       <a:fillRect/>
                     </a:stretch>
@@ -3807,7 +3860,7 @@
         <w:drawing>
           <wp:inline xmlns:a="http://schemas.openxmlformats.org/drawingml/2006/main" xmlns:pic="http://schemas.openxmlformats.org/drawingml/2006/picture">
             <wp:extent cx="1509571" cy="1828800"/>
-            <wp:docPr id="72" name="Picture 72"/>
+            <wp:docPr id="73" name="Picture 73"/>
             <wp:cNvGraphicFramePr>
               <a:graphicFrameLocks noChangeAspect="1"/>
             </wp:cNvGraphicFramePr>
@@ -3819,7 +3872,7 @@
                     <pic:cNvPicPr/>
                   </pic:nvPicPr>
                   <pic:blipFill>
-                    <a:blip r:embed="rId80"/>
+                    <a:blip r:embed="rId81"/>
                     <a:stretch>
                       <a:fillRect/>
                     </a:stretch>
@@ -3860,7 +3913,7 @@
         <w:drawing>
           <wp:inline xmlns:a="http://schemas.openxmlformats.org/drawingml/2006/main" xmlns:pic="http://schemas.openxmlformats.org/drawingml/2006/picture">
             <wp:extent cx="2161902" cy="1828800"/>
-            <wp:docPr id="73" name="Picture 73"/>
+            <wp:docPr id="74" name="Picture 74"/>
             <wp:cNvGraphicFramePr>
               <a:graphicFrameLocks noChangeAspect="1"/>
             </wp:cNvGraphicFramePr>
@@ -3872,7 +3925,7 @@
                     <pic:cNvPicPr/>
                   </pic:nvPicPr>
                   <pic:blipFill>
-                    <a:blip r:embed="rId81"/>
+                    <a:blip r:embed="rId82"/>
                     <a:stretch>
                       <a:fillRect/>
                     </a:stretch>
@@ -3913,7 +3966,7 @@
         <w:drawing>
           <wp:inline xmlns:a="http://schemas.openxmlformats.org/drawingml/2006/main" xmlns:pic="http://schemas.openxmlformats.org/drawingml/2006/picture">
             <wp:extent cx="1241882" cy="1828800"/>
-            <wp:docPr id="74" name="Picture 74"/>
+            <wp:docPr id="75" name="Picture 75"/>
             <wp:cNvGraphicFramePr>
               <a:graphicFrameLocks noChangeAspect="1"/>
             </wp:cNvGraphicFramePr>
@@ -3925,7 +3978,7 @@
                     <pic:cNvPicPr/>
                   </pic:nvPicPr>
                   <pic:blipFill>
-                    <a:blip r:embed="rId82"/>
+                    <a:blip r:embed="rId83"/>
                     <a:stretch>
                       <a:fillRect/>
                     </a:stretch>

</xml_diff>

<commit_message>
Add 71 meme sound effects (sfx support in build.py) and cat pack 4 (C47-C54)
Co-Authored-By: Claude Opus 5.5 <noreply@anthropic.com>
Claude-Session: https://claude.ai/code/session_011KzLMVaJ1uJ5GhBhchKsi8
</commit_message>
<xml_diff>
--- a/pov-meme-kit/CLIP_CATALOG.docx
+++ b/pov-meme-kit/CLIP_CATALOG.docx
@@ -2463,6 +2463,430 @@
     </w:p>
     <w:p>
       <w:pPr>
+        <w:pStyle w:val="Heading2"/>
+      </w:pPr>
+      <w:r>
+        <w:t>47. Clip C47 — Orange &amp; white cat standing, wide-eyed stare</w:t>
+      </w:r>
+    </w:p>
+    <w:p>
+      <w:r>
+        <w:drawing>
+          <wp:inline xmlns:a="http://schemas.openxmlformats.org/drawingml/2006/main" xmlns:pic="http://schemas.openxmlformats.org/drawingml/2006/picture">
+            <wp:extent cx="1181437" cy="1828800"/>
+            <wp:docPr id="47" name="Picture 47"/>
+            <wp:cNvGraphicFramePr>
+              <a:graphicFrameLocks noChangeAspect="1"/>
+            </wp:cNvGraphicFramePr>
+            <a:graphic>
+              <a:graphicData uri="http://schemas.openxmlformats.org/drawingml/2006/picture">
+                <pic:pic>
+                  <pic:nvPicPr>
+                    <pic:cNvPr id="0" name="C47.jpg"/>
+                    <pic:cNvPicPr/>
+                  </pic:nvPicPr>
+                  <pic:blipFill>
+                    <a:blip r:embed="rId55"/>
+                    <a:stretch>
+                      <a:fillRect/>
+                    </a:stretch>
+                  </pic:blipFill>
+                  <pic:spPr>
+                    <a:xfrm>
+                      <a:off x="0" y="0"/>
+                      <a:ext cx="1181437" cy="1828800"/>
+                    </a:xfrm>
+                    <a:prstGeom prst="rect"/>
+                  </pic:spPr>
+                </pic:pic>
+              </a:graphicData>
+            </a:graphic>
+          </wp:inline>
+        </w:drawing>
+      </w:r>
+    </w:p>
+    <w:p>
+      <w:r>
+        <w:t>Good for: confused, waiting, 'excuse me?'</w:t>
+        <w:br/>
+        <w:t>File: cat_pack_4.mp4, 0.00–6.30 s (6.3 s)</w:t>
+        <w:br/>
+        <w:t>Sound: animal sound (~1231 Hz)</w:t>
+      </w:r>
+    </w:p>
+    <w:p>
+      <w:pPr>
+        <w:pStyle w:val="Heading2"/>
+      </w:pPr>
+      <w:r>
+        <w:t>48. Clip C48 — Orange cat close-up, then mouth wide open yawning/screaming</w:t>
+      </w:r>
+    </w:p>
+    <w:p>
+      <w:r>
+        <w:drawing>
+          <wp:inline xmlns:a="http://schemas.openxmlformats.org/drawingml/2006/main" xmlns:pic="http://schemas.openxmlformats.org/drawingml/2006/picture">
+            <wp:extent cx="2299447" cy="1828800"/>
+            <wp:docPr id="48" name="Picture 48"/>
+            <wp:cNvGraphicFramePr>
+              <a:graphicFrameLocks noChangeAspect="1"/>
+            </wp:cNvGraphicFramePr>
+            <a:graphic>
+              <a:graphicData uri="http://schemas.openxmlformats.org/drawingml/2006/picture">
+                <pic:pic>
+                  <pic:nvPicPr>
+                    <pic:cNvPr id="0" name="C48.jpg"/>
+                    <pic:cNvPicPr/>
+                  </pic:nvPicPr>
+                  <pic:blipFill>
+                    <a:blip r:embed="rId56"/>
+                    <a:stretch>
+                      <a:fillRect/>
+                    </a:stretch>
+                  </pic:blipFill>
+                  <pic:spPr>
+                    <a:xfrm>
+                      <a:off x="0" y="0"/>
+                      <a:ext cx="2299447" cy="1828800"/>
+                    </a:xfrm>
+                    <a:prstGeom prst="rect"/>
+                  </pic:spPr>
+                </pic:pic>
+              </a:graphicData>
+            </a:graphic>
+          </wp:inline>
+        </w:drawing>
+      </w:r>
+    </w:p>
+    <w:p>
+      <w:r>
+        <w:t>Good for: shocked, yelling, dramatic reaction</w:t>
+        <w:br/>
+        <w:t>File: cat_pack_4.mp4, 6.30–12.30 s (6.0 s)</w:t>
+        <w:br/>
+        <w:t>Sound: animal sound (~411 Hz)</w:t>
+      </w:r>
+    </w:p>
+    <w:p>
+      <w:pPr>
+        <w:pStyle w:val="Heading2"/>
+      </w:pPr>
+      <w:r>
+        <w:t>49. Clip C49 — Orange tabby sitting, looking up and meowing</w:t>
+      </w:r>
+    </w:p>
+    <w:p>
+      <w:r>
+        <w:drawing>
+          <wp:inline xmlns:a="http://schemas.openxmlformats.org/drawingml/2006/main" xmlns:pic="http://schemas.openxmlformats.org/drawingml/2006/picture">
+            <wp:extent cx="1012958" cy="1828800"/>
+            <wp:docPr id="49" name="Picture 49"/>
+            <wp:cNvGraphicFramePr>
+              <a:graphicFrameLocks noChangeAspect="1"/>
+            </wp:cNvGraphicFramePr>
+            <a:graphic>
+              <a:graphicData uri="http://schemas.openxmlformats.org/drawingml/2006/picture">
+                <pic:pic>
+                  <pic:nvPicPr>
+                    <pic:cNvPr id="0" name="C49.jpg"/>
+                    <pic:cNvPicPr/>
+                  </pic:nvPicPr>
+                  <pic:blipFill>
+                    <a:blip r:embed="rId57"/>
+                    <a:stretch>
+                      <a:fillRect/>
+                    </a:stretch>
+                  </pic:blipFill>
+                  <pic:spPr>
+                    <a:xfrm>
+                      <a:off x="0" y="0"/>
+                      <a:ext cx="1012958" cy="1828800"/>
+                    </a:xfrm>
+                    <a:prstGeom prst="rect"/>
+                  </pic:spPr>
+                </pic:pic>
+              </a:graphicData>
+            </a:graphic>
+          </wp:inline>
+        </w:drawing>
+      </w:r>
+    </w:p>
+    <w:p>
+      <w:r>
+        <w:t>Good for: asking, begging, calling someone</w:t>
+        <w:br/>
+        <w:t>File: cat_pack_4.mp4, 12.30–20.40 s (8.1 s)</w:t>
+        <w:br/>
+        <w:t>Sound: low voice ~320 Hz (human or bark - check)</w:t>
+      </w:r>
+    </w:p>
+    <w:p>
+      <w:pPr>
+        <w:pStyle w:val="Heading2"/>
+      </w:pPr>
+      <w:r>
+        <w:t>50. Clip C50 — Smug grinning cat close-up, sly smile</w:t>
+      </w:r>
+    </w:p>
+    <w:p>
+      <w:r>
+        <w:drawing>
+          <wp:inline xmlns:a="http://schemas.openxmlformats.org/drawingml/2006/main" xmlns:pic="http://schemas.openxmlformats.org/drawingml/2006/picture">
+            <wp:extent cx="1873717" cy="1828800"/>
+            <wp:docPr id="50" name="Picture 50"/>
+            <wp:cNvGraphicFramePr>
+              <a:graphicFrameLocks noChangeAspect="1"/>
+            </wp:cNvGraphicFramePr>
+            <a:graphic>
+              <a:graphicData uri="http://schemas.openxmlformats.org/drawingml/2006/picture">
+                <pic:pic>
+                  <pic:nvPicPr>
+                    <pic:cNvPr id="0" name="C50.jpg"/>
+                    <pic:cNvPicPr/>
+                  </pic:nvPicPr>
+                  <pic:blipFill>
+                    <a:blip r:embed="rId58"/>
+                    <a:stretch>
+                      <a:fillRect/>
+                    </a:stretch>
+                  </pic:blipFill>
+                  <pic:spPr>
+                    <a:xfrm>
+                      <a:off x="0" y="0"/>
+                      <a:ext cx="1873717" cy="1828800"/>
+                    </a:xfrm>
+                    <a:prstGeom prst="rect"/>
+                  </pic:spPr>
+                </pic:pic>
+              </a:graphicData>
+            </a:graphic>
+          </wp:inline>
+        </w:drawing>
+      </w:r>
+    </w:p>
+    <w:p>
+      <w:r>
+        <w:t>Good for: smug, sneaky, 'hehe', up to something</w:t>
+        <w:br/>
+        <w:t>File: cat_pack_4.mp4, 20.40–30.93 s (10.5 s)</w:t>
+        <w:br/>
+        <w:t>Sound: low voice ~211 Hz (human or bark - check)</w:t>
+      </w:r>
+    </w:p>
+    <w:p>
+      <w:pPr>
+        <w:pStyle w:val="Heading2"/>
+      </w:pPr>
+      <w:r>
+        <w:t>51. Clip C51 — Calico kitten screaming close-up</w:t>
+      </w:r>
+    </w:p>
+    <w:p>
+      <w:r>
+        <w:drawing>
+          <wp:inline xmlns:a="http://schemas.openxmlformats.org/drawingml/2006/main" xmlns:pic="http://schemas.openxmlformats.org/drawingml/2006/picture">
+            <wp:extent cx="1663047" cy="1828800"/>
+            <wp:docPr id="51" name="Picture 51"/>
+            <wp:cNvGraphicFramePr>
+              <a:graphicFrameLocks noChangeAspect="1"/>
+            </wp:cNvGraphicFramePr>
+            <a:graphic>
+              <a:graphicData uri="http://schemas.openxmlformats.org/drawingml/2006/picture">
+                <pic:pic>
+                  <pic:nvPicPr>
+                    <pic:cNvPr id="0" name="C51.jpg"/>
+                    <pic:cNvPicPr/>
+                  </pic:nvPicPr>
+                  <pic:blipFill>
+                    <a:blip r:embed="rId59"/>
+                    <a:stretch>
+                      <a:fillRect/>
+                    </a:stretch>
+                  </pic:blipFill>
+                  <pic:spPr>
+                    <a:xfrm>
+                      <a:off x="0" y="0"/>
+                      <a:ext cx="1663047" cy="1828800"/>
+                    </a:xfrm>
+                    <a:prstGeom prst="rect"/>
+                  </pic:spPr>
+                </pic:pic>
+              </a:graphicData>
+            </a:graphic>
+          </wp:inline>
+        </w:drawing>
+      </w:r>
+    </w:p>
+    <w:p>
+      <w:r>
+        <w:t>Good for: angry, yelling, outraged</w:t>
+        <w:br/>
+        <w:t>File: cat_pack_4.mp4, 30.93–38.67 s (7.7 s)</w:t>
+        <w:br/>
+        <w:t>Sound: animal sound (~640 Hz)</w:t>
+      </w:r>
+    </w:p>
+    <w:p>
+      <w:pPr>
+        <w:pStyle w:val="Heading2"/>
+      </w:pPr>
+      <w:r>
+        <w:t>52. Clip C52 — Small kitten standing, paws together</w:t>
+      </w:r>
+    </w:p>
+    <w:p>
+      <w:r>
+        <w:drawing>
+          <wp:inline xmlns:a="http://schemas.openxmlformats.org/drawingml/2006/main" xmlns:pic="http://schemas.openxmlformats.org/drawingml/2006/picture">
+            <wp:extent cx="1427181" cy="1828800"/>
+            <wp:docPr id="52" name="Picture 52"/>
+            <wp:cNvGraphicFramePr>
+              <a:graphicFrameLocks noChangeAspect="1"/>
+            </wp:cNvGraphicFramePr>
+            <a:graphic>
+              <a:graphicData uri="http://schemas.openxmlformats.org/drawingml/2006/picture">
+                <pic:pic>
+                  <pic:nvPicPr>
+                    <pic:cNvPr id="0" name="C52.jpg"/>
+                    <pic:cNvPicPr/>
+                  </pic:nvPicPr>
+                  <pic:blipFill>
+                    <a:blip r:embed="rId60"/>
+                    <a:stretch>
+                      <a:fillRect/>
+                    </a:stretch>
+                  </pic:blipFill>
+                  <pic:spPr>
+                    <a:xfrm>
+                      <a:off x="0" y="0"/>
+                      <a:ext cx="1427181" cy="1828800"/>
+                    </a:xfrm>
+                    <a:prstGeom prst="rect"/>
+                  </pic:spPr>
+                </pic:pic>
+              </a:graphicData>
+            </a:graphic>
+          </wp:inline>
+        </w:drawing>
+      </w:r>
+    </w:p>
+    <w:p>
+      <w:r>
+        <w:t>Good for: begging, 'please', sorry, praying</w:t>
+        <w:br/>
+        <w:t>File: cat_pack_4.mp4, 38.67–42.73 s (4.1 s)</w:t>
+        <w:br/>
+        <w:t>Sound: animal sound (~800 Hz)</w:t>
+      </w:r>
+    </w:p>
+    <w:p>
+      <w:pPr>
+        <w:pStyle w:val="Heading2"/>
+      </w:pPr>
+      <w:r>
+        <w:t>53. Clip C53 — Orange cat nose close-up, licking / mouth open</w:t>
+      </w:r>
+    </w:p>
+    <w:p>
+      <w:r>
+        <w:drawing>
+          <wp:inline xmlns:a="http://schemas.openxmlformats.org/drawingml/2006/main" xmlns:pic="http://schemas.openxmlformats.org/drawingml/2006/picture">
+            <wp:extent cx="1235242" cy="1828800"/>
+            <wp:docPr id="53" name="Picture 53"/>
+            <wp:cNvGraphicFramePr>
+              <a:graphicFrameLocks noChangeAspect="1"/>
+            </wp:cNvGraphicFramePr>
+            <a:graphic>
+              <a:graphicData uri="http://schemas.openxmlformats.org/drawingml/2006/picture">
+                <pic:pic>
+                  <pic:nvPicPr>
+                    <pic:cNvPr id="0" name="C53.jpg"/>
+                    <pic:cNvPicPr/>
+                  </pic:nvPicPr>
+                  <pic:blipFill>
+                    <a:blip r:embed="rId61"/>
+                    <a:stretch>
+                      <a:fillRect/>
+                    </a:stretch>
+                  </pic:blipFill>
+                  <pic:spPr>
+                    <a:xfrm>
+                      <a:off x="0" y="0"/>
+                      <a:ext cx="1235242" cy="1828800"/>
+                    </a:xfrm>
+                    <a:prstGeom prst="rect"/>
+                  </pic:spPr>
+                </pic:pic>
+              </a:graphicData>
+            </a:graphic>
+          </wp:inline>
+        </w:drawing>
+      </w:r>
+    </w:p>
+    <w:p>
+      <w:r>
+        <w:t>Good for: silly, chaos, in your face</w:t>
+        <w:br/>
+        <w:t>File: cat_pack_4.mp4, 42.73–46.50 s (3.8 s)</w:t>
+        <w:br/>
+        <w:t>Sound: animal sound (~1231 Hz)</w:t>
+      </w:r>
+    </w:p>
+    <w:p>
+      <w:pPr>
+        <w:pStyle w:val="Heading2"/>
+      </w:pPr>
+      <w:r>
+        <w:t>54. Clip C54 — Orange cat close-up, squinting and meowing at camera</w:t>
+      </w:r>
+    </w:p>
+    <w:p>
+      <w:r>
+        <w:drawing>
+          <wp:inline xmlns:a="http://schemas.openxmlformats.org/drawingml/2006/main" xmlns:pic="http://schemas.openxmlformats.org/drawingml/2006/picture">
+            <wp:extent cx="1402080" cy="1828800"/>
+            <wp:docPr id="54" name="Picture 54"/>
+            <wp:cNvGraphicFramePr>
+              <a:graphicFrameLocks noChangeAspect="1"/>
+            </wp:cNvGraphicFramePr>
+            <a:graphic>
+              <a:graphicData uri="http://schemas.openxmlformats.org/drawingml/2006/picture">
+                <pic:pic>
+                  <pic:nvPicPr>
+                    <pic:cNvPr id="0" name="C54.jpg"/>
+                    <pic:cNvPicPr/>
+                  </pic:nvPicPr>
+                  <pic:blipFill>
+                    <a:blip r:embed="rId62"/>
+                    <a:stretch>
+                      <a:fillRect/>
+                    </a:stretch>
+                  </pic:blipFill>
+                  <pic:spPr>
+                    <a:xfrm>
+                      <a:off x="0" y="0"/>
+                      <a:ext cx="1402080" cy="1828800"/>
+                    </a:xfrm>
+                    <a:prstGeom prst="rect"/>
+                  </pic:spPr>
+                </pic:pic>
+              </a:graphicData>
+            </a:graphic>
+          </wp:inline>
+        </w:drawing>
+      </w:r>
+    </w:p>
+    <w:p>
+      <w:r>
+        <w:t>Good for: complaining, annoyed, sassy</w:t>
+        <w:br/>
+        <w:t>File: cat_pack_4.mp4, 46.50–50.70 s (4.2 s)</w:t>
+        <w:br/>
+        <w:t>Sound: low voice ~340 Hz (human or bark - check)</w:t>
+      </w:r>
+    </w:p>
+    <w:p>
+      <w:pPr>
         <w:pStyle w:val="Heading1"/>
       </w:pPr>
       <w:r>
@@ -2482,7 +2906,7 @@
         <w:drawing>
           <wp:inline xmlns:a="http://schemas.openxmlformats.org/drawingml/2006/main" xmlns:pic="http://schemas.openxmlformats.org/drawingml/2006/picture">
             <wp:extent cx="925830" cy="1828800"/>
-            <wp:docPr id="47" name="Picture 47"/>
+            <wp:docPr id="55" name="Picture 55"/>
             <wp:cNvGraphicFramePr>
               <a:graphicFrameLocks noChangeAspect="1"/>
             </wp:cNvGraphicFramePr>
@@ -2494,7 +2918,7 @@
                     <pic:cNvPicPr/>
                   </pic:nvPicPr>
                   <pic:blipFill>
-                    <a:blip r:embed="rId55"/>
+                    <a:blip r:embed="rId63"/>
                     <a:stretch>
                       <a:fillRect/>
                     </a:stretch>
@@ -2535,7 +2959,7 @@
         <w:drawing>
           <wp:inline xmlns:a="http://schemas.openxmlformats.org/drawingml/2006/main" xmlns:pic="http://schemas.openxmlformats.org/drawingml/2006/picture">
             <wp:extent cx="1234830" cy="1828800"/>
-            <wp:docPr id="48" name="Picture 48"/>
+            <wp:docPr id="56" name="Picture 56"/>
             <wp:cNvGraphicFramePr>
               <a:graphicFrameLocks noChangeAspect="1"/>
             </wp:cNvGraphicFramePr>
@@ -2547,7 +2971,7 @@
                     <pic:cNvPicPr/>
                   </pic:nvPicPr>
                   <pic:blipFill>
-                    <a:blip r:embed="rId56"/>
+                    <a:blip r:embed="rId64"/>
                     <a:stretch>
                       <a:fillRect/>
                     </a:stretch>
@@ -2588,7 +3012,7 @@
         <w:drawing>
           <wp:inline xmlns:a="http://schemas.openxmlformats.org/drawingml/2006/main" xmlns:pic="http://schemas.openxmlformats.org/drawingml/2006/picture">
             <wp:extent cx="1369834" cy="1828800"/>
-            <wp:docPr id="49" name="Picture 49"/>
+            <wp:docPr id="57" name="Picture 57"/>
             <wp:cNvGraphicFramePr>
               <a:graphicFrameLocks noChangeAspect="1"/>
             </wp:cNvGraphicFramePr>
@@ -2600,7 +3024,7 @@
                     <pic:cNvPicPr/>
                   </pic:nvPicPr>
                   <pic:blipFill>
-                    <a:blip r:embed="rId57"/>
+                    <a:blip r:embed="rId65"/>
                     <a:stretch>
                       <a:fillRect/>
                     </a:stretch>
@@ -2641,7 +3065,7 @@
         <w:drawing>
           <wp:inline xmlns:a="http://schemas.openxmlformats.org/drawingml/2006/main" xmlns:pic="http://schemas.openxmlformats.org/drawingml/2006/picture">
             <wp:extent cx="2377440" cy="1320800"/>
-            <wp:docPr id="50" name="Picture 50"/>
+            <wp:docPr id="58" name="Picture 58"/>
             <wp:cNvGraphicFramePr>
               <a:graphicFrameLocks noChangeAspect="1"/>
             </wp:cNvGraphicFramePr>
@@ -2653,7 +3077,7 @@
                     <pic:cNvPicPr/>
                   </pic:nvPicPr>
                   <pic:blipFill>
-                    <a:blip r:embed="rId58"/>
+                    <a:blip r:embed="rId66"/>
                     <a:stretch>
                       <a:fillRect/>
                     </a:stretch>
@@ -2694,7 +3118,7 @@
         <w:drawing>
           <wp:inline xmlns:a="http://schemas.openxmlformats.org/drawingml/2006/main" xmlns:pic="http://schemas.openxmlformats.org/drawingml/2006/picture">
             <wp:extent cx="2377440" cy="1804223"/>
-            <wp:docPr id="51" name="Picture 51"/>
+            <wp:docPr id="59" name="Picture 59"/>
             <wp:cNvGraphicFramePr>
               <a:graphicFrameLocks noChangeAspect="1"/>
             </wp:cNvGraphicFramePr>
@@ -2706,7 +3130,7 @@
                     <pic:cNvPicPr/>
                   </pic:nvPicPr>
                   <pic:blipFill>
-                    <a:blip r:embed="rId59"/>
+                    <a:blip r:embed="rId67"/>
                     <a:stretch>
                       <a:fillRect/>
                     </a:stretch>
@@ -2747,7 +3171,7 @@
         <w:drawing>
           <wp:inline xmlns:a="http://schemas.openxmlformats.org/drawingml/2006/main" xmlns:pic="http://schemas.openxmlformats.org/drawingml/2006/picture">
             <wp:extent cx="1228506" cy="1828800"/>
-            <wp:docPr id="52" name="Picture 52"/>
+            <wp:docPr id="60" name="Picture 60"/>
             <wp:cNvGraphicFramePr>
               <a:graphicFrameLocks noChangeAspect="1"/>
             </wp:cNvGraphicFramePr>
@@ -2759,7 +3183,7 @@
                     <pic:cNvPicPr/>
                   </pic:nvPicPr>
                   <pic:blipFill>
-                    <a:blip r:embed="rId60"/>
+                    <a:blip r:embed="rId68"/>
                     <a:stretch>
                       <a:fillRect/>
                     </a:stretch>
@@ -2800,7 +3224,7 @@
         <w:drawing>
           <wp:inline xmlns:a="http://schemas.openxmlformats.org/drawingml/2006/main" xmlns:pic="http://schemas.openxmlformats.org/drawingml/2006/picture">
             <wp:extent cx="1267968" cy="1828800"/>
-            <wp:docPr id="53" name="Picture 53"/>
+            <wp:docPr id="61" name="Picture 61"/>
             <wp:cNvGraphicFramePr>
               <a:graphicFrameLocks noChangeAspect="1"/>
             </wp:cNvGraphicFramePr>
@@ -2812,7 +3236,7 @@
                     <pic:cNvPicPr/>
                   </pic:nvPicPr>
                   <pic:blipFill>
-                    <a:blip r:embed="rId61"/>
+                    <a:blip r:embed="rId69"/>
                     <a:stretch>
                       <a:fillRect/>
                     </a:stretch>
@@ -2853,7 +3277,7 @@
         <w:drawing>
           <wp:inline xmlns:a="http://schemas.openxmlformats.org/drawingml/2006/main" xmlns:pic="http://schemas.openxmlformats.org/drawingml/2006/picture">
             <wp:extent cx="1455174" cy="1828800"/>
-            <wp:docPr id="54" name="Picture 54"/>
+            <wp:docPr id="62" name="Picture 62"/>
             <wp:cNvGraphicFramePr>
               <a:graphicFrameLocks noChangeAspect="1"/>
             </wp:cNvGraphicFramePr>
@@ -2865,7 +3289,7 @@
                     <pic:cNvPicPr/>
                   </pic:nvPicPr>
                   <pic:blipFill>
-                    <a:blip r:embed="rId62"/>
+                    <a:blip r:embed="rId70"/>
                     <a:stretch>
                       <a:fillRect/>
                     </a:stretch>
@@ -2906,7 +3330,7 @@
         <w:drawing>
           <wp:inline xmlns:a="http://schemas.openxmlformats.org/drawingml/2006/main" xmlns:pic="http://schemas.openxmlformats.org/drawingml/2006/picture">
             <wp:extent cx="897894" cy="1828800"/>
-            <wp:docPr id="55" name="Picture 55"/>
+            <wp:docPr id="63" name="Picture 63"/>
             <wp:cNvGraphicFramePr>
               <a:graphicFrameLocks noChangeAspect="1"/>
             </wp:cNvGraphicFramePr>
@@ -2918,7 +3342,7 @@
                     <pic:cNvPicPr/>
                   </pic:nvPicPr>
                   <pic:blipFill>
-                    <a:blip r:embed="rId63"/>
+                    <a:blip r:embed="rId71"/>
                     <a:stretch>
                       <a:fillRect/>
                     </a:stretch>
@@ -2959,7 +3383,7 @@
         <w:drawing>
           <wp:inline xmlns:a="http://schemas.openxmlformats.org/drawingml/2006/main" xmlns:pic="http://schemas.openxmlformats.org/drawingml/2006/picture">
             <wp:extent cx="1066261" cy="1828800"/>
-            <wp:docPr id="56" name="Picture 56"/>
+            <wp:docPr id="64" name="Picture 64"/>
             <wp:cNvGraphicFramePr>
               <a:graphicFrameLocks noChangeAspect="1"/>
             </wp:cNvGraphicFramePr>
@@ -2971,7 +3395,7 @@
                     <pic:cNvPicPr/>
                   </pic:nvPicPr>
                   <pic:blipFill>
-                    <a:blip r:embed="rId64"/>
+                    <a:blip r:embed="rId72"/>
                     <a:stretch>
                       <a:fillRect/>
                     </a:stretch>
@@ -3012,7 +3436,7 @@
         <w:drawing>
           <wp:inline xmlns:a="http://schemas.openxmlformats.org/drawingml/2006/main" xmlns:pic="http://schemas.openxmlformats.org/drawingml/2006/picture">
             <wp:extent cx="1318437" cy="1828800"/>
-            <wp:docPr id="57" name="Picture 57"/>
+            <wp:docPr id="65" name="Picture 65"/>
             <wp:cNvGraphicFramePr>
               <a:graphicFrameLocks noChangeAspect="1"/>
             </wp:cNvGraphicFramePr>
@@ -3024,7 +3448,7 @@
                     <pic:cNvPicPr/>
                   </pic:nvPicPr>
                   <pic:blipFill>
-                    <a:blip r:embed="rId65"/>
+                    <a:blip r:embed="rId73"/>
                     <a:stretch>
                       <a:fillRect/>
                     </a:stretch>
@@ -3065,7 +3489,7 @@
         <w:drawing>
           <wp:inline xmlns:a="http://schemas.openxmlformats.org/drawingml/2006/main" xmlns:pic="http://schemas.openxmlformats.org/drawingml/2006/picture">
             <wp:extent cx="1081548" cy="1828800"/>
-            <wp:docPr id="58" name="Picture 58"/>
+            <wp:docPr id="66" name="Picture 66"/>
             <wp:cNvGraphicFramePr>
               <a:graphicFrameLocks noChangeAspect="1"/>
             </wp:cNvGraphicFramePr>
@@ -3077,7 +3501,7 @@
                     <pic:cNvPicPr/>
                   </pic:nvPicPr>
                   <pic:blipFill>
-                    <a:blip r:embed="rId66"/>
+                    <a:blip r:embed="rId74"/>
                     <a:stretch>
                       <a:fillRect/>
                     </a:stretch>
@@ -3118,7 +3542,7 @@
         <w:drawing>
           <wp:inline xmlns:a="http://schemas.openxmlformats.org/drawingml/2006/main" xmlns:pic="http://schemas.openxmlformats.org/drawingml/2006/picture">
             <wp:extent cx="1121103" cy="1828800"/>
-            <wp:docPr id="59" name="Picture 59"/>
+            <wp:docPr id="67" name="Picture 67"/>
             <wp:cNvGraphicFramePr>
               <a:graphicFrameLocks noChangeAspect="1"/>
             </wp:cNvGraphicFramePr>
@@ -3130,7 +3554,7 @@
                     <pic:cNvPicPr/>
                   </pic:nvPicPr>
                   <pic:blipFill>
-                    <a:blip r:embed="rId67"/>
+                    <a:blip r:embed="rId75"/>
                     <a:stretch>
                       <a:fillRect/>
                     </a:stretch>
@@ -3171,7 +3595,7 @@
         <w:drawing>
           <wp:inline xmlns:a="http://schemas.openxmlformats.org/drawingml/2006/main" xmlns:pic="http://schemas.openxmlformats.org/drawingml/2006/picture">
             <wp:extent cx="888459" cy="1828800"/>
-            <wp:docPr id="60" name="Picture 60"/>
+            <wp:docPr id="68" name="Picture 68"/>
             <wp:cNvGraphicFramePr>
               <a:graphicFrameLocks noChangeAspect="1"/>
             </wp:cNvGraphicFramePr>
@@ -3183,7 +3607,7 @@
                     <pic:cNvPicPr/>
                   </pic:nvPicPr>
                   <pic:blipFill>
-                    <a:blip r:embed="rId68"/>
+                    <a:blip r:embed="rId76"/>
                     <a:stretch>
                       <a:fillRect/>
                     </a:stretch>
@@ -3224,7 +3648,7 @@
         <w:drawing>
           <wp:inline xmlns:a="http://schemas.openxmlformats.org/drawingml/2006/main" xmlns:pic="http://schemas.openxmlformats.org/drawingml/2006/picture">
             <wp:extent cx="1342047" cy="1828800"/>
-            <wp:docPr id="61" name="Picture 61"/>
+            <wp:docPr id="69" name="Picture 69"/>
             <wp:cNvGraphicFramePr>
               <a:graphicFrameLocks noChangeAspect="1"/>
             </wp:cNvGraphicFramePr>
@@ -3236,7 +3660,7 @@
                     <pic:cNvPicPr/>
                   </pic:nvPicPr>
                   <pic:blipFill>
-                    <a:blip r:embed="rId69"/>
+                    <a:blip r:embed="rId77"/>
                     <a:stretch>
                       <a:fillRect/>
                     </a:stretch>
@@ -3277,7 +3701,7 @@
         <w:drawing>
           <wp:inline xmlns:a="http://schemas.openxmlformats.org/drawingml/2006/main" xmlns:pic="http://schemas.openxmlformats.org/drawingml/2006/picture">
             <wp:extent cx="1599464" cy="1828800"/>
-            <wp:docPr id="62" name="Picture 62"/>
+            <wp:docPr id="70" name="Picture 70"/>
             <wp:cNvGraphicFramePr>
               <a:graphicFrameLocks noChangeAspect="1"/>
             </wp:cNvGraphicFramePr>
@@ -3289,7 +3713,7 @@
                     <pic:cNvPicPr/>
                   </pic:nvPicPr>
                   <pic:blipFill>
-                    <a:blip r:embed="rId70"/>
+                    <a:blip r:embed="rId78"/>
                     <a:stretch>
                       <a:fillRect/>
                     </a:stretch>
@@ -3330,7 +3754,7 @@
         <w:drawing>
           <wp:inline xmlns:a="http://schemas.openxmlformats.org/drawingml/2006/main" xmlns:pic="http://schemas.openxmlformats.org/drawingml/2006/picture">
             <wp:extent cx="1731761" cy="1828800"/>
-            <wp:docPr id="63" name="Picture 63"/>
+            <wp:docPr id="71" name="Picture 71"/>
             <wp:cNvGraphicFramePr>
               <a:graphicFrameLocks noChangeAspect="1"/>
             </wp:cNvGraphicFramePr>
@@ -3342,7 +3766,7 @@
                     <pic:cNvPicPr/>
                   </pic:nvPicPr>
                   <pic:blipFill>
-                    <a:blip r:embed="rId71"/>
+                    <a:blip r:embed="rId79"/>
                     <a:stretch>
                       <a:fillRect/>
                     </a:stretch>
@@ -3383,7 +3807,7 @@
         <w:drawing>
           <wp:inline xmlns:a="http://schemas.openxmlformats.org/drawingml/2006/main" xmlns:pic="http://schemas.openxmlformats.org/drawingml/2006/picture">
             <wp:extent cx="1748236" cy="1828800"/>
-            <wp:docPr id="64" name="Picture 64"/>
+            <wp:docPr id="72" name="Picture 72"/>
             <wp:cNvGraphicFramePr>
               <a:graphicFrameLocks noChangeAspect="1"/>
             </wp:cNvGraphicFramePr>
@@ -3395,7 +3819,7 @@
                     <pic:cNvPicPr/>
                   </pic:nvPicPr>
                   <pic:blipFill>
-                    <a:blip r:embed="rId72"/>
+                    <a:blip r:embed="rId80"/>
                     <a:stretch>
                       <a:fillRect/>
                     </a:stretch>
@@ -3436,7 +3860,7 @@
         <w:drawing>
           <wp:inline xmlns:a="http://schemas.openxmlformats.org/drawingml/2006/main" xmlns:pic="http://schemas.openxmlformats.org/drawingml/2006/picture">
             <wp:extent cx="849085" cy="1828800"/>
-            <wp:docPr id="65" name="Picture 65"/>
+            <wp:docPr id="73" name="Picture 73"/>
             <wp:cNvGraphicFramePr>
               <a:graphicFrameLocks noChangeAspect="1"/>
             </wp:cNvGraphicFramePr>
@@ -3448,7 +3872,7 @@
                     <pic:cNvPicPr/>
                   </pic:nvPicPr>
                   <pic:blipFill>
-                    <a:blip r:embed="rId73"/>
+                    <a:blip r:embed="rId81"/>
                     <a:stretch>
                       <a:fillRect/>
                     </a:stretch>
@@ -3489,7 +3913,7 @@
         <w:drawing>
           <wp:inline xmlns:a="http://schemas.openxmlformats.org/drawingml/2006/main" xmlns:pic="http://schemas.openxmlformats.org/drawingml/2006/picture">
             <wp:extent cx="897529" cy="1828800"/>
-            <wp:docPr id="66" name="Picture 66"/>
+            <wp:docPr id="74" name="Picture 74"/>
             <wp:cNvGraphicFramePr>
               <a:graphicFrameLocks noChangeAspect="1"/>
             </wp:cNvGraphicFramePr>
@@ -3501,7 +3925,7 @@
                     <pic:cNvPicPr/>
                   </pic:nvPicPr>
                   <pic:blipFill>
-                    <a:blip r:embed="rId74"/>
+                    <a:blip r:embed="rId82"/>
                     <a:stretch>
                       <a:fillRect/>
                     </a:stretch>
@@ -3542,7 +3966,7 @@
         <w:drawing>
           <wp:inline xmlns:a="http://schemas.openxmlformats.org/drawingml/2006/main" xmlns:pic="http://schemas.openxmlformats.org/drawingml/2006/picture">
             <wp:extent cx="1160944" cy="1828800"/>
-            <wp:docPr id="67" name="Picture 67"/>
+            <wp:docPr id="75" name="Picture 75"/>
             <wp:cNvGraphicFramePr>
               <a:graphicFrameLocks noChangeAspect="1"/>
             </wp:cNvGraphicFramePr>
@@ -3554,7 +3978,7 @@
                     <pic:cNvPicPr/>
                   </pic:nvPicPr>
                   <pic:blipFill>
-                    <a:blip r:embed="rId75"/>
+                    <a:blip r:embed="rId83"/>
                     <a:stretch>
                       <a:fillRect/>
                     </a:stretch>
@@ -3595,7 +4019,7 @@
         <w:drawing>
           <wp:inline xmlns:a="http://schemas.openxmlformats.org/drawingml/2006/main" xmlns:pic="http://schemas.openxmlformats.org/drawingml/2006/picture">
             <wp:extent cx="1180289" cy="1828800"/>
-            <wp:docPr id="68" name="Picture 68"/>
+            <wp:docPr id="76" name="Picture 76"/>
             <wp:cNvGraphicFramePr>
               <a:graphicFrameLocks noChangeAspect="1"/>
             </wp:cNvGraphicFramePr>
@@ -3607,7 +4031,7 @@
                     <pic:cNvPicPr/>
                   </pic:nvPicPr>
                   <pic:blipFill>
-                    <a:blip r:embed="rId76"/>
+                    <a:blip r:embed="rId84"/>
                     <a:stretch>
                       <a:fillRect/>
                     </a:stretch>
@@ -3648,7 +4072,7 @@
         <w:drawing>
           <wp:inline xmlns:a="http://schemas.openxmlformats.org/drawingml/2006/main" xmlns:pic="http://schemas.openxmlformats.org/drawingml/2006/picture">
             <wp:extent cx="910024" cy="1828800"/>
-            <wp:docPr id="69" name="Picture 69"/>
+            <wp:docPr id="77" name="Picture 77"/>
             <wp:cNvGraphicFramePr>
               <a:graphicFrameLocks noChangeAspect="1"/>
             </wp:cNvGraphicFramePr>
@@ -3660,7 +4084,7 @@
                     <pic:cNvPicPr/>
                   </pic:nvPicPr>
                   <pic:blipFill>
-                    <a:blip r:embed="rId77"/>
+                    <a:blip r:embed="rId85"/>
                     <a:stretch>
                       <a:fillRect/>
                     </a:stretch>
@@ -3701,7 +4125,7 @@
         <w:drawing>
           <wp:inline xmlns:a="http://schemas.openxmlformats.org/drawingml/2006/main" xmlns:pic="http://schemas.openxmlformats.org/drawingml/2006/picture">
             <wp:extent cx="1104181" cy="1828800"/>
-            <wp:docPr id="70" name="Picture 70"/>
+            <wp:docPr id="78" name="Picture 78"/>
             <wp:cNvGraphicFramePr>
               <a:graphicFrameLocks noChangeAspect="1"/>
             </wp:cNvGraphicFramePr>
@@ -3713,7 +4137,7 @@
                     <pic:cNvPicPr/>
                   </pic:nvPicPr>
                   <pic:blipFill>
-                    <a:blip r:embed="rId78"/>
+                    <a:blip r:embed="rId86"/>
                     <a:stretch>
                       <a:fillRect/>
                     </a:stretch>
@@ -3754,7 +4178,7 @@
         <w:drawing>
           <wp:inline xmlns:a="http://schemas.openxmlformats.org/drawingml/2006/main" xmlns:pic="http://schemas.openxmlformats.org/drawingml/2006/picture">
             <wp:extent cx="1330036" cy="1828800"/>
-            <wp:docPr id="71" name="Picture 71"/>
+            <wp:docPr id="79" name="Picture 79"/>
             <wp:cNvGraphicFramePr>
               <a:graphicFrameLocks noChangeAspect="1"/>
             </wp:cNvGraphicFramePr>
@@ -3766,7 +4190,7 @@
                     <pic:cNvPicPr/>
                   </pic:nvPicPr>
                   <pic:blipFill>
-                    <a:blip r:embed="rId79"/>
+                    <a:blip r:embed="rId87"/>
                     <a:stretch>
                       <a:fillRect/>
                     </a:stretch>
@@ -3807,7 +4231,7 @@
         <w:drawing>
           <wp:inline xmlns:a="http://schemas.openxmlformats.org/drawingml/2006/main" xmlns:pic="http://schemas.openxmlformats.org/drawingml/2006/picture">
             <wp:extent cx="1445558" cy="1828800"/>
-            <wp:docPr id="72" name="Picture 72"/>
+            <wp:docPr id="80" name="Picture 80"/>
             <wp:cNvGraphicFramePr>
               <a:graphicFrameLocks noChangeAspect="1"/>
             </wp:cNvGraphicFramePr>
@@ -3819,7 +4243,7 @@
                     <pic:cNvPicPr/>
                   </pic:nvPicPr>
                   <pic:blipFill>
-                    <a:blip r:embed="rId80"/>
+                    <a:blip r:embed="rId88"/>
                     <a:stretch>
                       <a:fillRect/>
                     </a:stretch>
@@ -3860,7 +4284,7 @@
         <w:drawing>
           <wp:inline xmlns:a="http://schemas.openxmlformats.org/drawingml/2006/main" xmlns:pic="http://schemas.openxmlformats.org/drawingml/2006/picture">
             <wp:extent cx="1509571" cy="1828800"/>
-            <wp:docPr id="73" name="Picture 73"/>
+            <wp:docPr id="81" name="Picture 81"/>
             <wp:cNvGraphicFramePr>
               <a:graphicFrameLocks noChangeAspect="1"/>
             </wp:cNvGraphicFramePr>
@@ -3872,7 +4296,7 @@
                     <pic:cNvPicPr/>
                   </pic:nvPicPr>
                   <pic:blipFill>
-                    <a:blip r:embed="rId81"/>
+                    <a:blip r:embed="rId89"/>
                     <a:stretch>
                       <a:fillRect/>
                     </a:stretch>
@@ -3913,7 +4337,7 @@
         <w:drawing>
           <wp:inline xmlns:a="http://schemas.openxmlformats.org/drawingml/2006/main" xmlns:pic="http://schemas.openxmlformats.org/drawingml/2006/picture">
             <wp:extent cx="2161902" cy="1828800"/>
-            <wp:docPr id="74" name="Picture 74"/>
+            <wp:docPr id="82" name="Picture 82"/>
             <wp:cNvGraphicFramePr>
               <a:graphicFrameLocks noChangeAspect="1"/>
             </wp:cNvGraphicFramePr>
@@ -3925,7 +4349,7 @@
                     <pic:cNvPicPr/>
                   </pic:nvPicPr>
                   <pic:blipFill>
-                    <a:blip r:embed="rId82"/>
+                    <a:blip r:embed="rId90"/>
                     <a:stretch>
                       <a:fillRect/>
                     </a:stretch>
@@ -3966,7 +4390,7 @@
         <w:drawing>
           <wp:inline xmlns:a="http://schemas.openxmlformats.org/drawingml/2006/main" xmlns:pic="http://schemas.openxmlformats.org/drawingml/2006/picture">
             <wp:extent cx="1241882" cy="1828800"/>
-            <wp:docPr id="75" name="Picture 75"/>
+            <wp:docPr id="83" name="Picture 83"/>
             <wp:cNvGraphicFramePr>
               <a:graphicFrameLocks noChangeAspect="1"/>
             </wp:cNvGraphicFramePr>
@@ -3978,7 +4402,7 @@
                     <pic:cNvPicPr/>
                   </pic:nvPicPr>
                   <pic:blipFill>
-                    <a:blip r:embed="rId83"/>
+                    <a:blip r:embed="rId91"/>
                     <a:stretch>
                       <a:fillRect/>
                     </a:stretch>

</xml_diff>